<commit_message>
Publish revised Chapters 20 and 21
</commit_message>
<xml_diff>
--- a/public/chapter-20/Chapitre_20_Organes_genitaux_masculins_version_complete_zones_reflexes_revisees.docx
+++ b/public/chapter-20/Chapitre_20_Organes_genitaux_masculins_version_complete_zones_reflexes_revisees.docx
@@ -1,6 +1,6 @@
 
 <file path=word/document.xml><?xml version="1.0" encoding="utf-8"?>
-<w:document xmlns:ve="http://schemas.openxmlformats.org/markup-compatibility/2006" xmlns:o="urn:schemas-microsoft-com:office:office" xmlns:r="http://schemas.openxmlformats.org/officeDocument/2006/relationships" xmlns:m="http://schemas.openxmlformats.org/officeDocument/2006/math" xmlns:v="urn:schemas-microsoft-com:vml" xmlns:wp="http://schemas.openxmlformats.org/drawingml/2006/wordprocessingDrawing" xmlns:w10="urn:schemas-microsoft-com:office:word" xmlns:w="http://schemas.openxmlformats.org/wordprocessingml/2006/main" xmlns:wne="http://schemas.microsoft.com/office/word/2006/wordml">
+<w:document xmlns:wpc="http://schemas.microsoft.com/office/word/2010/wordprocessingCanvas" xmlns:cx="http://schemas.microsoft.com/office/drawing/2014/chartex" xmlns:cx1="http://schemas.microsoft.com/office/drawing/2015/9/8/chartex" xmlns:cx2="http://schemas.microsoft.com/office/drawing/2015/10/21/chartex" xmlns:cx3="http://schemas.microsoft.com/office/drawing/2016/5/9/chartex" xmlns:cx4="http://schemas.microsoft.com/office/drawing/2016/5/10/chartex" xmlns:cx5="http://schemas.microsoft.com/office/drawing/2016/5/11/chartex" xmlns:cx6="http://schemas.microsoft.com/office/drawing/2016/5/12/chartex" xmlns:cx7="http://schemas.microsoft.com/office/drawing/2016/5/13/chartex" xmlns:cx8="http://schemas.microsoft.com/office/drawing/2016/5/14/chartex" xmlns:mc="http://schemas.openxmlformats.org/markup-compatibility/2006" xmlns:aink="http://schemas.microsoft.com/office/drawing/2016/ink" xmlns:am3d="http://schemas.microsoft.com/office/drawing/2017/model3d" xmlns:o="urn:schemas-microsoft-com:office:office" xmlns:oel="http://schemas.microsoft.com/office/2019/extlst" xmlns:r="http://schemas.openxmlformats.org/officeDocument/2006/relationships" xmlns:m="http://schemas.openxmlformats.org/officeDocument/2006/math" xmlns:v="urn:schemas-microsoft-com:vml" xmlns:wp14="http://schemas.microsoft.com/office/word/2010/wordprocessingDrawing" xmlns:wp="http://schemas.openxmlformats.org/drawingml/2006/wordprocessingDrawing" xmlns:w10="urn:schemas-microsoft-com:office:word" xmlns:w="http://schemas.openxmlformats.org/wordprocessingml/2006/main" xmlns:w14="http://schemas.microsoft.com/office/word/2010/wordml" xmlns:w15="http://schemas.microsoft.com/office/word/2012/wordml" xmlns:w16cex="http://schemas.microsoft.com/office/word/2018/wordml/cex" xmlns:w16cid="http://schemas.microsoft.com/office/word/2016/wordml/cid" xmlns:w16="http://schemas.microsoft.com/office/word/2018/wordml" xmlns:w16du="http://schemas.microsoft.com/office/word/2023/wordml/word16du" xmlns:w16sdtdh="http://schemas.microsoft.com/office/word/2020/wordml/sdtdatahash" xmlns:w16sdtfl="http://schemas.microsoft.com/office/word/2024/wordml/sdtformatlock" xmlns:w16se="http://schemas.microsoft.com/office/word/2015/wordml/symex" xmlns:wpg="http://schemas.microsoft.com/office/word/2010/wordprocessingGroup" xmlns:wpi="http://schemas.microsoft.com/office/word/2010/wordprocessingInk" xmlns:wne="http://schemas.microsoft.com/office/word/2006/wordml" xmlns:wps="http://schemas.microsoft.com/office/word/2010/wordprocessingShape" mc:Ignorable="w14 w15 w16se w16cid w16 w16cex w16sdtdh w16sdtfl w16du wp14">
   <w:body>
     <w:p>
       <w:pPr>
@@ -11,11 +11,10 @@
           <w:szCs w:val="24"/>
         </w:rPr>
       </w:pPr>
-      <w:r/>
-    </w:p>
-    <w:p>
-      <w:pPr>
-        <w:pStyle w:val="Titre"/>
+    </w:p>
+    <w:p>
+      <w:pPr>
+        <w:pStyle w:val="Title"/>
         <w:jc w:val="center"/>
       </w:pPr>
       <w:r>
@@ -24,7 +23,7 @@
     </w:p>
     <w:p>
       <w:pPr>
-        <w:pStyle w:val="Titre"/>
+        <w:pStyle w:val="Title"/>
         <w:jc w:val="center"/>
       </w:pPr>
       <w:r>
@@ -33,8 +32,7 @@
     </w:p>
     <w:p>
       <w:pPr>
-        <w:pStyle w:val="Titre1"/>
-        <w:keepNext/>
+        <w:pStyle w:val="Heading1"/>
         <w:spacing w:before="160" w:after="80"/>
         <w:rPr>
           <w:color w:val="auto"/>
@@ -46,7 +44,7 @@
     </w:p>
     <w:p>
       <w:pPr>
-        <w:pStyle w:val="Paragraphedeliste"/>
+        <w:pStyle w:val="ListParagraph"/>
         <w:jc w:val="both"/>
         <w:rPr>
           <w:rFonts w:ascii="Times New Roman" w:hAnsi="Times New Roman" w:cs="Times New Roman"/>
@@ -60,7 +58,7 @@
     </w:p>
     <w:p>
       <w:pPr>
-        <w:pStyle w:val="Paragraphedeliste"/>
+        <w:pStyle w:val="ListParagraph"/>
         <w:jc w:val="both"/>
         <w:rPr>
           <w:rFonts w:ascii="Times New Roman" w:hAnsi="Times New Roman" w:cs="Times New Roman"/>
@@ -74,7 +72,7 @@
     </w:p>
     <w:p>
       <w:pPr>
-        <w:pStyle w:val="Paragraphedeliste"/>
+        <w:pStyle w:val="ListParagraph"/>
         <w:jc w:val="both"/>
         <w:rPr>
           <w:rFonts w:ascii="Times New Roman" w:hAnsi="Times New Roman" w:cs="Times New Roman"/>
@@ -88,7 +86,7 @@
     </w:p>
     <w:p>
       <w:pPr>
-        <w:pStyle w:val="Paragraphedeliste"/>
+        <w:pStyle w:val="ListParagraph"/>
         <w:jc w:val="both"/>
         <w:rPr>
           <w:rFonts w:ascii="Times New Roman" w:hAnsi="Times New Roman" w:cs="Times New Roman"/>
@@ -102,7 +100,7 @@
     </w:p>
     <w:p>
       <w:pPr>
-        <w:pStyle w:val="Paragraphedeliste"/>
+        <w:pStyle w:val="ListParagraph"/>
         <w:jc w:val="both"/>
         <w:rPr>
           <w:rFonts w:ascii="Times New Roman" w:hAnsi="Times New Roman" w:cs="Times New Roman"/>
@@ -110,11 +108,10 @@
           <w:szCs w:val="24"/>
         </w:rPr>
       </w:pPr>
-      <w:r/>
-    </w:p>
-    <w:p>
-      <w:pPr>
-        <w:pStyle w:val="Paragraphedeliste"/>
+    </w:p>
+    <w:p>
+      <w:pPr>
+        <w:pStyle w:val="ListParagraph"/>
         <w:numPr>
           <w:ilvl w:val="0"/>
           <w:numId w:val="18"/>
@@ -127,12 +124,28 @@
         </w:rPr>
       </w:pPr>
       <w:r>
-        <w:t xml:space="preserve">Appareil de reproduction de l’homme: il comprend: les testicules, les épididymes, les conduits déférents, les vésicules séminales, les conduits éjaculateurs, la prostate, l’urètre et le pénis. (figure 20.1) </w:t>
-      </w:r>
-    </w:p>
-    <w:p>
-      <w:pPr>
-        <w:pStyle w:val="Paragraphedeliste"/>
+        <w:t xml:space="preserve">Appareil de reproduction de </w:t>
+      </w:r>
+      <w:proofErr w:type="gramStart"/>
+      <w:r>
+        <w:t>l’homme:</w:t>
+      </w:r>
+      <w:proofErr w:type="gramEnd"/>
+      <w:r>
+        <w:t xml:space="preserve"> il </w:t>
+      </w:r>
+      <w:proofErr w:type="gramStart"/>
+      <w:r>
+        <w:t>comprend:</w:t>
+      </w:r>
+      <w:proofErr w:type="gramEnd"/>
+      <w:r>
+        <w:t xml:space="preserve"> les testicules, les épididymes, les conduits déférents, les vésicules séminales, les conduits éjaculateurs, la prostate, l’urètre et le pénis. </w:t>
+      </w:r>
+    </w:p>
+    <w:p>
+      <w:pPr>
+        <w:pStyle w:val="ListParagraph"/>
         <w:ind w:left="1069"/>
         <w:jc w:val="both"/>
         <w:rPr>
@@ -141,12 +154,10 @@
           <w:szCs w:val="24"/>
         </w:rPr>
       </w:pPr>
-      <w:r/>
-    </w:p>
-    <w:p>
-      <w:pPr>
-        <w:pStyle w:val="Titre1"/>
-        <w:keepNext/>
+    </w:p>
+    <w:p>
+      <w:pPr>
+        <w:pStyle w:val="Heading1"/>
         <w:spacing w:before="160" w:after="80"/>
         <w:rPr>
           <w:color w:val="auto"/>
@@ -159,8 +170,7 @@
     </w:p>
     <w:p>
       <w:pPr>
-        <w:pStyle w:val="Titre2"/>
-        <w:keepNext/>
+        <w:pStyle w:val="Heading2"/>
         <w:spacing w:before="160" w:after="80"/>
         <w:jc w:val="both"/>
         <w:rPr>
@@ -175,7 +185,7 @@
     </w:p>
     <w:p>
       <w:pPr>
-        <w:pStyle w:val="Paragraphedeliste"/>
+        <w:pStyle w:val="ListParagraph"/>
         <w:numPr>
           <w:ilvl w:val="0"/>
           <w:numId w:val="17"/>
@@ -193,7 +203,7 @@
     </w:p>
     <w:p>
       <w:pPr>
-        <w:pStyle w:val="Paragraphedeliste"/>
+        <w:pStyle w:val="ListParagraph"/>
         <w:numPr>
           <w:ilvl w:val="0"/>
           <w:numId w:val="17"/>
@@ -206,12 +216,12 @@
         </w:rPr>
       </w:pPr>
       <w:r>
-        <w:t xml:space="preserve"> Chez l’homme, les testicules continuent à migrer dans le canal inguinal  (figure 20.3), en entraînant avec eux artères, veines, lymphatiques, nerfs et le canal déférent. Les testicules atteignent l’orifice profond du canal inguinal autour du 6ème mois, franchissent le canal durant le 7ème mois et atteignent leur position intra-scrotale définitive vers la fin du 8ème mois. Cette migration est réglée par le système hormonal, la croissance du fœtus et l’augmentation de poids des testicules.</w:t>
-      </w:r>
-    </w:p>
-    <w:p>
-      <w:pPr>
-        <w:pStyle w:val="Paragraphedeliste"/>
+        <w:t xml:space="preserve"> Chez l’homme, les testicules continuent à migrer dans le canal inguinal, en entraînant avec eux artères, veines, lymphatiques, nerfs et le canal déférent. Les testicules atteignent l’orifice profond du canal inguinal autour du 6ème mois, franchissent le canal durant le 7ème mois et atteignent leur position intra-scrotale définitive vers la fin du 8ème mois. Cette migration est réglée par le système hormonal, la croissance du fœtus et l’augmentation de poids des testicules.</w:t>
+      </w:r>
+    </w:p>
+    <w:p>
+      <w:pPr>
+        <w:pStyle w:val="ListParagraph"/>
         <w:ind w:left="1211"/>
         <w:jc w:val="both"/>
         <w:rPr>
@@ -226,8 +236,7 @@
     </w:p>
     <w:p>
       <w:pPr>
-        <w:pStyle w:val="Titre2"/>
-        <w:keepNext/>
+        <w:pStyle w:val="Heading2"/>
         <w:spacing w:before="160" w:after="80"/>
         <w:jc w:val="both"/>
         <w:rPr>
@@ -237,6 +246,7 @@
         </w:rPr>
       </w:pPr>
       <w:r>
+        <w:lastRenderedPageBreak/>
         <w:t>2.2. Testicules</w:t>
       </w:r>
     </w:p>
@@ -257,7 +267,7 @@
     </w:p>
     <w:p>
       <w:pPr>
-        <w:pStyle w:val="Paragraphedeliste"/>
+        <w:pStyle w:val="ListParagraph"/>
         <w:ind w:left="927"/>
         <w:jc w:val="both"/>
         <w:rPr>
@@ -272,13 +282,11 @@
     </w:p>
     <w:p>
       <w:pPr>
-        <w:pStyle w:val="Titre2"/>
-        <w:keepNext/>
+        <w:pStyle w:val="Heading2"/>
         <w:spacing w:before="160" w:after="80"/>
         <w:jc w:val="both"/>
         <w:rPr>
           <w:rFonts w:ascii="Times New Roman" w:hAnsi="Times New Roman" w:cs="Times New Roman"/>
-          <w:b/>
           <w:sz w:val="24"/>
           <w:szCs w:val="24"/>
         </w:rPr>
@@ -289,8 +297,7 @@
     </w:p>
     <w:p>
       <w:pPr>
-        <w:pStyle w:val="Titre1"/>
-        <w:keepNext/>
+        <w:pStyle w:val="Heading1"/>
         <w:spacing w:before="160" w:after="80"/>
         <w:rPr>
           <w:color w:val="auto"/>
@@ -302,8 +309,7 @@
     </w:p>
     <w:p>
       <w:pPr>
-        <w:pStyle w:val="Titre2"/>
-        <w:keepNext/>
+        <w:pStyle w:val="Heading2"/>
         <w:spacing w:before="160" w:after="80"/>
         <w:jc w:val="both"/>
         <w:rPr>
@@ -318,7 +324,7 @@
     </w:p>
     <w:p>
       <w:pPr>
-        <w:pStyle w:val="Paragraphedeliste"/>
+        <w:pStyle w:val="ListParagraph"/>
         <w:ind w:left="1353"/>
         <w:jc w:val="both"/>
         <w:rPr>
@@ -328,13 +334,20 @@
         </w:rPr>
       </w:pPr>
       <w:r>
-        <w:t xml:space="preserve"> De forme ovoïde de 5 cm de long chez l’adulte, le testicule est recouvert par une membrane résistante, l’albuginée. Il est entouré par une gaine, le processus vaginal  (figure 20.4). Sa constitution interne  comprend des lobules contenant 400 à 600 canalicules séminifères, lieu de production et de maturation des spermatozoïdes (spermatogenèse). Ces canalicules débouchent, au pôle supérieur du testicule, dans le canal de l’épididyme.</w:t>
-      </w:r>
-    </w:p>
-    <w:p>
-      <w:pPr>
-        <w:pStyle w:val="Titre2"/>
-        <w:keepNext/>
+        <w:t xml:space="preserve"> De forme ovoïde de 5 cm de long chez l’adulte, le testicule est recouvert par une membrane résistante, l’albuginée. Il est entouré par une gaine, le processus </w:t>
+      </w:r>
+      <w:proofErr w:type="gramStart"/>
+      <w:r>
+        <w:t>vaginal  .</w:t>
+      </w:r>
+      <w:proofErr w:type="gramEnd"/>
+      <w:r>
+        <w:t xml:space="preserve"> Sa constitution interne  comprend des lobules contenant 400 à 600 canalicules séminifères, lieu de production et de maturation des spermatozoïdes (spermatogenèse). Ces canalicules débouchent, au pôle supérieur du testicule, dans le canal de l’épididyme.</w:t>
+      </w:r>
+    </w:p>
+    <w:p>
+      <w:pPr>
+        <w:pStyle w:val="Heading2"/>
         <w:spacing w:before="160" w:after="80"/>
         <w:jc w:val="both"/>
         <w:rPr>
@@ -349,8 +362,7 @@
     </w:p>
     <w:p>
       <w:pPr>
-        <w:pStyle w:val="Titre2"/>
-        <w:keepNext/>
+        <w:pStyle w:val="Heading2"/>
         <w:spacing w:before="160" w:after="80"/>
         <w:jc w:val="both"/>
         <w:rPr>
@@ -365,8 +377,7 @@
     </w:p>
     <w:p>
       <w:pPr>
-        <w:pStyle w:val="Titre2"/>
-        <w:keepNext/>
+        <w:pStyle w:val="Heading2"/>
         <w:spacing w:before="160" w:after="80"/>
         <w:jc w:val="both"/>
         <w:rPr>
@@ -381,8 +392,7 @@
     </w:p>
     <w:p>
       <w:pPr>
-        <w:pStyle w:val="Titre3"/>
-        <w:keepNext/>
+        <w:pStyle w:val="Heading3"/>
         <w:spacing w:before="160" w:after="80"/>
         <w:jc w:val="both"/>
         <w:rPr>
@@ -397,8 +407,7 @@
     </w:p>
     <w:p>
       <w:pPr>
-        <w:pStyle w:val="Titre3"/>
-        <w:keepNext/>
+        <w:pStyle w:val="Heading3"/>
         <w:spacing w:before="160" w:after="80"/>
         <w:jc w:val="both"/>
         <w:rPr>
@@ -413,8 +422,7 @@
     </w:p>
     <w:p>
       <w:pPr>
-        <w:pStyle w:val="Titre3"/>
-        <w:keepNext/>
+        <w:pStyle w:val="Heading3"/>
         <w:spacing w:before="160" w:after="80"/>
         <w:jc w:val="both"/>
         <w:rPr>
@@ -429,8 +437,7 @@
     </w:p>
     <w:p>
       <w:pPr>
-        <w:pStyle w:val="Titre3"/>
-        <w:keepNext/>
+        <w:pStyle w:val="Heading3"/>
         <w:spacing w:before="160" w:after="80"/>
         <w:jc w:val="both"/>
         <w:rPr>
@@ -445,8 +452,7 @@
     </w:p>
     <w:p>
       <w:pPr>
-        <w:pStyle w:val="Titre3"/>
-        <w:keepNext/>
+        <w:pStyle w:val="Heading3"/>
         <w:spacing w:before="160" w:after="80"/>
         <w:jc w:val="both"/>
         <w:rPr>
@@ -476,7 +482,7 @@
     </w:p>
     <w:p>
       <w:pPr>
-        <w:pStyle w:val="Paragraphedeliste"/>
+        <w:pStyle w:val="ListParagraph"/>
         <w:ind w:left="1416"/>
         <w:jc w:val="both"/>
         <w:rPr>
@@ -491,8 +497,7 @@
     </w:p>
     <w:p>
       <w:pPr>
-        <w:pStyle w:val="Titre2"/>
-        <w:keepNext/>
+        <w:pStyle w:val="Heading2"/>
         <w:spacing w:before="160" w:after="80"/>
         <w:jc w:val="both"/>
         <w:rPr>
@@ -507,7 +512,7 @@
     </w:p>
     <w:p>
       <w:pPr>
-        <w:pStyle w:val="Paragraphedeliste"/>
+        <w:pStyle w:val="ListParagraph"/>
         <w:ind w:left="1353"/>
         <w:jc w:val="both"/>
         <w:rPr>
@@ -522,7 +527,7 @@
     </w:p>
     <w:p>
       <w:pPr>
-        <w:pStyle w:val="Paragraphedeliste"/>
+        <w:pStyle w:val="ListParagraph"/>
         <w:ind w:left="1353"/>
         <w:jc w:val="both"/>
         <w:rPr>
@@ -537,8 +542,7 @@
     </w:p>
     <w:p>
       <w:pPr>
-        <w:pStyle w:val="Titre2"/>
-        <w:keepNext/>
+        <w:pStyle w:val="Heading2"/>
         <w:spacing w:before="160" w:after="80"/>
         <w:jc w:val="both"/>
         <w:rPr>
@@ -548,13 +552,13 @@
         </w:rPr>
       </w:pPr>
       <w:r>
+        <w:lastRenderedPageBreak/>
         <w:t>3.6. Conduits éjaculateurs</w:t>
       </w:r>
     </w:p>
     <w:p>
       <w:pPr>
-        <w:pStyle w:val="Titre2"/>
-        <w:keepNext/>
+        <w:pStyle w:val="Heading2"/>
         <w:spacing w:before="160" w:after="80"/>
         <w:jc w:val="both"/>
         <w:rPr>
@@ -569,7 +573,7 @@
     </w:p>
     <w:p>
       <w:pPr>
-        <w:pStyle w:val="Paragraphedeliste"/>
+        <w:pStyle w:val="ListParagraph"/>
         <w:ind w:left="1353"/>
         <w:jc w:val="both"/>
         <w:rPr>
@@ -579,12 +583,12 @@
         </w:rPr>
       </w:pPr>
       <w:r>
-        <w:t xml:space="preserve"> Chez un adulte jeune, elle a la forme d’une châtaigne (figure 20.9). Sa consistance ferme mais souple est comparable au globe oculaire. Son poids est de 20 à 25 g. Son volume augmentant beaucoup après 60 ans, peut devenir gros comme une orange et exercer une pression sur l’urètre et la vessie et occasionner des troubles de la miction. </w:t>
-      </w:r>
-    </w:p>
-    <w:p>
-      <w:pPr>
-        <w:pStyle w:val="Paragraphedeliste"/>
+        <w:t xml:space="preserve"> Chez un adulte jeune, elle a la forme d’une châtaigne. Sa consistance ferme mais souple est comparable au globe oculaire. Son poids est de 20 à 25 g. Son volume augmentant beaucoup après 60 ans, peut devenir gros comme une orange et exercer une pression sur l’urètre et la vessie et occasionner des troubles de la miction. </w:t>
+      </w:r>
+    </w:p>
+    <w:p>
+      <w:pPr>
+        <w:pStyle w:val="ListParagraph"/>
         <w:ind w:left="1353"/>
         <w:jc w:val="both"/>
         <w:rPr>
@@ -599,8 +603,7 @@
     </w:p>
     <w:p>
       <w:pPr>
-        <w:pStyle w:val="Titre3"/>
-        <w:keepNext/>
+        <w:pStyle w:val="Heading3"/>
         <w:spacing w:before="160" w:after="80"/>
         <w:jc w:val="both"/>
         <w:rPr>
@@ -615,8 +618,7 @@
     </w:p>
     <w:p>
       <w:pPr>
-        <w:pStyle w:val="Titre3"/>
-        <w:keepNext/>
+        <w:pStyle w:val="Heading3"/>
         <w:spacing w:before="160" w:after="80"/>
         <w:jc w:val="both"/>
         <w:rPr>
@@ -631,7 +633,7 @@
     </w:p>
     <w:p>
       <w:pPr>
-        <w:pStyle w:val="Paragraphedeliste"/>
+        <w:pStyle w:val="ListParagraph"/>
         <w:numPr>
           <w:ilvl w:val="0"/>
           <w:numId w:val="13"/>
@@ -649,7 +651,7 @@
     </w:p>
     <w:p>
       <w:pPr>
-        <w:pStyle w:val="Paragraphedeliste"/>
+        <w:pStyle w:val="ListParagraph"/>
         <w:numPr>
           <w:ilvl w:val="0"/>
           <w:numId w:val="13"/>
@@ -662,12 +664,36 @@
         </w:rPr>
       </w:pPr>
       <w:r>
-        <w:t xml:space="preserve"> lobe moyen: médial, il est parcouru par l’urètre prostatique  qui présente une fente l’utricule prostatique (figure 20.10). Celui-ci est le vestige atrophié des trompes, de l’utérus et du vagin chez la femme. Les anciens l’appelaient le «vagin mâle ».</w:t>
-      </w:r>
-    </w:p>
-    <w:p>
-      <w:pPr>
-        <w:pStyle w:val="Paragraphedeliste"/>
+        <w:t xml:space="preserve"> </w:t>
+      </w:r>
+      <w:proofErr w:type="gramStart"/>
+      <w:r>
+        <w:t>lobe</w:t>
+      </w:r>
+      <w:proofErr w:type="gramEnd"/>
+      <w:r>
+        <w:t xml:space="preserve"> </w:t>
+      </w:r>
+      <w:proofErr w:type="gramStart"/>
+      <w:r>
+        <w:t>moyen:</w:t>
+      </w:r>
+      <w:proofErr w:type="gramEnd"/>
+      <w:r>
+        <w:t xml:space="preserve"> médial, il est parcouru par l’urètre </w:t>
+      </w:r>
+      <w:proofErr w:type="gramStart"/>
+      <w:r>
+        <w:t>prostatique  qui</w:t>
+      </w:r>
+      <w:proofErr w:type="gramEnd"/>
+      <w:r>
+        <w:t xml:space="preserve"> présente une fente l’utricule prostatique. Celui-ci est le vestige atrophié des trompes, de l’utérus et du vagin chez la femme. Les anciens l’appelaient le «vagin mâle ».</w:t>
+      </w:r>
+    </w:p>
+    <w:p>
+      <w:pPr>
+        <w:pStyle w:val="ListParagraph"/>
         <w:ind w:left="1920"/>
         <w:jc w:val="both"/>
         <w:rPr>
@@ -682,8 +708,7 @@
     </w:p>
     <w:p>
       <w:pPr>
-        <w:pStyle w:val="Titre3"/>
-        <w:keepNext/>
+        <w:pStyle w:val="Heading3"/>
         <w:spacing w:before="160" w:after="80"/>
         <w:jc w:val="both"/>
         <w:rPr>
@@ -698,8 +723,7 @@
     </w:p>
     <w:p>
       <w:pPr>
-        <w:pStyle w:val="Titre2"/>
-        <w:keepNext/>
+        <w:pStyle w:val="Heading2"/>
         <w:spacing w:before="160" w:after="80"/>
         <w:jc w:val="both"/>
         <w:rPr>
@@ -714,8 +738,7 @@
     </w:p>
     <w:p>
       <w:pPr>
-        <w:pStyle w:val="Titre3"/>
-        <w:keepNext/>
+        <w:pStyle w:val="Heading3"/>
         <w:spacing w:before="160" w:after="80"/>
         <w:jc w:val="both"/>
         <w:rPr>
@@ -730,8 +753,7 @@
     </w:p>
     <w:p>
       <w:pPr>
-        <w:pStyle w:val="Titre3"/>
-        <w:keepNext/>
+        <w:pStyle w:val="Heading3"/>
         <w:spacing w:before="160" w:after="80"/>
         <w:jc w:val="both"/>
         <w:rPr>
@@ -746,8 +768,7 @@
     </w:p>
     <w:p>
       <w:pPr>
-        <w:pStyle w:val="Titre3"/>
-        <w:keepNext/>
+        <w:pStyle w:val="Heading3"/>
         <w:spacing w:before="160" w:after="80"/>
         <w:jc w:val="both"/>
         <w:rPr>
@@ -762,8 +783,7 @@
     </w:p>
     <w:p>
       <w:pPr>
-        <w:pStyle w:val="Titre3"/>
-        <w:keepNext/>
+        <w:pStyle w:val="Heading3"/>
         <w:spacing w:before="160" w:after="80"/>
         <w:jc w:val="both"/>
         <w:rPr>
@@ -778,8 +798,7 @@
     </w:p>
     <w:p>
       <w:pPr>
-        <w:pStyle w:val="Titre1"/>
-        <w:keepNext/>
+        <w:pStyle w:val="Heading1"/>
         <w:spacing w:before="160" w:after="80"/>
         <w:rPr>
           <w:color w:val="auto"/>
@@ -792,8 +811,7 @@
     </w:p>
     <w:p>
       <w:pPr>
-        <w:pStyle w:val="Titre2"/>
-        <w:keepNext/>
+        <w:pStyle w:val="Heading2"/>
         <w:spacing w:before="160" w:after="80"/>
         <w:rPr>
           <w:rFonts w:ascii="Times New Roman" w:hAnsi="Times New Roman" w:cs="Times New Roman"/>
@@ -807,7 +825,7 @@
     </w:p>
     <w:p>
       <w:pPr>
-        <w:pStyle w:val="Paragraphedeliste"/>
+        <w:pStyle w:val="ListParagraph"/>
         <w:numPr>
           <w:ilvl w:val="0"/>
           <w:numId w:val="2"/>
@@ -825,7 +843,7 @@
     </w:p>
     <w:p>
       <w:pPr>
-        <w:pStyle w:val="Paragraphedeliste"/>
+        <w:pStyle w:val="ListParagraph"/>
         <w:numPr>
           <w:ilvl w:val="0"/>
           <w:numId w:val="2"/>
@@ -843,7 +861,7 @@
     </w:p>
     <w:p>
       <w:pPr>
-        <w:pStyle w:val="Paragraphedeliste"/>
+        <w:pStyle w:val="ListParagraph"/>
         <w:numPr>
           <w:ilvl w:val="0"/>
           <w:numId w:val="2"/>
@@ -861,7 +879,7 @@
     </w:p>
     <w:p>
       <w:pPr>
-        <w:pStyle w:val="Paragraphedeliste"/>
+        <w:pStyle w:val="ListParagraph"/>
         <w:numPr>
           <w:ilvl w:val="0"/>
           <w:numId w:val="2"/>
@@ -879,7 +897,7 @@
     </w:p>
     <w:p>
       <w:pPr>
-        <w:pStyle w:val="Paragraphedeliste"/>
+        <w:pStyle w:val="ListParagraph"/>
         <w:numPr>
           <w:ilvl w:val="0"/>
           <w:numId w:val="2"/>
@@ -897,8 +915,7 @@
     </w:p>
     <w:p>
       <w:pPr>
-        <w:pStyle w:val="Titre2"/>
-        <w:keepNext/>
+        <w:pStyle w:val="Heading2"/>
         <w:spacing w:before="160" w:after="80"/>
         <w:jc w:val="both"/>
         <w:rPr>
@@ -908,13 +925,13 @@
         </w:rPr>
       </w:pPr>
       <w:r>
+        <w:lastRenderedPageBreak/>
         <w:t>4.2. Vésicules séminales</w:t>
       </w:r>
     </w:p>
     <w:p>
       <w:pPr>
-        <w:pStyle w:val="Titre1"/>
-        <w:keepNext/>
+        <w:pStyle w:val="Heading1"/>
         <w:spacing w:before="160" w:after="80"/>
         <w:rPr>
           <w:color w:val="auto"/>
@@ -926,8 +943,7 @@
     </w:p>
     <w:p>
       <w:pPr>
-        <w:pStyle w:val="Titre2"/>
-        <w:keepNext/>
+        <w:pStyle w:val="Heading2"/>
         <w:spacing w:before="160" w:after="80"/>
         <w:jc w:val="both"/>
         <w:rPr>
@@ -942,7 +958,7 @@
     </w:p>
     <w:p>
       <w:pPr>
-        <w:pStyle w:val="Paragraphedeliste"/>
+        <w:pStyle w:val="ListParagraph"/>
         <w:numPr>
           <w:ilvl w:val="0"/>
           <w:numId w:val="5"/>
@@ -954,13 +970,23 @@
           <w:szCs w:val="24"/>
         </w:rPr>
       </w:pPr>
-      <w:r>
-        <w:t>Artérielle: l’artère spermatique naît de l’aorte abdominale, près de l’artère rénale (figure 16.10);</w:t>
-      </w:r>
-    </w:p>
-    <w:p>
-      <w:pPr>
-        <w:pStyle w:val="Paragraphedeliste"/>
+      <w:proofErr w:type="gramStart"/>
+      <w:r>
+        <w:t>Artérielle:</w:t>
+      </w:r>
+      <w:proofErr w:type="gramEnd"/>
+      <w:r>
+        <w:t xml:space="preserve"> l’artère spermatique naît de l’aorte abdominale, près de l’artère </w:t>
+      </w:r>
+      <w:proofErr w:type="gramStart"/>
+      <w:r>
+        <w:t>rénale;</w:t>
+      </w:r>
+      <w:proofErr w:type="gramEnd"/>
+    </w:p>
+    <w:p>
+      <w:pPr>
+        <w:pStyle w:val="ListParagraph"/>
         <w:numPr>
           <w:ilvl w:val="0"/>
           <w:numId w:val="5"/>
@@ -973,12 +999,12 @@
         </w:rPr>
       </w:pPr>
       <w:r>
-        <w:t>Veineuse : la vascularisation veineuse du testicule présente des particularités proches de celle de l’ovaire (figure 16.10). La veine spermatique droite rejoint la veine cave inférieure, tandis que la veine spermatique gauche rejoint la veine rénale gauche. Une stase veineuse gauche peut favoriser une varicocèle et retentir sur le spermogramme. On parle classiquement d’oligozoospermie lorsque la concentration de spermatozoïdes est inférieure aux valeurs de référence, autour de 15 millions/mL selon les référentiels utilisés ; des valeurs très basses correspondent à des formes plus sévères. L’hypospermie correspond à un volume d’éjaculat inférieur aux valeurs attendues.</w:t>
-      </w:r>
-    </w:p>
-    <w:p>
-      <w:pPr>
-        <w:pStyle w:val="Paragraphedeliste"/>
+        <w:t>Veineuse : la vascularisation veineuse du testicule présente des particularités proches de celle de l’ovaire. La veine spermatique droite rejoint la veine cave inférieure, tandis que la veine spermatique gauche rejoint la veine rénale gauche. Une stase veineuse gauche peut favoriser une varicocèle et retentir sur le spermogramme. On parle classiquement d’oligozoospermie lorsque la concentration de spermatozoïdes est inférieure aux valeurs de référence, autour de 15 millions/mL selon les référentiels utilisés ; des valeurs très basses correspondent à des formes plus sévères. L’hypospermie correspond à un volume d’éjaculat inférieur aux valeurs attendues.</w:t>
+      </w:r>
+    </w:p>
+    <w:p>
+      <w:pPr>
+        <w:pStyle w:val="ListParagraph"/>
         <w:ind w:left="1069"/>
         <w:jc w:val="both"/>
         <w:rPr>
@@ -988,7 +1014,7 @@
         </w:rPr>
       </w:pPr>
       <w:r>
-        <w:t xml:space="preserve">Le système veineux maintient la prostate en place et amortit les microtraumatismes dont la prostate peut être victime. Le retour veineux est sous le double contrôle du système porte (figure 11.7). Comme pour les hémorroïdes, toute congestion du système porte, et donc du foie, entraîne une congestion de la prostate. </w:t>
+        <w:t xml:space="preserve">Le système veineux maintient la prostate en place et amortit les microtraumatismes dont la prostate peut être victime. Le retour veineux est sous le double contrôle du système porte. Comme pour les hémorroïdes, toute congestion du système porte, et donc du foie, entraîne une congestion de la prostate. </w:t>
       </w:r>
     </w:p>
     <w:p>
@@ -1008,7 +1034,7 @@
     </w:p>
     <w:p>
       <w:pPr>
-        <w:pStyle w:val="Paragraphedeliste"/>
+        <w:pStyle w:val="ListParagraph"/>
         <w:ind w:left="1069"/>
         <w:jc w:val="both"/>
         <w:rPr>
@@ -1023,7 +1049,7 @@
     </w:p>
     <w:p>
       <w:pPr>
-        <w:pStyle w:val="Paragraphedeliste"/>
+        <w:pStyle w:val="ListParagraph"/>
         <w:ind w:left="1069"/>
         <w:jc w:val="both"/>
         <w:rPr>
@@ -1033,13 +1059,20 @@
         </w:rPr>
       </w:pPr>
       <w:r>
-        <w:t>La fixation du rein gauche ou le clampage de la veine rénale par la racine du mésentère ou par la pince aorto-mésentérique  à la suite de ptose de l’intestin grêle (figure 16.10), freine le retour veineux dans la cavité pelvienne, occasionnant des varicocèles gauches et des varices prédominant dans le membre inférieur gauche. Prostate et vésicules séminales:</w:t>
-      </w:r>
-    </w:p>
-    <w:p>
-      <w:pPr>
-        <w:pStyle w:val="Titre1"/>
-        <w:keepNext/>
+        <w:t>La fixation du rein gauche ou le clampage de la veine rénale par la racine du mésentère ou par la pince aorto-</w:t>
+      </w:r>
+      <w:proofErr w:type="gramStart"/>
+      <w:r>
+        <w:t>mésentérique  à</w:t>
+      </w:r>
+      <w:proofErr w:type="gramEnd"/>
+      <w:r>
+        <w:t xml:space="preserve"> la suite de ptose de l’intestin grêle, freine le retour veineux dans la cavité pelvienne, occasionnant des varicocèles gauches et des varices prédominant dans le membre inférieur gauche. Prostate et vésicules séminales:</w:t>
+      </w:r>
+    </w:p>
+    <w:p>
+      <w:pPr>
+        <w:pStyle w:val="Heading1"/>
         <w:spacing w:before="160" w:after="80"/>
         <w:rPr>
           <w:color w:val="auto"/>
@@ -1051,13 +1084,11 @@
     </w:p>
     <w:p>
       <w:pPr>
-        <w:pStyle w:val="Titre2"/>
-        <w:keepNext/>
+        <w:pStyle w:val="Heading2"/>
         <w:spacing w:before="160" w:after="80"/>
         <w:jc w:val="both"/>
         <w:rPr>
           <w:rFonts w:ascii="Times New Roman" w:hAnsi="Times New Roman" w:cs="Times New Roman"/>
-          <w:b/>
           <w:sz w:val="24"/>
           <w:szCs w:val="24"/>
         </w:rPr>
@@ -1068,7 +1099,7 @@
     </w:p>
     <w:p>
       <w:pPr>
-        <w:pStyle w:val="Paragraphedeliste"/>
+        <w:pStyle w:val="ListParagraph"/>
         <w:numPr>
           <w:ilvl w:val="0"/>
           <w:numId w:val="36"/>
@@ -1080,13 +1111,26 @@
           <w:szCs w:val="24"/>
         </w:rPr>
       </w:pPr>
-      <w:r>
-        <w:t>Sympathique: origine médullaire Th10-Th11 et Th12; (figure 4.26)</w:t>
-      </w:r>
-    </w:p>
-    <w:p>
-      <w:pPr>
-        <w:pStyle w:val="Paragraphedeliste"/>
+      <w:proofErr w:type="gramStart"/>
+      <w:r>
+        <w:t>Sympathique:</w:t>
+      </w:r>
+      <w:proofErr w:type="gramEnd"/>
+      <w:r>
+        <w:t xml:space="preserve"> origine médullaire Th10-Th11 et Th</w:t>
+      </w:r>
+      <w:proofErr w:type="gramStart"/>
+      <w:r>
+        <w:t>12;</w:t>
+      </w:r>
+      <w:proofErr w:type="gramEnd"/>
+      <w:r>
+        <w:t xml:space="preserve"> </w:t>
+      </w:r>
+    </w:p>
+    <w:p>
+      <w:pPr>
+        <w:pStyle w:val="ListParagraph"/>
         <w:numPr>
           <w:ilvl w:val="0"/>
           <w:numId w:val="36"/>
@@ -1099,12 +1143,17 @@
         </w:rPr>
       </w:pPr>
       <w:r>
-        <w:t>Parasympathique pelvien S2 à S4 (à hauteur de la vertèbre L1);</w:t>
-      </w:r>
-    </w:p>
-    <w:p>
-      <w:pPr>
-        <w:pStyle w:val="Paragraphedeliste"/>
+        <w:t>Parasympathique pelvien S2 à S4 (à hauteur de la vertèbre L1</w:t>
+      </w:r>
+      <w:proofErr w:type="gramStart"/>
+      <w:r>
+        <w:t>);</w:t>
+      </w:r>
+      <w:proofErr w:type="gramEnd"/>
+    </w:p>
+    <w:p>
+      <w:pPr>
+        <w:pStyle w:val="ListParagraph"/>
         <w:numPr>
           <w:ilvl w:val="0"/>
           <w:numId w:val="36"/>
@@ -1122,13 +1171,11 @@
     </w:p>
     <w:p>
       <w:pPr>
-        <w:pStyle w:val="Titre2"/>
-        <w:keepNext/>
+        <w:pStyle w:val="Heading2"/>
         <w:spacing w:before="160" w:after="80"/>
         <w:jc w:val="both"/>
         <w:rPr>
           <w:rFonts w:ascii="Times New Roman" w:hAnsi="Times New Roman" w:cs="Times New Roman"/>
-          <w:b/>
           <w:sz w:val="24"/>
           <w:szCs w:val="24"/>
         </w:rPr>
@@ -1139,7 +1186,7 @@
     </w:p>
     <w:p>
       <w:pPr>
-        <w:pStyle w:val="Paragraphedeliste"/>
+        <w:pStyle w:val="ListParagraph"/>
         <w:numPr>
           <w:ilvl w:val="0"/>
           <w:numId w:val="37"/>
@@ -1157,7 +1204,7 @@
     </w:p>
     <w:p>
       <w:pPr>
-        <w:pStyle w:val="Paragraphedeliste"/>
+        <w:pStyle w:val="ListParagraph"/>
         <w:numPr>
           <w:ilvl w:val="0"/>
           <w:numId w:val="37"/>
@@ -1175,7 +1222,7 @@
     </w:p>
     <w:p>
       <w:pPr>
-        <w:pStyle w:val="Paragraphedeliste"/>
+        <w:pStyle w:val="ListParagraph"/>
         <w:numPr>
           <w:ilvl w:val="0"/>
           <w:numId w:val="37"/>
@@ -1188,12 +1235,20 @@
         </w:rPr>
       </w:pPr>
       <w:r>
-        <w:t>Plexus hypogastrique supérieur: il apporte l’innervation sympathique au plexus hypogastrique inférieur. (figure 17.14)</w:t>
-      </w:r>
-    </w:p>
-    <w:p>
-      <w:pPr>
-        <w:pStyle w:val="Paragraphedeliste"/>
+        <w:t xml:space="preserve">Plexus hypogastrique </w:t>
+      </w:r>
+      <w:proofErr w:type="gramStart"/>
+      <w:r>
+        <w:t>supérieur:</w:t>
+      </w:r>
+      <w:proofErr w:type="gramEnd"/>
+      <w:r>
+        <w:t xml:space="preserve"> il apporte l’innervation sympathique au plexus hypogastrique inférieur. </w:t>
+      </w:r>
+    </w:p>
+    <w:p>
+      <w:pPr>
+        <w:pStyle w:val="ListParagraph"/>
         <w:numPr>
           <w:ilvl w:val="0"/>
           <w:numId w:val="37"/>
@@ -1206,12 +1261,20 @@
         </w:rPr>
       </w:pPr>
       <w:r>
-        <w:t>Plexus hypogastrique inférieur: il est situé dans la cavité pelvienne, contenu dans la lame sacro-recto-génito-pubienne. Il apporte l’innervation autonome aux organes pelviens.</w:t>
-      </w:r>
-    </w:p>
-    <w:p>
-      <w:pPr>
-        <w:pStyle w:val="Paragraphedeliste"/>
+        <w:t xml:space="preserve">Plexus hypogastrique </w:t>
+      </w:r>
+      <w:proofErr w:type="gramStart"/>
+      <w:r>
+        <w:t>inférieur:</w:t>
+      </w:r>
+      <w:proofErr w:type="gramEnd"/>
+      <w:r>
+        <w:t xml:space="preserve"> il est situé dans la cavité pelvienne, contenu dans la lame sacro-recto-génito-pubienne. Il apporte l’innervation autonome aux organes pelviens.</w:t>
+      </w:r>
+    </w:p>
+    <w:p>
+      <w:pPr>
+        <w:pStyle w:val="ListParagraph"/>
         <w:ind w:left="660"/>
         <w:jc w:val="both"/>
         <w:rPr>
@@ -1220,12 +1283,10 @@
           <w:szCs w:val="24"/>
         </w:rPr>
       </w:pPr>
-      <w:r/>
-    </w:p>
-    <w:p>
-      <w:pPr>
-        <w:pStyle w:val="Titre1"/>
-        <w:keepNext/>
+    </w:p>
+    <w:p>
+      <w:pPr>
+        <w:pStyle w:val="Heading1"/>
         <w:spacing w:before="160" w:after="80"/>
         <w:rPr>
           <w:color w:val="auto"/>
@@ -1237,8 +1298,7 @@
     </w:p>
     <w:p>
       <w:pPr>
-        <w:pStyle w:val="Titre2"/>
-        <w:keepNext/>
+        <w:pStyle w:val="Heading2"/>
         <w:spacing w:before="160" w:after="80"/>
         <w:jc w:val="both"/>
         <w:rPr>
@@ -1253,8 +1313,7 @@
     </w:p>
     <w:p>
       <w:pPr>
-        <w:pStyle w:val="Titre3"/>
-        <w:keepNext/>
+        <w:pStyle w:val="Heading3"/>
         <w:spacing w:before="160" w:after="80"/>
         <w:rPr>
           <w:rFonts w:ascii="Times New Roman" w:hAnsi="Times New Roman" w:cs="Times New Roman"/>
@@ -1268,8 +1327,7 @@
     </w:p>
     <w:p>
       <w:pPr>
-        <w:pStyle w:val="Titre3"/>
-        <w:keepNext/>
+        <w:pStyle w:val="Heading3"/>
         <w:spacing w:before="160" w:beforeAutospacing="1" w:after="80" w:line="240" w:lineRule="auto"/>
         <w:rPr>
           <w:rFonts w:ascii="Times New Roman" w:eastAsia="Times New Roman" w:hAnsi="Times New Roman" w:cs="Times New Roman"/>
@@ -1285,8 +1343,7 @@
     </w:p>
     <w:p>
       <w:pPr>
-        <w:pStyle w:val="Titre3"/>
-        <w:keepNext/>
+        <w:pStyle w:val="Heading3"/>
         <w:spacing w:before="160" w:beforeAutospacing="1" w:after="80" w:line="240" w:lineRule="auto"/>
         <w:rPr>
           <w:rFonts w:ascii="Times New Roman" w:eastAsia="Times New Roman" w:hAnsi="Times New Roman" w:cs="Times New Roman"/>
@@ -1302,8 +1359,7 @@
     </w:p>
     <w:p>
       <w:pPr>
-        <w:pStyle w:val="Titre3"/>
-        <w:keepNext/>
+        <w:pStyle w:val="Heading3"/>
         <w:spacing w:before="160" w:beforeAutospacing="1" w:after="80" w:line="240" w:lineRule="auto"/>
         <w:rPr>
           <w:rFonts w:ascii="Times New Roman" w:eastAsia="Times New Roman" w:hAnsi="Times New Roman" w:cs="Times New Roman"/>
@@ -1319,8 +1375,7 @@
     </w:p>
     <w:p>
       <w:pPr>
-        <w:pStyle w:val="Titre3"/>
-        <w:keepNext/>
+        <w:pStyle w:val="Heading3"/>
         <w:spacing w:before="160" w:beforeAutospacing="1" w:after="80" w:line="240" w:lineRule="auto"/>
         <w:rPr>
           <w:rFonts w:ascii="Times New Roman" w:eastAsia="Times New Roman" w:hAnsi="Times New Roman" w:cs="Times New Roman"/>
@@ -1336,7 +1391,7 @@
     </w:p>
     <w:p>
       <w:pPr>
-        <w:pStyle w:val="Paragraphedeliste"/>
+        <w:pStyle w:val="ListParagraph"/>
         <w:spacing w:before="100" w:beforeAutospacing="1" w:after="24" w:line="240" w:lineRule="auto"/>
         <w:ind w:left="927"/>
         <w:rPr>
@@ -1347,16 +1402,13 @@
           <w:lang w:eastAsia="fr-FR"/>
         </w:rPr>
       </w:pPr>
-      <w:r/>
-    </w:p>
-    <w:p>
-      <w:pPr>
-        <w:pStyle w:val="Titre2"/>
-        <w:keepNext/>
+    </w:p>
+    <w:p>
+      <w:pPr>
+        <w:pStyle w:val="Heading2"/>
         <w:spacing w:before="160" w:beforeAutospacing="1" w:after="80" w:line="240" w:lineRule="auto"/>
         <w:rPr>
           <w:rFonts w:ascii="Times New Roman" w:eastAsia="Times New Roman" w:hAnsi="Times New Roman" w:cs="Times New Roman"/>
-          <w:b/>
           <w:color w:val="202122"/>
           <w:sz w:val="24"/>
           <w:szCs w:val="24"/>
@@ -1369,12 +1421,10 @@
     </w:p>
     <w:p>
       <w:pPr>
-        <w:pStyle w:val="Titre3"/>
-        <w:keepNext/>
+        <w:pStyle w:val="Heading3"/>
         <w:spacing w:before="160" w:beforeAutospacing="1" w:after="80" w:line="240" w:lineRule="auto"/>
         <w:rPr>
           <w:rFonts w:ascii="Times New Roman" w:eastAsia="Times New Roman" w:hAnsi="Times New Roman" w:cs="Times New Roman"/>
-          <w:b/>
           <w:color w:val="202122"/>
           <w:sz w:val="24"/>
           <w:szCs w:val="24"/>
@@ -1387,12 +1437,10 @@
     </w:p>
     <w:p>
       <w:pPr>
-        <w:pStyle w:val="Titre3"/>
-        <w:keepNext/>
+        <w:pStyle w:val="Heading3"/>
         <w:spacing w:before="160" w:beforeAutospacing="1" w:after="80" w:line="240" w:lineRule="auto"/>
         <w:rPr>
           <w:rFonts w:ascii="Times New Roman" w:eastAsia="Times New Roman" w:hAnsi="Times New Roman" w:cs="Times New Roman"/>
-          <w:b/>
           <w:color w:val="202122"/>
           <w:sz w:val="24"/>
           <w:szCs w:val="24"/>
@@ -1405,12 +1453,10 @@
     </w:p>
     <w:p>
       <w:pPr>
-        <w:pStyle w:val="Titre3"/>
-        <w:keepNext/>
+        <w:pStyle w:val="Heading3"/>
         <w:spacing w:before="160" w:beforeAutospacing="1" w:after="80" w:line="240" w:lineRule="auto"/>
         <w:rPr>
           <w:rFonts w:ascii="Times New Roman" w:eastAsia="Times New Roman" w:hAnsi="Times New Roman" w:cs="Times New Roman"/>
-          <w:b/>
           <w:color w:val="202122"/>
           <w:sz w:val="24"/>
           <w:szCs w:val="24"/>
@@ -1423,8 +1469,7 @@
     </w:p>
     <w:p>
       <w:pPr>
-        <w:pStyle w:val="Titre3"/>
-        <w:keepNext/>
+        <w:pStyle w:val="Heading3"/>
         <w:spacing w:before="160" w:after="80"/>
         <w:jc w:val="both"/>
         <w:rPr>
@@ -1439,7 +1484,7 @@
     </w:p>
     <w:p>
       <w:pPr>
-        <w:pStyle w:val="Paragraphedeliste"/>
+        <w:pStyle w:val="ListParagraph"/>
         <w:numPr>
           <w:ilvl w:val="0"/>
           <w:numId w:val="38"/>
@@ -1457,7 +1502,7 @@
     </w:p>
     <w:p>
       <w:pPr>
-        <w:pStyle w:val="Paragraphedeliste"/>
+        <w:pStyle w:val="ListParagraph"/>
         <w:numPr>
           <w:ilvl w:val="0"/>
           <w:numId w:val="38"/>
@@ -1475,7 +1520,7 @@
     </w:p>
     <w:p>
       <w:pPr>
-        <w:pStyle w:val="Paragraphedeliste"/>
+        <w:pStyle w:val="ListParagraph"/>
         <w:numPr>
           <w:ilvl w:val="0"/>
           <w:numId w:val="38"/>
@@ -1493,7 +1538,7 @@
     </w:p>
     <w:p>
       <w:pPr>
-        <w:pStyle w:val="Paragraphedeliste"/>
+        <w:pStyle w:val="ListParagraph"/>
         <w:ind w:left="2046"/>
         <w:jc w:val="both"/>
         <w:rPr>
@@ -1510,12 +1555,10 @@
     </w:p>
     <w:p>
       <w:pPr>
-        <w:pStyle w:val="Titre3"/>
-        <w:keepNext/>
+        <w:pStyle w:val="Heading3"/>
         <w:spacing w:before="160" w:beforeAutospacing="1" w:after="80" w:line="240" w:lineRule="auto"/>
         <w:rPr>
           <w:rFonts w:ascii="Times New Roman" w:eastAsia="Times New Roman" w:hAnsi="Times New Roman" w:cs="Times New Roman"/>
-          <w:b/>
           <w:color w:val="202122"/>
           <w:sz w:val="24"/>
           <w:szCs w:val="24"/>
@@ -1528,8 +1571,7 @@
     </w:p>
     <w:p>
       <w:pPr>
-        <w:pStyle w:val="Titre1"/>
-        <w:keepNext/>
+        <w:pStyle w:val="Heading1"/>
         <w:spacing w:before="160" w:after="80"/>
         <w:rPr>
           <w:rFonts w:eastAsia="Times New Roman"/>
@@ -1543,8 +1585,7 @@
     </w:p>
     <w:p>
       <w:pPr>
-        <w:pStyle w:val="Titre2"/>
-        <w:keepNext/>
+        <w:pStyle w:val="Heading2"/>
         <w:spacing w:before="160" w:after="80"/>
         <w:rPr>
           <w:rFonts w:ascii="Times New Roman" w:hAnsi="Times New Roman" w:cs="Times New Roman"/>
@@ -1559,8 +1600,7 @@
     </w:p>
     <w:p>
       <w:pPr>
-        <w:pStyle w:val="Titre3"/>
-        <w:keepNext/>
+        <w:pStyle w:val="Heading3"/>
         <w:spacing w:before="160" w:after="80"/>
         <w:rPr>
           <w:rFonts w:ascii="Times New Roman" w:hAnsi="Times New Roman" w:cs="Times New Roman"/>
@@ -1575,7 +1615,7 @@
     </w:p>
     <w:p>
       <w:pPr>
-        <w:pStyle w:val="Paragraphedeliste"/>
+        <w:pStyle w:val="ListParagraph"/>
         <w:ind w:left="1353"/>
         <w:rPr>
           <w:rFonts w:ascii="Times New Roman" w:hAnsi="Times New Roman" w:cs="Times New Roman"/>
@@ -1591,7 +1631,7 @@
     </w:p>
     <w:p>
       <w:pPr>
-        <w:pStyle w:val="Paragraphedeliste"/>
+        <w:pStyle w:val="ListParagraph"/>
         <w:numPr>
           <w:ilvl w:val="0"/>
           <w:numId w:val="39"/>
@@ -1605,12 +1645,13 @@
         </w:rPr>
       </w:pPr>
       <w:r>
+        <w:lastRenderedPageBreak/>
         <w:t>Evolution: c’est le risque de métastases aux ganglions lymphatiques, au foie et aux poumons.</w:t>
       </w:r>
     </w:p>
     <w:p>
       <w:pPr>
-        <w:pStyle w:val="Paragraphedeliste"/>
+        <w:pStyle w:val="ListParagraph"/>
         <w:keepNext/>
         <w:numPr>
           <w:ilvl w:val="0"/>
@@ -1630,7 +1671,7 @@
     </w:p>
     <w:p>
       <w:pPr>
-        <w:pStyle w:val="Paragraphedeliste"/>
+        <w:pStyle w:val="ListParagraph"/>
         <w:numPr>
           <w:ilvl w:val="0"/>
           <w:numId w:val="28"/>
@@ -1650,7 +1691,7 @@
     </w:p>
     <w:p>
       <w:pPr>
-        <w:pStyle w:val="Paragraphedeliste"/>
+        <w:pStyle w:val="ListParagraph"/>
         <w:numPr>
           <w:ilvl w:val="0"/>
           <w:numId w:val="28"/>
@@ -1670,7 +1711,7 @@
     </w:p>
     <w:p>
       <w:pPr>
-        <w:pStyle w:val="Paragraphedeliste"/>
+        <w:pStyle w:val="ListParagraph"/>
         <w:numPr>
           <w:ilvl w:val="0"/>
           <w:numId w:val="28"/>
@@ -1690,7 +1731,7 @@
     </w:p>
     <w:p>
       <w:pPr>
-        <w:pStyle w:val="Paragraphedeliste"/>
+        <w:pStyle w:val="ListParagraph"/>
         <w:numPr>
           <w:ilvl w:val="0"/>
           <w:numId w:val="28"/>
@@ -1710,7 +1751,7 @@
     </w:p>
     <w:p>
       <w:pPr>
-        <w:pStyle w:val="Paragraphedeliste"/>
+        <w:pStyle w:val="ListParagraph"/>
         <w:numPr>
           <w:ilvl w:val="0"/>
           <w:numId w:val="28"/>
@@ -1730,7 +1771,7 @@
     </w:p>
     <w:p>
       <w:pPr>
-        <w:pStyle w:val="Paragraphedeliste"/>
+        <w:pStyle w:val="ListParagraph"/>
         <w:ind w:left="993"/>
         <w:jc w:val="center"/>
         <w:rPr>
@@ -1747,7 +1788,7 @@
     </w:p>
     <w:p>
       <w:pPr>
-        <w:pStyle w:val="Paragraphedeliste"/>
+        <w:pStyle w:val="ListParagraph"/>
         <w:ind w:left="1429"/>
         <w:rPr>
           <w:rFonts w:ascii="Times New Roman" w:eastAsia="Times New Roman" w:hAnsi="Times New Roman" w:cs="Times New Roman"/>
@@ -1757,12 +1798,10 @@
           <w:lang w:eastAsia="fr-FR"/>
         </w:rPr>
       </w:pPr>
-      <w:r/>
-    </w:p>
-    <w:p>
-      <w:pPr>
-        <w:pStyle w:val="Titre3"/>
-        <w:keepNext/>
+    </w:p>
+    <w:p>
+      <w:pPr>
+        <w:pStyle w:val="Heading3"/>
         <w:spacing w:before="160" w:after="80"/>
         <w:jc w:val="both"/>
         <w:rPr>
@@ -1779,7 +1818,7 @@
     </w:p>
     <w:p>
       <w:pPr>
-        <w:pStyle w:val="Paragraphedeliste"/>
+        <w:pStyle w:val="ListParagraph"/>
         <w:keepNext/>
         <w:ind w:left="1494"/>
         <w:rPr>
@@ -1813,7 +1852,7 @@
     </w:p>
     <w:p>
       <w:pPr>
-        <w:pStyle w:val="Paragraphedeliste"/>
+        <w:pStyle w:val="ListParagraph"/>
         <w:numPr>
           <w:ilvl w:val="0"/>
           <w:numId w:val="29"/>
@@ -1832,7 +1871,7 @@
     </w:p>
     <w:p>
       <w:pPr>
-        <w:pStyle w:val="Paragraphedeliste"/>
+        <w:pStyle w:val="ListParagraph"/>
         <w:ind w:left="1636"/>
         <w:rPr>
           <w:rFonts w:ascii="Times New Roman" w:hAnsi="Times New Roman" w:cs="Times New Roman"/>
@@ -1863,8 +1902,7 @@
     </w:p>
     <w:p>
       <w:pPr>
-        <w:pStyle w:val="Titre3"/>
-        <w:keepNext/>
+        <w:pStyle w:val="Heading3"/>
         <w:spacing w:before="160" w:after="80"/>
         <w:jc w:val="both"/>
         <w:rPr>
@@ -1879,7 +1917,7 @@
     </w:p>
     <w:p>
       <w:pPr>
-        <w:pStyle w:val="Paragraphedeliste"/>
+        <w:pStyle w:val="ListParagraph"/>
         <w:numPr>
           <w:ilvl w:val="0"/>
           <w:numId w:val="21"/>
@@ -1897,7 +1935,7 @@
     </w:p>
     <w:p>
       <w:pPr>
-        <w:pStyle w:val="Paragraphedeliste"/>
+        <w:pStyle w:val="ListParagraph"/>
         <w:numPr>
           <w:ilvl w:val="0"/>
           <w:numId w:val="21"/>
@@ -1915,7 +1953,7 @@
     </w:p>
     <w:p>
       <w:pPr>
-        <w:pStyle w:val="Paragraphedeliste"/>
+        <w:pStyle w:val="ListParagraph"/>
         <w:numPr>
           <w:ilvl w:val="0"/>
           <w:numId w:val="21"/>
@@ -1928,7 +1966,11 @@
         </w:rPr>
       </w:pPr>
       <w:r>
-        <w:t>Métastases: c’est un cancer qui métastase et qui est souvent de diagnostic tardif car les symptômes du début sont ceux de l’hypertrophie bénigne de la prostate (HBP) mais plus tardifs et moins significatifs car ne concernent pas le lobe moyen qui entoure l’urètre. Mais quand les métastases ont migré, les douleurs vertébrales sont très importantes: les patients souffrent de lombalgie et de sciatalgie aiguës, à prédominance nocturne.</w:t>
+        <w:t xml:space="preserve">Métastases: c’est un cancer qui métastase et qui est souvent de diagnostic tardif car les symptômes du début sont ceux de l’hypertrophie bénigne de la prostate (HBP) mais plus tardifs et moins significatifs car ne concernent pas le </w:t>
+      </w:r>
+      <w:r>
+        <w:lastRenderedPageBreak/>
+        <w:t>lobe moyen qui entoure l’urètre. Mais quand les métastases ont migré, les douleurs vertébrales sont très importantes: les patients souffrent de lombalgie et de sciatalgie aiguës, à prédominance nocturne.</w:t>
       </w:r>
     </w:p>
     <w:p>
@@ -1947,8 +1989,7 @@
     </w:p>
     <w:p>
       <w:pPr>
-        <w:pStyle w:val="Titre3"/>
-        <w:keepNext/>
+        <w:pStyle w:val="Heading3"/>
         <w:spacing w:before="160" w:after="80"/>
         <w:rPr>
           <w:rFonts w:ascii="Times New Roman" w:hAnsi="Times New Roman" w:cs="Times New Roman"/>
@@ -1963,7 +2004,7 @@
     </w:p>
     <w:p>
       <w:pPr>
-        <w:pStyle w:val="Paragraphedeliste"/>
+        <w:pStyle w:val="ListParagraph"/>
         <w:ind w:left="1353"/>
         <w:rPr>
           <w:rFonts w:ascii="Times New Roman" w:hAnsi="Times New Roman" w:cs="Times New Roman"/>
@@ -1978,7 +2019,7 @@
     </w:p>
     <w:p>
       <w:pPr>
-        <w:pStyle w:val="Paragraphedeliste"/>
+        <w:pStyle w:val="ListParagraph"/>
         <w:ind w:left="1353"/>
         <w:rPr>
           <w:rFonts w:ascii="Times New Roman" w:hAnsi="Times New Roman" w:cs="Times New Roman"/>
@@ -1987,16 +2028,13 @@
           <w:lang w:eastAsia="fr-FR"/>
         </w:rPr>
       </w:pPr>
-      <w:r/>
-    </w:p>
-    <w:p>
-      <w:pPr>
-        <w:pStyle w:val="Titre2"/>
-        <w:keepNext/>
+    </w:p>
+    <w:p>
+      <w:pPr>
+        <w:pStyle w:val="Heading2"/>
         <w:spacing w:before="160" w:after="80"/>
         <w:rPr>
           <w:rFonts w:ascii="Times New Roman" w:hAnsi="Times New Roman" w:cs="Times New Roman"/>
-          <w:b/>
           <w:sz w:val="24"/>
           <w:szCs w:val="24"/>
           <w:lang w:eastAsia="fr-FR"/>
@@ -2008,13 +2046,11 @@
     </w:p>
     <w:p>
       <w:pPr>
-        <w:pStyle w:val="Titre3"/>
-        <w:keepNext/>
+        <w:pStyle w:val="Heading3"/>
         <w:spacing w:before="160" w:after="80"/>
         <w:jc w:val="both"/>
         <w:rPr>
           <w:rFonts w:ascii="Times New Roman" w:hAnsi="Times New Roman" w:cs="Times New Roman"/>
-          <w:b/>
           <w:sz w:val="24"/>
           <w:szCs w:val="24"/>
         </w:rPr>
@@ -2025,7 +2061,7 @@
     </w:p>
     <w:p>
       <w:pPr>
-        <w:pStyle w:val="Paragraphedeliste"/>
+        <w:pStyle w:val="ListParagraph"/>
         <w:numPr>
           <w:ilvl w:val="0"/>
           <w:numId w:val="11"/>
@@ -2044,7 +2080,7 @@
     </w:p>
     <w:p>
       <w:pPr>
-        <w:pStyle w:val="Paragraphedeliste"/>
+        <w:pStyle w:val="ListParagraph"/>
         <w:keepNext/>
         <w:numPr>
           <w:ilvl w:val="0"/>
@@ -2064,7 +2100,7 @@
     </w:p>
     <w:p>
       <w:pPr>
-        <w:pStyle w:val="Paragraphedeliste"/>
+        <w:pStyle w:val="ListParagraph"/>
         <w:numPr>
           <w:ilvl w:val="0"/>
           <w:numId w:val="22"/>
@@ -2083,7 +2119,7 @@
     </w:p>
     <w:p>
       <w:pPr>
-        <w:pStyle w:val="Paragraphedeliste"/>
+        <w:pStyle w:val="ListParagraph"/>
         <w:ind w:left="2124"/>
         <w:rPr>
           <w:rFonts w:ascii="Times New Roman" w:hAnsi="Times New Roman" w:cs="Times New Roman"/>
@@ -2098,7 +2134,7 @@
     </w:p>
     <w:p>
       <w:pPr>
-        <w:pStyle w:val="Paragraphedeliste"/>
+        <w:pStyle w:val="ListParagraph"/>
         <w:numPr>
           <w:ilvl w:val="0"/>
           <w:numId w:val="22"/>
@@ -2116,7 +2152,7 @@
     </w:p>
     <w:p>
       <w:pPr>
-        <w:pStyle w:val="Paragraphedeliste"/>
+        <w:pStyle w:val="ListParagraph"/>
         <w:numPr>
           <w:ilvl w:val="0"/>
           <w:numId w:val="16"/>
@@ -2134,7 +2170,7 @@
     </w:p>
     <w:p>
       <w:pPr>
-        <w:pStyle w:val="Paragraphedeliste"/>
+        <w:pStyle w:val="ListParagraph"/>
         <w:numPr>
           <w:ilvl w:val="0"/>
           <w:numId w:val="16"/>
@@ -2152,7 +2188,7 @@
     </w:p>
     <w:p>
       <w:pPr>
-        <w:pStyle w:val="Paragraphedeliste"/>
+        <w:pStyle w:val="ListParagraph"/>
         <w:ind w:left="2345"/>
         <w:rPr>
           <w:rFonts w:ascii="Times New Roman" w:hAnsi="Times New Roman" w:cs="Times New Roman"/>
@@ -2161,7 +2197,6 @@
           <w:lang w:eastAsia="fr-FR"/>
         </w:rPr>
       </w:pPr>
-      <w:r/>
     </w:p>
     <w:p>
       <w:pPr>
@@ -2180,7 +2215,7 @@
     </w:p>
     <w:p>
       <w:pPr>
-        <w:pStyle w:val="Paragraphedeliste"/>
+        <w:pStyle w:val="ListParagraph"/>
         <w:ind w:left="1778"/>
         <w:jc w:val="both"/>
         <w:rPr>
@@ -2195,7 +2230,7 @@
     </w:p>
     <w:p>
       <w:pPr>
-        <w:pStyle w:val="Paragraphedeliste"/>
+        <w:pStyle w:val="ListParagraph"/>
         <w:ind w:left="1985"/>
         <w:rPr>
           <w:rFonts w:ascii="Times New Roman" w:hAnsi="Times New Roman" w:cs="Times New Roman"/>
@@ -2204,16 +2239,13 @@
           <w:lang w:eastAsia="fr-FR"/>
         </w:rPr>
       </w:pPr>
-      <w:r/>
-    </w:p>
-    <w:p>
-      <w:pPr>
-        <w:pStyle w:val="Titre3"/>
-        <w:keepNext/>
+    </w:p>
+    <w:p>
+      <w:pPr>
+        <w:pStyle w:val="Heading3"/>
         <w:spacing w:before="160" w:after="80"/>
         <w:rPr>
           <w:rFonts w:ascii="Times New Roman" w:hAnsi="Times New Roman" w:cs="Times New Roman"/>
-          <w:b/>
           <w:sz w:val="24"/>
           <w:szCs w:val="24"/>
           <w:lang w:eastAsia="fr-FR"/>
@@ -2225,7 +2257,7 @@
     </w:p>
     <w:p>
       <w:pPr>
-        <w:pStyle w:val="Paragraphedeliste"/>
+        <w:pStyle w:val="ListParagraph"/>
         <w:keepNext/>
         <w:numPr>
           <w:ilvl w:val="0"/>
@@ -2244,7 +2276,7 @@
     </w:p>
     <w:p>
       <w:pPr>
-        <w:pStyle w:val="Paragraphedeliste"/>
+        <w:pStyle w:val="ListParagraph"/>
         <w:numPr>
           <w:ilvl w:val="0"/>
           <w:numId w:val="24"/>
@@ -2262,7 +2294,7 @@
     </w:p>
     <w:p>
       <w:pPr>
-        <w:pStyle w:val="Paragraphedeliste"/>
+        <w:pStyle w:val="ListParagraph"/>
         <w:numPr>
           <w:ilvl w:val="0"/>
           <w:numId w:val="24"/>
@@ -2280,7 +2312,7 @@
     </w:p>
     <w:p>
       <w:pPr>
-        <w:pStyle w:val="Paragraphedeliste"/>
+        <w:pStyle w:val="ListParagraph"/>
         <w:numPr>
           <w:ilvl w:val="0"/>
           <w:numId w:val="24"/>
@@ -2298,7 +2330,7 @@
     </w:p>
     <w:p>
       <w:pPr>
-        <w:pStyle w:val="Paragraphedeliste"/>
+        <w:pStyle w:val="ListParagraph"/>
         <w:numPr>
           <w:ilvl w:val="0"/>
           <w:numId w:val="24"/>
@@ -2316,7 +2348,7 @@
     </w:p>
     <w:p>
       <w:pPr>
-        <w:pStyle w:val="Paragraphedeliste"/>
+        <w:pStyle w:val="ListParagraph"/>
         <w:numPr>
           <w:ilvl w:val="0"/>
           <w:numId w:val="24"/>
@@ -2329,12 +2361,13 @@
         </w:rPr>
       </w:pPr>
       <w:r>
+        <w:lastRenderedPageBreak/>
         <w:t xml:space="preserve"> stérilité, impuissance.</w:t>
       </w:r>
     </w:p>
     <w:p>
       <w:pPr>
-        <w:pStyle w:val="Paragraphedeliste"/>
+        <w:pStyle w:val="ListParagraph"/>
         <w:numPr>
           <w:ilvl w:val="0"/>
           <w:numId w:val="23"/>
@@ -2352,7 +2385,7 @@
     </w:p>
     <w:p>
       <w:pPr>
-        <w:pStyle w:val="Paragraphedeliste"/>
+        <w:pStyle w:val="ListParagraph"/>
         <w:ind w:left="2203"/>
         <w:jc w:val="both"/>
         <w:rPr>
@@ -2361,12 +2394,10 @@
           <w:szCs w:val="24"/>
         </w:rPr>
       </w:pPr>
-      <w:r/>
-    </w:p>
-    <w:p>
-      <w:pPr>
-        <w:pStyle w:val="Titre1"/>
-        <w:keepNext/>
+    </w:p>
+    <w:p>
+      <w:pPr>
+        <w:pStyle w:val="Heading1"/>
         <w:spacing w:before="160" w:after="80"/>
         <w:rPr>
           <w:color w:val="auto"/>
@@ -2378,7 +2409,7 @@
     </w:p>
     <w:p>
       <w:pPr>
-        <w:pStyle w:val="Paragraphedeliste"/>
+        <w:pStyle w:val="ListParagraph"/>
         <w:numPr>
           <w:ilvl w:val="0"/>
           <w:numId w:val="4"/>
@@ -2387,15 +2418,27 @@
           <w:rFonts w:ascii="Times New Roman" w:hAnsi="Times New Roman" w:cs="Times New Roman"/>
           <w:sz w:val="24"/>
           <w:szCs w:val="24"/>
-        </w:rPr>
-      </w:pPr>
-      <w:r>
-        <w:t>Vertèbres Th12-L1, L5-sacrum, coccyx;</w:t>
-      </w:r>
-    </w:p>
-    <w:p>
-      <w:pPr>
-        <w:pStyle w:val="Paragraphedeliste"/>
+          <w:lang w:val="en-US"/>
+        </w:rPr>
+      </w:pPr>
+      <w:proofErr w:type="spellStart"/>
+      <w:r>
+        <w:rPr>
+          <w:lang w:val="en-US"/>
+        </w:rPr>
+        <w:t>Vertèbres</w:t>
+      </w:r>
+      <w:proofErr w:type="spellEnd"/>
+      <w:r>
+        <w:rPr>
+          <w:lang w:val="en-US"/>
+        </w:rPr>
+        <w:t xml:space="preserve"> Th12-L1, L5-sacrum, coccyx;</w:t>
+      </w:r>
+    </w:p>
+    <w:p>
+      <w:pPr>
+        <w:pStyle w:val="ListParagraph"/>
         <w:numPr>
           <w:ilvl w:val="0"/>
           <w:numId w:val="4"/>
@@ -2412,122 +2455,92 @@
     </w:p>
     <w:p>
       <w:pPr>
-        <w:pStyle w:val="Titre1"/>
-        <w:keepNext/>
+        <w:pStyle w:val="Heading1"/>
         <w:spacing w:before="160" w:after="80"/>
-        <w:rPr/>
-      </w:pPr>
-      <w:r>
-        <w:t>10. Relations viscéro-émotionnelles</w:t>
-      </w:r>
-    </w:p>
-    <w:p>
-      <w:pPr>
-        <w:pStyle w:val="Paragraphedeliste"/>
-        <w:ind w:left="644"/>
-        <w:jc w:val="both"/>
-        <w:rPr>
-          <w:rFonts w:ascii="Times New Roman" w:hAnsi="Times New Roman" w:cs="Times New Roman"/>
-          <w:sz w:val="24"/>
-          <w:szCs w:val="24"/>
-        </w:rPr>
-      </w:pPr>
-      <w:r>
-        <w:t>Très hormono-dépendante, la prostate réagit fortement aux déséquilibres hormonaux provoqués par des états de stress. À l’andropause, l’âge  de la retraite fait perdre à l’homme sa position sociale, il se sent dévalorisé par sa perte de reconnaissance. Il veut retrouver des occupations revalorisantes et se prouver qu’il reste jeune. Il veut séduire. Il se lance dans des défis déraisonnés. Sur le plan sexuel, c’est la peur de la panne sexuelle et de ne plus être à la hauteur qui domine.</w:t>
-      </w:r>
-    </w:p>
-    <w:p>
-      <w:pPr>
-        <w:ind w:left="644"/>
-        <w:jc w:val="both"/>
-        <w:rPr>
-          <w:rFonts w:ascii="Times New Roman" w:hAnsi="Times New Roman" w:cs="Times New Roman"/>
-          <w:sz w:val="24"/>
-          <w:szCs w:val="24"/>
-        </w:rPr>
-      </w:pPr>
-      <w:r>
-        <w:t>Le couple: il doit réapprendre à vivre à deux, éviter les conflits et que chacun trouve sa place. La maison familiale doit rester un nid accueillant dans lequel les enfants et petits-enfants sont contents de se retrouver.</w:t>
-      </w:r>
-    </w:p>
-    <w:p>
-      <w:pPr>
-        <w:rPr>
-          <w:rFonts w:ascii="Times New Roman" w:hAnsi="Times New Roman" w:cs="Times New Roman"/>
-          <w:sz w:val="24"/>
-          <w:szCs w:val="24"/>
-        </w:rPr>
-      </w:pPr>
-      <w:r/>
-    </w:p>
-    <w:p>
-      <w:pPr>
-        <w:pStyle w:val="Paragraphedeliste"/>
-        <w:ind w:left="644"/>
-        <w:jc w:val="both"/>
-        <w:rPr>
-          <w:rFonts w:ascii="Times New Roman" w:hAnsi="Times New Roman" w:cs="Times New Roman"/>
-          <w:sz w:val="24"/>
-          <w:szCs w:val="24"/>
-        </w:rPr>
-      </w:pPr>
-      <w:r/>
-    </w:p>
-    <w:p>
-      <w:pPr/>
-      <w:r/>
-    </w:p>
-    <w:p>
-      <w:pPr>
-        <w:jc w:val="both"/>
-        <w:rPr>
-          <w:rFonts w:ascii="Arial" w:eastAsia="Times New Roman" w:hAnsi="Arial" w:cs="Arial"/>
-          <w:color w:val="525255"/>
-          <w:sz w:val="13"/>
-          <w:szCs w:val="13"/>
-          <w:lang w:eastAsia="fr-FR"/>
-        </w:rPr>
-      </w:pPr>
-      <w:r/>
-    </w:p>
-    <w:p>
-      <w:pPr>
-        <w:pStyle w:val="Titre1"/>
-        <w:keepNext/>
-      </w:pPr>
-      <w:r>
-        <w:t>11. Zones réflexes podales</w:t>
-      </w:r>
-    </w:p>
-    <w:p>
-      <w:r>
-        <w:rPr>
-          <w:i w:val="0"/>
-        </w:rPr>
+      </w:pPr>
+      <w:r>
+        <w:t xml:space="preserve">10. Relations </w:t>
+      </w:r>
+      <w:proofErr w:type="spellStart"/>
+      <w:r>
+        <w:t>viscéro</w:t>
+      </w:r>
+      <w:proofErr w:type="spellEnd"/>
+      <w:r>
+        <w:t>-émotionnelles</w:t>
+      </w:r>
+    </w:p>
+    <w:p>
+      <w:r>
+        <w:t>Les fonctions urinaires et sexuelles sont étroitement intégrées aux réseaux cérébraux impliqués dans l’</w:t>
+      </w:r>
+      <w:proofErr w:type="spellStart"/>
+      <w:r>
+        <w:t>interoception</w:t>
+      </w:r>
+      <w:proofErr w:type="spellEnd"/>
+      <w:r>
+        <w:t>, les émotions, l’attention et la régulation autonome. Le stress ne constitue pas à lui seul une cause de dysfonction prostatique, mais il peut modifier le tonus neuro-végétatif, le sommeil, la perception corporelle et la fonction sexuelle, et ainsi majorer le retentissement de certains symptômes uro-génitaux.</w:t>
+      </w:r>
+    </w:p>
+    <w:p>
+      <w:r>
+        <w:t>Avec l’âge, les modifications urinaires ou sexuelles peuvent également influencer l’image corporelle, la confiance en soi et la qualité de vie. La retraite, les changements de rôle social ou familial, les préoccupations liées au vieillissement ou la crainte d’une diminution des performances sexuelles peuvent constituer des facteurs de stress chez certains hommes. Leur importance varie cependant considérablement d’une personne à l’autre.</w:t>
+      </w:r>
+    </w:p>
+    <w:p>
+      <w:r>
+        <w:t>La relation est bidirectionnelle : les troubles urinaires, les douleurs pelviennes ou les difficultés sexuelles peuvent générer anxiété, anticipation et évitement ; inversement, ces états peuvent amplifier la perception des symptômes et les réponses autonomes associées.</w:t>
+      </w:r>
+    </w:p>
+    <w:p>
+      <w:r>
+        <w:t xml:space="preserve">Dans la ROP, cette dimension est abordée dans le cadre de </w:t>
+      </w:r>
+      <w:r>
+        <w:rPr>
+          <w:b/>
+          <w:bCs/>
+        </w:rPr>
+        <w:t>l’axe cerveau–sphère génitale masculine</w:t>
+      </w:r>
+      <w:r>
+        <w:t>. Elle complète l’évaluation anatomique, neuro-végétative et loco-régionale, sans définir une « personnalité prostate » et sans attribuer automatiquement les symptômes à une origine émotionnelle.</w:t>
+      </w:r>
+    </w:p>
+    <w:p>
+      <w:pPr>
+        <w:pStyle w:val="Heading1"/>
+      </w:pPr>
+      <w:r>
+        <w:t xml:space="preserve">11. Zones réflexes </w:t>
+      </w:r>
+      <w:r>
+        <w:t>ROP</w:t>
+      </w:r>
+    </w:p>
+    <w:p>
+      <w:r>
         <w:t>Les localisations décrites ci-dessous appartiennent à la cartographie clinique de la ROP. Elles ne constituent pas une projection anatomique directe des testicules, de la prostate, des vésicules séminales, des voies génitales ou de leurs nerfs sur le pied. Leur sélection dépend de l’anamnèse, des tests, des réactions palpatoires et du tableau fonctionnel.</w:t>
       </w:r>
     </w:p>
     <w:p>
       <w:r>
-        <w:rPr>
-          <w:i w:val="0"/>
-        </w:rPr>
         <w:t>Pour les organes génitaux masculins, la lecture des zones réflexes est organisée selon les quatre niveaux du protocole ROP, en distinguant les testicules et les voies spermatiques de la prostate et des structures pelviennes associées.</w:t>
       </w:r>
     </w:p>
     <w:p>
       <w:pPr>
-        <w:pStyle w:val="Titre2"/>
-        <w:keepNext/>
-      </w:pPr>
-      <w:r>
+        <w:pStyle w:val="Heading2"/>
+      </w:pPr>
+      <w:r>
+        <w:lastRenderedPageBreak/>
         <w:t>11.1. Testicules et voies spermatiques</w:t>
       </w:r>
     </w:p>
     <w:p>
       <w:pPr>
-        <w:pStyle w:val="Titre3"/>
-        <w:keepNext/>
+        <w:pStyle w:val="Heading3"/>
       </w:pPr>
       <w:r>
         <w:t>11.1.1. Niveau 1 — Régulation des centres supérieurs</w:t>
@@ -2535,75 +2548,57 @@
     </w:p>
     <w:p>
       <w:r>
-        <w:rPr>
-          <w:i w:val="0"/>
-        </w:rPr>
         <w:t>La fonction testiculaire s’inscrit dans une régulation neuroendocrine centrale, notamment par l’axe hypothalamo-hypophysaire-gonadique. Dans le protocole ROP, le Niveau 1 peut donc être envisagé lorsque le contexte général, endocrinien, de stress ou d’adaptation le justifie.</w:t>
       </w:r>
     </w:p>
     <w:p>
       <w:pPr>
-        <w:pStyle w:val="Paragraphedeliste"/>
+        <w:pStyle w:val="ListParagraph"/>
         <w:spacing w:after="30"/>
         <w:ind w:left="255" w:hanging="142"/>
       </w:pPr>
       <w:r>
-        <w:t xml:space="preserve">• </w:t>
-      </w:r>
-      <w:r>
-        <w:t>Zones réflexes occipitales.</w:t>
-      </w:r>
-    </w:p>
-    <w:p>
-      <w:pPr>
-        <w:pStyle w:val="Paragraphedeliste"/>
+        <w:t>• Zones réflexes occipitales.</w:t>
+      </w:r>
+    </w:p>
+    <w:p>
+      <w:pPr>
+        <w:pStyle w:val="ListParagraph"/>
         <w:spacing w:after="30"/>
         <w:ind w:left="255" w:hanging="142"/>
       </w:pPr>
       <w:r>
-        <w:t xml:space="preserve">• </w:t>
-      </w:r>
-      <w:r>
-        <w:t>Tronc cérébral et centres d’intégration.</w:t>
-      </w:r>
-    </w:p>
-    <w:p>
-      <w:pPr>
-        <w:pStyle w:val="Paragraphedeliste"/>
+        <w:t>• Tronc cérébral et centres d’intégration.</w:t>
+      </w:r>
+    </w:p>
+    <w:p>
+      <w:pPr>
+        <w:pStyle w:val="ListParagraph"/>
         <w:spacing w:after="30"/>
         <w:ind w:left="255" w:hanging="142"/>
       </w:pPr>
       <w:r>
-        <w:t xml:space="preserve">• </w:t>
-      </w:r>
-      <w:r>
-        <w:t>Diencéphale, notamment hypothalamus.</w:t>
-      </w:r>
-    </w:p>
-    <w:p>
-      <w:pPr>
-        <w:pStyle w:val="Paragraphedeliste"/>
+        <w:t>• Diencéphale, notamment hypothalamus.</w:t>
+      </w:r>
+    </w:p>
+    <w:p>
+      <w:pPr>
+        <w:pStyle w:val="ListParagraph"/>
         <w:spacing w:after="30"/>
         <w:ind w:left="255" w:hanging="142"/>
       </w:pPr>
       <w:r>
-        <w:t xml:space="preserve">• </w:t>
-      </w:r>
-      <w:r>
-        <w:t>Hypophyse et axe hypothalamo-hypophysaire.</w:t>
-      </w:r>
-    </w:p>
-    <w:p>
-      <w:pPr>
-        <w:pStyle w:val="Paragraphedeliste"/>
+        <w:t>• Hypophyse et axe hypothalamo-hypophysaire.</w:t>
+      </w:r>
+    </w:p>
+    <w:p>
+      <w:pPr>
+        <w:pStyle w:val="ListParagraph"/>
         <w:spacing w:after="30"/>
         <w:ind w:left="255" w:hanging="142"/>
       </w:pPr>
       <w:r>
-        <w:t xml:space="preserve">• </w:t>
-      </w:r>
-      <w:r>
-        <w:t>Environnement neuro-méningé dans le modèle ROP.</w:t>
+        <w:t>• Environnement neuro-méningé dans le modèle ROP.</w:t>
       </w:r>
     </w:p>
     <w:p>
@@ -2621,24 +2616,17 @@
     <w:p>
       <w:pPr>
         <w:pStyle w:val="EncadreROP"/>
-        <w:shd w:fill="F3EEE4"/>
+        <w:shd w:val="clear" w:color="auto" w:fill="F3EEE4"/>
         <w:spacing w:before="80" w:after="100"/>
         <w:ind w:left="142" w:right="142"/>
       </w:pPr>
       <w:r>
-        <w:rPr>
-          <w:b/>
-        </w:rPr>
-        <w:t xml:space="preserve">INTÉRÊT EN ROP — </w:t>
-      </w:r>
-      <w:r>
-        <w:t>Le Niveau 1 replace la fonction gonadique dans sa régulation centrale et neuroendocrine. Il ne signifie pas qu’une zone podale modifie directement la sécrétion de testostérone, de LH ou de FSH.</w:t>
-      </w:r>
-    </w:p>
-    <w:p>
-      <w:pPr>
-        <w:pStyle w:val="Titre3"/>
-        <w:keepNext/>
+        <w:t>INTÉRÊT EN ROP — Le Niveau 1 replace la fonction gonadique dans sa régulation centrale et neuroendocrine. Il ne signifie pas qu’une zone podale modifie directement la sécrétion de testostérone, de LH ou de FSH.</w:t>
+      </w:r>
+    </w:p>
+    <w:p>
+      <w:pPr>
+        <w:pStyle w:val="Heading3"/>
       </w:pPr>
       <w:r>
         <w:t>11.1.2. Niveau 2 — Régulation neuro-végétative et adaptation</w:t>
@@ -2646,62 +2634,47 @@
     </w:p>
     <w:p>
       <w:r>
-        <w:rPr>
-          <w:i w:val="0"/>
-        </w:rPr>
         <w:t>Pour le testicule, l’organisation autonome ne doit pas être calquée sur celle des organes pelviens. La composante sympathique et les plexus péri-vasculaires accompagnant les vaisseaux gonadiques occupent une place importante.</w:t>
       </w:r>
     </w:p>
     <w:p>
       <w:pPr>
-        <w:pStyle w:val="Paragraphedeliste"/>
+        <w:pStyle w:val="ListParagraph"/>
         <w:spacing w:after="30"/>
         <w:ind w:left="255" w:hanging="142"/>
       </w:pPr>
       <w:r>
-        <w:t xml:space="preserve">• </w:t>
-      </w:r>
-      <w:r>
-        <w:t>Sympathique thoracique inférieur : territoire principalement T10-T12 dans la lecture du chapitre (figures 4.29 et 4.32).</w:t>
-      </w:r>
-    </w:p>
-    <w:p>
-      <w:pPr>
-        <w:pStyle w:val="Paragraphedeliste"/>
+        <w:t>• Sympathique thoracique inférieur : territoire principalement T10-T12 dans la lecture du chapitre.</w:t>
+      </w:r>
+    </w:p>
+    <w:p>
+      <w:pPr>
+        <w:pStyle w:val="ListParagraph"/>
         <w:spacing w:after="30"/>
         <w:ind w:left="255" w:hanging="142"/>
       </w:pPr>
       <w:r>
-        <w:t xml:space="preserve">• </w:t>
-      </w:r>
-      <w:r>
-        <w:t>Plexus aortorénal et réseaux péri-artériels gonadiques.</w:t>
-      </w:r>
-    </w:p>
-    <w:p>
-      <w:pPr>
-        <w:pStyle w:val="Paragraphedeliste"/>
+        <w:t>• Plexus aortorénal et réseaux péri-artériels gonadiques.</w:t>
+      </w:r>
+    </w:p>
+    <w:p>
+      <w:pPr>
+        <w:pStyle w:val="ListParagraph"/>
         <w:spacing w:after="30"/>
         <w:ind w:left="255" w:hanging="142"/>
       </w:pPr>
       <w:r>
-        <w:t xml:space="preserve">• </w:t>
-      </w:r>
-      <w:r>
-        <w:t>Voies autonomes associées au cordon spermatique et au conduit déférent selon le contexte clinique.</w:t>
-      </w:r>
-    </w:p>
-    <w:p>
-      <w:pPr>
-        <w:pStyle w:val="Paragraphedeliste"/>
+        <w:t>• Voies autonomes associées au cordon spermatique et au conduit déférent selon le contexte clinique.</w:t>
+      </w:r>
+    </w:p>
+    <w:p>
+      <w:pPr>
+        <w:pStyle w:val="ListParagraph"/>
         <w:spacing w:after="30"/>
         <w:ind w:left="255" w:hanging="142"/>
       </w:pPr>
       <w:r>
-        <w:t xml:space="preserve">• </w:t>
-      </w:r>
-      <w:r>
-        <w:t>Réseaux pelviens autonomes à considérer surtout pour les voies génitales distales et les glandes accessoires, sans présenter S2-S4 comme une voie parasympathique directe et obligatoire du testicule.</w:t>
+        <w:t>• Réseaux pelviens autonomes à considérer surtout pour les voies génitales distales et les glandes accessoires, sans présenter S2-S4 comme une voie parasympathique directe et obligatoire du testicule.</w:t>
       </w:r>
     </w:p>
     <w:p>
@@ -2718,101 +2691,266 @@
     </w:p>
     <w:p>
       <w:pPr>
+        <w:pStyle w:val="Heading3"/>
+      </w:pPr>
+      <w:r>
+        <w:t>11.1.3. Niveau 3 — Régulation viscérale loco-régionale</w:t>
+      </w:r>
+    </w:p>
+    <w:p>
+      <w:r>
+        <w:t>Le Niveau 3 rassemble la cartographie des testicules, du cordon spermatique et du canal inguinal, ainsi que leurs rapports régionaux.</w:t>
+      </w:r>
+    </w:p>
+    <w:p>
+      <w:pPr>
+        <w:pStyle w:val="ListParagraph"/>
+        <w:spacing w:after="30"/>
+        <w:ind w:left="255" w:hanging="142"/>
+      </w:pPr>
+      <w:r>
+        <w:t xml:space="preserve">• Testicule : même zone réflexe que l’ovaire dans la cartographie ROP, au bord antérieur du talon, à l’aplomb des quatrième et </w:t>
+      </w:r>
+      <w:proofErr w:type="gramStart"/>
+      <w:r>
+        <w:t>cinquième orteils</w:t>
+      </w:r>
+      <w:proofErr w:type="gramEnd"/>
+      <w:r>
+        <w:t>.</w:t>
+      </w:r>
+    </w:p>
+    <w:p>
+      <w:pPr>
+        <w:pStyle w:val="ListParagraph"/>
+        <w:spacing w:after="30"/>
+        <w:ind w:left="255" w:hanging="142"/>
+      </w:pPr>
+      <w:r>
+        <w:t>• Épididyme et conduit déférent : à intégrer dans la continuité du territoire testiculaire et du cordon spermatique selon les figures de la méthode.</w:t>
+      </w:r>
+    </w:p>
+    <w:p>
+      <w:pPr>
+        <w:pStyle w:val="ListParagraph"/>
+        <w:spacing w:after="30"/>
+        <w:ind w:left="255" w:hanging="142"/>
+      </w:pPr>
+      <w:r>
+        <w:t xml:space="preserve">• Canal inguinal, cordon spermatique et muscle crémaster : interligne </w:t>
+      </w:r>
+      <w:proofErr w:type="spellStart"/>
+      <w:r>
+        <w:t>tibio</w:t>
+      </w:r>
+      <w:proofErr w:type="spellEnd"/>
+      <w:r>
+        <w:t>-tarsien antérieur.</w:t>
+      </w:r>
+    </w:p>
+    <w:p>
+      <w:pPr>
+        <w:pStyle w:val="ListParagraph"/>
+        <w:spacing w:after="30"/>
+        <w:ind w:left="255" w:hanging="142"/>
+      </w:pPr>
+      <w:r>
+        <w:t>• Anneaux inguinaux profond et superficiel : repères associés lorsque la clinique oriente vers la région inguinale.</w:t>
+      </w:r>
+    </w:p>
+    <w:p>
+      <w:pPr>
+        <w:pStyle w:val="ListParagraph"/>
+        <w:spacing w:after="30"/>
+        <w:ind w:left="255" w:hanging="142"/>
+      </w:pPr>
+      <w:r>
+        <w:t>• Rapports vasculaires, péritonéaux et abdomino-pelviens selon le contexte.</w:t>
+      </w:r>
+    </w:p>
+    <w:p>
+      <w:pPr>
+        <w:spacing w:after="80"/>
+      </w:pPr>
+      <w:r>
+        <w:rPr>
+          <w:i/>
+          <w:color w:val="5E666A"/>
+        </w:rPr>
+        <w:t>Cf. chapitre 17 — Cavité pelvienne pour l’environnement régional ; cf. chapitre 19 pour le repère cartographique commun avec l’ovaire.</w:t>
+      </w:r>
+    </w:p>
+    <w:p>
+      <w:pPr>
+        <w:pStyle w:val="Heading3"/>
+      </w:pPr>
+      <w:r>
+        <w:lastRenderedPageBreak/>
+        <w:t>11.1.4. Niveau 4 — Intégration viscéro-somatique et viscéro-émotionnelle</w:t>
+      </w:r>
+    </w:p>
+    <w:p>
+      <w:r>
+        <w:t>Le Niveau 4 associe les convergences somatiques des territoires génitaux et l’intégration centrale de la sexualité, de la douleur et du vécu corporel.</w:t>
+      </w:r>
+    </w:p>
+    <w:p>
+      <w:r>
+        <w:t>Versant viscéro-somatique :</w:t>
+      </w:r>
+    </w:p>
+    <w:p>
+      <w:pPr>
+        <w:pStyle w:val="ListParagraph"/>
+        <w:spacing w:after="30"/>
+        <w:ind w:left="255" w:hanging="142"/>
+      </w:pPr>
+      <w:r>
+        <w:t>• Régions thoraco-lombaire et lombo-inguinale selon les afférences concernées.</w:t>
+      </w:r>
+    </w:p>
+    <w:p>
+      <w:pPr>
+        <w:pStyle w:val="ListParagraph"/>
+        <w:spacing w:after="30"/>
+        <w:ind w:left="255" w:hanging="142"/>
+      </w:pPr>
+      <w:r>
+        <w:t>• Nerf génito-fémoral et territoire crémastérien lorsque pertinent.</w:t>
+      </w:r>
+    </w:p>
+    <w:p>
+      <w:pPr>
+        <w:pStyle w:val="ListParagraph"/>
+        <w:spacing w:after="30"/>
+        <w:ind w:left="255" w:hanging="142"/>
+      </w:pPr>
+      <w:r>
+        <w:t>• Nerf ilio-inguinal et région inguino-scrotale selon le tableau clinique.</w:t>
+      </w:r>
+    </w:p>
+    <w:p>
+      <w:pPr>
+        <w:pStyle w:val="ListParagraph"/>
+        <w:spacing w:after="30"/>
+        <w:ind w:left="255" w:hanging="142"/>
+      </w:pPr>
+      <w:r>
+        <w:t>• Périnée et nerf pudendal pour les territoires génitaux externes et sphinctériens.</w:t>
+      </w:r>
+    </w:p>
+    <w:p>
+      <w:pPr>
+        <w:pStyle w:val="ListParagraph"/>
+        <w:spacing w:after="30"/>
+        <w:ind w:left="255" w:hanging="142"/>
+      </w:pPr>
+      <w:r>
+        <w:t>• Bassin, sacrum et chaînes musculaires associées lorsque des douleurs projetées ou des tensions régionales sont présentes.</w:t>
+      </w:r>
+    </w:p>
+    <w:p>
+      <w:r>
+        <w:t>Versant viscéro-émotionnel — Axe cerveau-sphère génitale masculine :</w:t>
+      </w:r>
+    </w:p>
+    <w:p>
+      <w:r>
+        <w:t>La sexualité, l’image corporelle, la fertilité, la douleur, le vieillissement, le stress et l’anxiété de performance peuvent modifier la perception des symptômes et interagir avec les réseaux autonomes, neuroendocriniens et émotionnels. Ces facteurs ne définissent pas une « personnalité génitale » masculine.</w:t>
+      </w:r>
+    </w:p>
+    <w:p>
+      <w:pPr>
+        <w:spacing w:after="80"/>
+      </w:pPr>
+      <w:r>
+        <w:rPr>
+          <w:i/>
+          <w:color w:val="5E666A"/>
+        </w:rPr>
+        <w:t>Cf. chapitre 3 — Système nerveux central pour les réseaux centraux et cortico-limbiques ; cf. section 10 « Relations viscéro-émotionnelles » du présent chapitre.</w:t>
+      </w:r>
+    </w:p>
+    <w:p>
+      <w:pPr>
         <w:pStyle w:val="EncadreROP"/>
-        <w:shd w:fill="F3EEE4"/>
+        <w:shd w:val="clear" w:color="auto" w:fill="F3EEE4"/>
         <w:spacing w:before="80" w:after="100"/>
         <w:ind w:left="142" w:right="142"/>
       </w:pPr>
       <w:r>
-        <w:rPr>
-          <w:b/>
-        </w:rPr>
-        <w:t xml:space="preserve">INTÉRÊT EN ROP — </w:t>
-      </w:r>
-      <w:r>
-        <w:t>Le Niveau 2 vise ici les voies autonomes et vasculo-nerveuses associées aux gonades et aux voies spermatiques, sans réduire leur physiologie à une opposition simpliste entre sympathique et parasympathique.</w:t>
-      </w:r>
-    </w:p>
-    <w:p>
-      <w:pPr>
-        <w:pStyle w:val="Titre3"/>
-        <w:keepNext/>
-      </w:pPr>
-      <w:r>
-        <w:t>11.1.3. Niveau 3 — Régulation viscérale loco-régionale</w:t>
-      </w:r>
-    </w:p>
-    <w:p>
-      <w:r>
-        <w:rPr>
-          <w:i w:val="0"/>
-        </w:rPr>
-        <w:t>Le Niveau 3 rassemble la cartographie des testicules, du cordon spermatique et du canal inguinal, ainsi que leurs rapports régionaux.</w:t>
-      </w:r>
-    </w:p>
-    <w:p>
-      <w:pPr>
-        <w:pStyle w:val="Paragraphedeliste"/>
+        <w:t>INTÉRÊT EN ROP — Le Niveau 4 permet d’intégrer le contexte somatique et émotionnel sans attribuer automatiquement un symptôme génital à une origine psychologique.</w:t>
+      </w:r>
+    </w:p>
+    <w:p>
+      <w:pPr>
+        <w:pStyle w:val="Heading2"/>
+      </w:pPr>
+      <w:r>
+        <w:t>11.2. Prostate, vésicules séminales et voies urinaires associées</w:t>
+      </w:r>
+    </w:p>
+    <w:p>
+      <w:pPr>
+        <w:pStyle w:val="Heading3"/>
+      </w:pPr>
+      <w:r>
+        <w:t>11.2.1. Niveau 1 — Régulation des centres supérieurs</w:t>
+      </w:r>
+    </w:p>
+    <w:p>
+      <w:r>
+        <w:t>La prostate est sensible au contexte hormonal et s’inscrit dans la régulation générale de l’axe hypothalamo-hypophysaire-gonadique. Le Niveau 1 peut être retenu lorsque le tableau associe stress, troubles du sommeil, anxiété, symptômes sexuels ou dysrégulation générale.</w:t>
+      </w:r>
+    </w:p>
+    <w:p>
+      <w:pPr>
+        <w:pStyle w:val="ListParagraph"/>
         <w:spacing w:after="30"/>
         <w:ind w:left="255" w:hanging="142"/>
       </w:pPr>
       <w:r>
-        <w:t xml:space="preserve">• </w:t>
-      </w:r>
-      <w:r>
-        <w:t>Testicule : même zone réflexe que l’ovaire dans la cartographie ROP, au bord antérieur du talon, à l’aplomb des quatrième et cinquième orteils (figures 20.11 et 19.8).</w:t>
-      </w:r>
-    </w:p>
-    <w:p>
-      <w:pPr>
-        <w:pStyle w:val="Paragraphedeliste"/>
+        <w:t>• Zones réflexes occipitales.</w:t>
+      </w:r>
+    </w:p>
+    <w:p>
+      <w:pPr>
+        <w:pStyle w:val="ListParagraph"/>
         <w:spacing w:after="30"/>
         <w:ind w:left="255" w:hanging="142"/>
       </w:pPr>
       <w:r>
-        <w:t xml:space="preserve">• </w:t>
-      </w:r>
-      <w:r>
-        <w:t>Épididyme et conduit déférent : à intégrer dans la continuité du territoire testiculaire et du cordon spermatique selon les figures de la méthode.</w:t>
-      </w:r>
-    </w:p>
-    <w:p>
-      <w:pPr>
-        <w:pStyle w:val="Paragraphedeliste"/>
+        <w:t>• Tronc cérébral et centres d’intégration.</w:t>
+      </w:r>
+    </w:p>
+    <w:p>
+      <w:pPr>
+        <w:pStyle w:val="ListParagraph"/>
         <w:spacing w:after="30"/>
         <w:ind w:left="255" w:hanging="142"/>
       </w:pPr>
       <w:r>
-        <w:t xml:space="preserve">• </w:t>
-      </w:r>
-      <w:r>
-        <w:t>Canal inguinal, cordon spermatique et muscle crémaster : interligne tibio-tarsien antérieur (figures 19.4 et 20.12).</w:t>
-      </w:r>
-    </w:p>
-    <w:p>
-      <w:pPr>
-        <w:pStyle w:val="Paragraphedeliste"/>
+        <w:t>• Diencéphale, notamment hypothalamus.</w:t>
+      </w:r>
+    </w:p>
+    <w:p>
+      <w:pPr>
+        <w:pStyle w:val="ListParagraph"/>
         <w:spacing w:after="30"/>
         <w:ind w:left="255" w:hanging="142"/>
       </w:pPr>
       <w:r>
-        <w:t xml:space="preserve">• </w:t>
-      </w:r>
-      <w:r>
-        <w:t>Anneaux inguinaux profond et superficiel : repères associés lorsque la clinique oriente vers la région inguinale.</w:t>
-      </w:r>
-    </w:p>
-    <w:p>
-      <w:pPr>
-        <w:pStyle w:val="Paragraphedeliste"/>
+        <w:t>• Hypophyse et axe hypothalamo-hypophysaire.</w:t>
+      </w:r>
+    </w:p>
+    <w:p>
+      <w:pPr>
+        <w:pStyle w:val="ListParagraph"/>
         <w:spacing w:after="30"/>
         <w:ind w:left="255" w:hanging="142"/>
       </w:pPr>
       <w:r>
-        <w:t xml:space="preserve">• </w:t>
-      </w:r>
-      <w:r>
-        <w:t>Rapports vasculaires, péritonéaux et abdomino-pelviens selon le contexte.</w:t>
+        <w:t>• Environnement neuro-méningé dans le modèle ROP.</w:t>
       </w:r>
     </w:p>
     <w:p>
@@ -2824,130 +2962,82 @@
           <w:i/>
           <w:color w:val="5E666A"/>
         </w:rPr>
-        <w:t>Cf. chapitre 17 — Cavité pelvienne pour l’environnement régional ; cf. chapitre 19 pour le repère cartographique commun avec l’ovaire.</w:t>
+        <w:t>Cf. chapitre 3 — Système nerveux central.</w:t>
       </w:r>
     </w:p>
     <w:p>
       <w:pPr>
         <w:pStyle w:val="EncadreROP"/>
-        <w:shd w:fill="F3EEE4"/>
+        <w:shd w:val="clear" w:color="auto" w:fill="F3EEE4"/>
         <w:spacing w:before="80" w:after="100"/>
         <w:ind w:left="142" w:right="142"/>
       </w:pPr>
       <w:r>
-        <w:rPr>
-          <w:b/>
-        </w:rPr>
-        <w:t xml:space="preserve">INTÉRÊT EN ROP — </w:t>
-      </w:r>
-      <w:r>
-        <w:t>Le Niveau 3 conserve les repères historiques de la cartographie ROP tout en les replaçant dans leur environnement anatomique. Une sensibilité d’une zone réflexe ne constitue pas un diagnostic de varicocèle, hernie, torsion ou pathologie testiculaire.</w:t>
-      </w:r>
-    </w:p>
-    <w:p>
-      <w:pPr>
-        <w:pStyle w:val="Titre3"/>
-        <w:keepNext/>
-      </w:pPr>
-      <w:r>
-        <w:t>11.1.4. Niveau 4 — Intégration viscéro-somatique et viscéro-émotionnelle</w:t>
-      </w:r>
-    </w:p>
-    <w:p>
-      <w:r>
-        <w:rPr>
-          <w:i w:val="0"/>
-        </w:rPr>
-        <w:t>Le Niveau 4 associe les convergences somatiques des territoires génitaux et l’intégration centrale de la sexualité, de la douleur et du vécu corporel.</w:t>
-      </w:r>
-    </w:p>
-    <w:p>
-      <w:r>
-        <w:rPr>
-          <w:i w:val="0"/>
-        </w:rPr>
-        <w:t>Versant viscéro-somatique :</w:t>
-      </w:r>
-    </w:p>
-    <w:p>
-      <w:pPr>
-        <w:pStyle w:val="Paragraphedeliste"/>
+        <w:t>INTÉRÊT EN ROP — Le Niveau 1 accompagne la régulation générale et le contexte neuroendocrinien ; il ne constitue pas une action directe sur le volume prostatique ou les concentrations hormonales.</w:t>
+      </w:r>
+    </w:p>
+    <w:p>
+      <w:pPr>
+        <w:pStyle w:val="Heading3"/>
+      </w:pPr>
+      <w:r>
+        <w:t>11.2.2. Niveau 2 — Régulation neuro-végétative et adaptation</w:t>
+      </w:r>
+    </w:p>
+    <w:p>
+      <w:r>
+        <w:t>La prostate, les vésicules séminales, le col vésical et les voies génitales pelviennes dépendent d’un réseau autonome mixte organisé autour des plexus hypogastriques.</w:t>
+      </w:r>
+    </w:p>
+    <w:p>
+      <w:pPr>
+        <w:pStyle w:val="ListParagraph"/>
         <w:spacing w:after="30"/>
         <w:ind w:left="255" w:hanging="142"/>
       </w:pPr>
       <w:r>
-        <w:t xml:space="preserve">• </w:t>
-      </w:r>
-      <w:r>
-        <w:t>Régions thoraco-lombaire et lombo-inguinale selon les afférences concernées.</w:t>
-      </w:r>
-    </w:p>
-    <w:p>
-      <w:pPr>
-        <w:pStyle w:val="Paragraphedeliste"/>
+        <w:t>• Sympathique thoraco-lombaire : territoire approximatif T11-L2 dans la lecture clinique.</w:t>
+      </w:r>
+    </w:p>
+    <w:p>
+      <w:pPr>
+        <w:pStyle w:val="ListParagraph"/>
         <w:spacing w:after="30"/>
         <w:ind w:left="255" w:hanging="142"/>
       </w:pPr>
       <w:r>
-        <w:t xml:space="preserve">• </w:t>
-      </w:r>
-      <w:r>
-        <w:t>Nerf génito-fémoral et territoire crémastérien lorsque pertinent.</w:t>
-      </w:r>
-    </w:p>
-    <w:p>
-      <w:pPr>
-        <w:pStyle w:val="Paragraphedeliste"/>
+        <w:t>• Plexus hypogastrique supérieur et nerfs hypogastriques.</w:t>
+      </w:r>
+    </w:p>
+    <w:p>
+      <w:pPr>
+        <w:pStyle w:val="ListParagraph"/>
         <w:spacing w:after="30"/>
         <w:ind w:left="255" w:hanging="142"/>
       </w:pPr>
       <w:r>
-        <w:t xml:space="preserve">• </w:t>
-      </w:r>
-      <w:r>
-        <w:t>Nerf ilio-inguinal et région inguino-scrotale selon le tableau clinique.</w:t>
-      </w:r>
-    </w:p>
-    <w:p>
-      <w:pPr>
-        <w:pStyle w:val="Paragraphedeliste"/>
+        <w:t>• Parasympathique pelvien S2-S4.</w:t>
+      </w:r>
+    </w:p>
+    <w:p>
+      <w:pPr>
+        <w:pStyle w:val="ListParagraph"/>
         <w:spacing w:after="30"/>
         <w:ind w:left="255" w:hanging="142"/>
       </w:pPr>
       <w:r>
-        <w:t xml:space="preserve">• </w:t>
-      </w:r>
-      <w:r>
-        <w:t>Périnée et nerf pudendal pour les territoires génitaux externes et sphinctériens.</w:t>
-      </w:r>
-    </w:p>
-    <w:p>
-      <w:pPr>
-        <w:pStyle w:val="Paragraphedeliste"/>
+        <w:lastRenderedPageBreak/>
+        <w:t>• Plexus hypogastrique inférieur, carrefour autonome majeur de la cavité pelvienne.</w:t>
+      </w:r>
+    </w:p>
+    <w:p>
+      <w:pPr>
+        <w:pStyle w:val="ListParagraph"/>
         <w:spacing w:after="30"/>
         <w:ind w:left="255" w:hanging="142"/>
       </w:pPr>
       <w:r>
-        <w:t xml:space="preserve">• </w:t>
-      </w:r>
-      <w:r>
-        <w:t>Bassin, sacrum et chaînes musculaires associées lorsque des douleurs projetées ou des tensions régionales sont présentes.</w:t>
-      </w:r>
-    </w:p>
-    <w:p>
-      <w:r>
-        <w:rPr>
-          <w:i w:val="0"/>
-        </w:rPr>
-        <w:t>Versant viscéro-émotionnel — Axe cerveau-sphère génitale masculine :</w:t>
-      </w:r>
-    </w:p>
-    <w:p>
-      <w:r>
-        <w:rPr>
-          <w:i w:val="0"/>
-        </w:rPr>
-        <w:t>La sexualité, l’image corporelle, la fertilité, la douleur, le vieillissement, le stress et l’anxiété de performance peuvent modifier la perception des symptômes et interagir avec les réseaux autonomes, neuroendocriniens et émotionnels. Ces facteurs ne définissent pas une « personnalité génitale » masculine.</w:t>
+        <w:t>• Coordination avec la vessie, l’urètre et les fonctions sexuelles selon le symptôme.</w:t>
       </w:r>
     </w:p>
     <w:p>
@@ -2959,115 +3049,91 @@
           <w:i/>
           <w:color w:val="5E666A"/>
         </w:rPr>
-        <w:t>Cf. chapitre 3 — Système nerveux central pour les réseaux centraux et cortico-limbiques ; cf. section 10 « Relations viscéro-émotionnelles » du présent chapitre.</w:t>
+        <w:t>Cf. chapitre 4 — Système nerveux autonome, notamment les sections « Parasympathique pelvien », « Sympathique viscéro-moteur » et « Plexus préviscéral pelvien » ; cf. chapitre 18 — Vessie.</w:t>
       </w:r>
     </w:p>
     <w:p>
       <w:pPr>
         <w:pStyle w:val="EncadreROP"/>
-        <w:shd w:fill="F3EEE4"/>
+        <w:shd w:val="clear" w:color="auto" w:fill="F3EEE4"/>
         <w:spacing w:before="80" w:after="100"/>
         <w:ind w:left="142" w:right="142"/>
       </w:pPr>
       <w:r>
-        <w:rPr>
-          <w:b/>
-        </w:rPr>
-        <w:t xml:space="preserve">INTÉRÊT EN ROP — </w:t>
-      </w:r>
-      <w:r>
-        <w:t>Le Niveau 4 permet d’intégrer le contexte somatique et émotionnel sans attribuer automatiquement un symptôme génital à une origine psychologique.</w:t>
-      </w:r>
-    </w:p>
-    <w:p>
-      <w:pPr>
-        <w:pStyle w:val="Titre2"/>
-        <w:keepNext/>
-      </w:pPr>
-      <w:r>
-        <w:t>11.2. Prostate, vésicules séminales et voies urinaires associées</w:t>
-      </w:r>
-    </w:p>
-    <w:p>
-      <w:pPr>
-        <w:pStyle w:val="Titre3"/>
-        <w:keepNext/>
-      </w:pPr>
-      <w:r>
-        <w:t>11.2.1. Niveau 1 — Régulation des centres supérieurs</w:t>
-      </w:r>
-    </w:p>
-    <w:p>
-      <w:r>
-        <w:rPr>
-          <w:i w:val="0"/>
-        </w:rPr>
-        <w:t>La prostate est sensible au contexte hormonal et s’inscrit dans la régulation générale de l’axe hypothalamo-hypophysaire-gonadique. Le Niveau 1 peut être retenu lorsque le tableau associe stress, troubles du sommeil, anxiété, symptômes sexuels ou dysrégulation générale.</w:t>
-      </w:r>
-    </w:p>
-    <w:p>
-      <w:pPr>
-        <w:pStyle w:val="Paragraphedeliste"/>
+        <w:t>INTÉRÊT EN ROP — Le Niveau 2 vise à accompagner l’organisation autonome régionale sans chercher à stimuler isolément le sympathique ou le parasympathique.</w:t>
+      </w:r>
+    </w:p>
+    <w:p>
+      <w:pPr>
+        <w:pStyle w:val="Heading3"/>
+      </w:pPr>
+      <w:r>
+        <w:t>11.2.3. Niveau 3 — Régulation viscérale loco-régionale</w:t>
+      </w:r>
+    </w:p>
+    <w:p>
+      <w:r>
+        <w:t>Le Niveau 3 regroupe le cœur de la cartographie prostatique et son environnement pelvien immédiat.</w:t>
+      </w:r>
+    </w:p>
+    <w:p>
+      <w:pPr>
+        <w:pStyle w:val="ListParagraph"/>
         <w:spacing w:after="30"/>
         <w:ind w:left="255" w:hanging="142"/>
       </w:pPr>
       <w:r>
-        <w:t xml:space="preserve">• </w:t>
-      </w:r>
-      <w:r>
-        <w:t>Zones réflexes occipitales.</w:t>
-      </w:r>
-    </w:p>
-    <w:p>
-      <w:pPr>
-        <w:pStyle w:val="Paragraphedeliste"/>
+        <w:t>• Cavité pelvienne et périnée.</w:t>
+      </w:r>
+    </w:p>
+    <w:p>
+      <w:pPr>
+        <w:pStyle w:val="ListParagraph"/>
         <w:spacing w:after="30"/>
         <w:ind w:left="255" w:hanging="142"/>
       </w:pPr>
       <w:r>
-        <w:t xml:space="preserve">• </w:t>
-      </w:r>
-      <w:r>
-        <w:t>Tronc cérébral et centres d’intégration.</w:t>
-      </w:r>
-    </w:p>
-    <w:p>
-      <w:pPr>
-        <w:pStyle w:val="Paragraphedeliste"/>
+        <w:t>• Prostate, vésicules séminales et partie moyenne du plexus hypogastrique inférieur : petite dépression en avant de l’articulation sacro-coccygienne.</w:t>
+      </w:r>
+    </w:p>
+    <w:p>
+      <w:pPr>
+        <w:pStyle w:val="ListParagraph"/>
         <w:spacing w:after="30"/>
         <w:ind w:left="255" w:hanging="142"/>
       </w:pPr>
       <w:r>
-        <w:t xml:space="preserve">• </w:t>
-      </w:r>
-      <w:r>
-        <w:t>Diencéphale, notamment hypothalamus.</w:t>
-      </w:r>
-    </w:p>
-    <w:p>
-      <w:pPr>
-        <w:pStyle w:val="Paragraphedeliste"/>
+        <w:t>• Urètre prostatique et col vésical selon les repères de la cartographie pelvienne.</w:t>
+      </w:r>
+    </w:p>
+    <w:p>
+      <w:pPr>
+        <w:pStyle w:val="ListParagraph"/>
         <w:spacing w:after="30"/>
         <w:ind w:left="255" w:hanging="142"/>
       </w:pPr>
       <w:r>
-        <w:t xml:space="preserve">• </w:t>
-      </w:r>
-      <w:r>
-        <w:t>Hypophyse et axe hypothalamo-hypophysaire.</w:t>
-      </w:r>
-    </w:p>
-    <w:p>
-      <w:pPr>
-        <w:pStyle w:val="Paragraphedeliste"/>
+        <w:t>• Vessie, notamment lorsque les symptômes mictionnels sont associés.</w:t>
+      </w:r>
+    </w:p>
+    <w:p>
+      <w:pPr>
+        <w:pStyle w:val="ListParagraph"/>
         <w:spacing w:after="30"/>
         <w:ind w:left="255" w:hanging="142"/>
       </w:pPr>
       <w:r>
-        <w:t xml:space="preserve">• </w:t>
-      </w:r>
-      <w:r>
-        <w:t>Environnement neuro-méningé dans le modèle ROP.</w:t>
+        <w:t>• Plancher pelvien, symphyse pubienne et structures de soutien de la loge prostatique selon les tests.</w:t>
+      </w:r>
+    </w:p>
+    <w:p>
+      <w:pPr>
+        <w:pStyle w:val="ListParagraph"/>
+        <w:spacing w:after="30"/>
+        <w:ind w:left="255" w:hanging="142"/>
+      </w:pPr>
+      <w:r>
+        <w:t>• Rectum et rapports postérieurs lorsqu’ils participent au tableau loco-régional.</w:t>
       </w:r>
     </w:p>
     <w:p>
@@ -3079,106 +3145,96 @@
           <w:i/>
           <w:color w:val="5E666A"/>
         </w:rPr>
-        <w:t>Cf. chapitre 3 — Système nerveux central.</w:t>
+        <w:t>Cf. chapitre 17 — Cavité pelvienne, Niveau 3 : Régulation viscérale loco-régionale ; cf. chapitre 18 — Vessie.</w:t>
       </w:r>
     </w:p>
     <w:p>
       <w:pPr>
         <w:pStyle w:val="EncadreROP"/>
-        <w:shd w:fill="F3EEE4"/>
+        <w:shd w:val="clear" w:color="auto" w:fill="F3EEE4"/>
         <w:spacing w:before="80" w:after="100"/>
         <w:ind w:left="142" w:right="142"/>
       </w:pPr>
       <w:r>
-        <w:rPr>
-          <w:b/>
-        </w:rPr>
-        <w:t xml:space="preserve">INTÉRÊT EN ROP — </w:t>
-      </w:r>
-      <w:r>
-        <w:t>Le Niveau 1 accompagne la régulation générale et le contexte neuroendocrinien ; il ne constitue pas une action directe sur le volume prostatique ou les concentrations hormonales.</w:t>
-      </w:r>
-    </w:p>
-    <w:p>
-      <w:pPr>
-        <w:pStyle w:val="Titre3"/>
-        <w:keepNext/>
-      </w:pPr>
-      <w:r>
-        <w:t>11.2.2. Niveau 2 — Régulation neuro-végétative et adaptation</w:t>
-      </w:r>
-    </w:p>
-    <w:p>
-      <w:r>
-        <w:rPr>
-          <w:i w:val="0"/>
-        </w:rPr>
-        <w:t>La prostate, les vésicules séminales, le col vésical et les voies génitales pelviennes dépendent d’un réseau autonome mixte organisé autour des plexus hypogastriques.</w:t>
-      </w:r>
-    </w:p>
-    <w:p>
-      <w:pPr>
-        <w:pStyle w:val="Paragraphedeliste"/>
+        <w:t>INTÉRÊT EN ROP — Le Niveau 3 replace la prostate dans son environnement pelvien. Une zone réflexe sensible constitue un repère clinique et non la preuve d’une hypertrophie, d’une congestion ou d’une lésion prostatique.</w:t>
+      </w:r>
+    </w:p>
+    <w:p>
+      <w:pPr>
+        <w:pStyle w:val="Heading3"/>
+      </w:pPr>
+      <w:r>
+        <w:t>11.2.4. Niveau 4 — Intégration viscéro-somatique et viscéro-émotionnelle</w:t>
+      </w:r>
+    </w:p>
+    <w:p>
+      <w:r>
+        <w:t>Cette rubrique remplace l’ancienne « balance cerveau limbique-prostate ». Elle associe les convergences somatiques, le plancher pelvien et l’axe cerveau-sphère génitale masculine.</w:t>
+      </w:r>
+    </w:p>
+    <w:p>
+      <w:r>
+        <w:t>Versant viscéro-somatique :</w:t>
+      </w:r>
+    </w:p>
+    <w:p>
+      <w:pPr>
+        <w:pStyle w:val="ListParagraph"/>
         <w:spacing w:after="30"/>
         <w:ind w:left="255" w:hanging="142"/>
       </w:pPr>
       <w:r>
-        <w:t xml:space="preserve">• </w:t>
-      </w:r>
-      <w:r>
-        <w:t>Sympathique thoraco-lombaire : territoire approximatif T11-L2 dans la lecture clinique.</w:t>
-      </w:r>
-    </w:p>
-    <w:p>
-      <w:pPr>
-        <w:pStyle w:val="Paragraphedeliste"/>
+        <w:t>• Nerf pudendal S2-S4 et territoires périnéaux.</w:t>
+      </w:r>
+    </w:p>
+    <w:p>
+      <w:pPr>
+        <w:pStyle w:val="ListParagraph"/>
         <w:spacing w:after="30"/>
         <w:ind w:left="255" w:hanging="142"/>
       </w:pPr>
       <w:r>
-        <w:t xml:space="preserve">• </w:t>
-      </w:r>
-      <w:r>
-        <w:t>Plexus hypogastrique supérieur et nerfs hypogastriques.</w:t>
-      </w:r>
-    </w:p>
-    <w:p>
-      <w:pPr>
-        <w:pStyle w:val="Paragraphedeliste"/>
+        <w:t>• Plancher pelvien et sphincter urétral externe.</w:t>
+      </w:r>
+    </w:p>
+    <w:p>
+      <w:pPr>
+        <w:pStyle w:val="ListParagraph"/>
         <w:spacing w:after="30"/>
         <w:ind w:left="255" w:hanging="142"/>
       </w:pPr>
       <w:r>
-        <w:t xml:space="preserve">• </w:t>
-      </w:r>
-      <w:r>
-        <w:t>Parasympathique pelvien S2-S4.</w:t>
-      </w:r>
-    </w:p>
-    <w:p>
-      <w:pPr>
-        <w:pStyle w:val="Paragraphedeliste"/>
+        <w:t>• Sacrum et coccyx.</w:t>
+      </w:r>
+    </w:p>
+    <w:p>
+      <w:pPr>
+        <w:pStyle w:val="ListParagraph"/>
         <w:spacing w:after="30"/>
         <w:ind w:left="255" w:hanging="142"/>
       </w:pPr>
       <w:r>
-        <w:t xml:space="preserve">• </w:t>
-      </w:r>
-      <w:r>
-        <w:t>Plexus hypogastrique inférieur, carrefour autonome majeur de la cavité pelvienne.</w:t>
-      </w:r>
-    </w:p>
-    <w:p>
-      <w:pPr>
-        <w:pStyle w:val="Paragraphedeliste"/>
+        <w:t>• Symphyse pubienne.</w:t>
+      </w:r>
+    </w:p>
+    <w:p>
+      <w:pPr>
+        <w:pStyle w:val="ListParagraph"/>
         <w:spacing w:after="30"/>
         <w:ind w:left="255" w:hanging="142"/>
       </w:pPr>
       <w:r>
-        <w:t xml:space="preserve">• </w:t>
-      </w:r>
-      <w:r>
-        <w:t>Coordination avec la vessie, l’urètre et les fonctions sexuelles selon le symptôme.</w:t>
+        <w:t>• Territoires lombo-sacrés et pelviens douloureux associés.</w:t>
+      </w:r>
+    </w:p>
+    <w:p>
+      <w:r>
+        <w:t>Versant viscéro-émotionnel — Axe cerveau-sphère génitale masculine :</w:t>
+      </w:r>
+    </w:p>
+    <w:p>
+      <w:r>
+        <w:t>Les symptômes urinaires ou sexuels peuvent être modulés par le stress, l’anticipation, l’anxiété, la douleur, le contexte relationnel et le vécu du vieillissement. Dans le modèle clinique ROP, l’écoute-induction peut conserver son principe — un repère prostatique et un repère central — mais elle est présentée comme une technique d’intégration fonctionnelle, et non comme une action directe sur un « cerveau limbique ».</w:t>
       </w:r>
     </w:p>
     <w:p>
@@ -3190,408 +3246,101 @@
           <w:i/>
           <w:color w:val="5E666A"/>
         </w:rPr>
-        <w:t>Cf. chapitre 4 — Système nerveux autonome, notamment les sections « Parasympathique pelvien », « Sympathique viscéro-moteur » et « Plexus préviscéral pelvien » ; cf. chapitre 18 — Vessie.</w:t>
+        <w:t>Cf. chapitre 3 — Système nerveux central pour les réseaux centraux et cortico-limbiques ; cf. section 10 « Relations viscéro-émotionnelles » du présent chapitre.</w:t>
       </w:r>
     </w:p>
     <w:p>
       <w:pPr>
         <w:pStyle w:val="EncadreROP"/>
-        <w:shd w:fill="F3EEE4"/>
+        <w:shd w:val="clear" w:color="auto" w:fill="F3EEE4"/>
         <w:spacing w:before="80" w:after="100"/>
         <w:ind w:left="142" w:right="142"/>
       </w:pPr>
       <w:r>
-        <w:rPr>
-          <w:b/>
-        </w:rPr>
-        <w:t xml:space="preserve">INTÉRÊT EN ROP — </w:t>
-      </w:r>
-      <w:r>
-        <w:t>Le Niveau 2 vise à accompagner l’organisation autonome régionale sans chercher à stimuler isolément le sympathique ou le parasympathique.</w:t>
-      </w:r>
-    </w:p>
-    <w:p>
-      <w:pPr>
-        <w:pStyle w:val="Titre3"/>
-        <w:keepNext/>
-      </w:pPr>
-      <w:r>
-        <w:t>11.2.3. Niveau 3 — Régulation viscérale loco-régionale</w:t>
-      </w:r>
-    </w:p>
-    <w:p>
-      <w:r>
-        <w:rPr>
-          <w:i w:val="0"/>
-        </w:rPr>
-        <w:t>Le Niveau 3 regroupe le cœur de la cartographie prostatique et son environnement pelvien immédiat.</w:t>
-      </w:r>
-    </w:p>
-    <w:p>
-      <w:pPr>
-        <w:pStyle w:val="Paragraphedeliste"/>
+        <w:lastRenderedPageBreak/>
+        <w:t>INTÉRÊT EN ROP — Le Niveau 4 relie le symptôme prostatique ou sexuel aux convergences somatiques et au contexte de perception et d’adaptation, sans définir de profil psychologique propre à la prostate.</w:t>
+      </w:r>
+    </w:p>
+    <w:p>
+      <w:pPr>
+        <w:pStyle w:val="Heading2"/>
+      </w:pPr>
+      <w:r>
+        <w:t>11.3. Soutiens associés selon les tests</w:t>
+      </w:r>
+    </w:p>
+    <w:p>
+      <w:r>
+        <w:t>Le foie et le rein gauche figuraient auparavant dans le « syndrome général d’adaptation ». Ils peuvent être conservés comme soutiens associés, mais ne doivent pas être considérés comme des étapes obligatoires du traitement des organes génitaux masculins.</w:t>
+      </w:r>
+    </w:p>
+    <w:p>
+      <w:pPr>
+        <w:pStyle w:val="ListParagraph"/>
         <w:spacing w:after="30"/>
         <w:ind w:left="255" w:hanging="142"/>
       </w:pPr>
       <w:r>
-        <w:t xml:space="preserve">• </w:t>
-      </w:r>
-      <w:r>
-        <w:t>Cavité pelvienne et périnée (figures 17.15, 17.16 et 17.17).</w:t>
-      </w:r>
-    </w:p>
-    <w:p>
-      <w:pPr>
-        <w:pStyle w:val="Paragraphedeliste"/>
+        <w:t>• Rein gauche et axe veineux gonadique gauche : lorsque le contexte vasculaire ou une varicocèle justifie cette lecture régionale.</w:t>
+      </w:r>
+    </w:p>
+    <w:p>
+      <w:pPr>
+        <w:pStyle w:val="ListParagraph"/>
         <w:spacing w:after="30"/>
         <w:ind w:left="255" w:hanging="142"/>
       </w:pPr>
       <w:r>
-        <w:t xml:space="preserve">• </w:t>
-      </w:r>
-      <w:r>
-        <w:t>Prostate, vésicules séminales et partie moyenne du plexus hypogastrique inférieur : petite dépression en avant de l’articulation sacro-coccygienne (figures 18.7 et 18.9).</w:t>
-      </w:r>
-    </w:p>
-    <w:p>
-      <w:pPr>
-        <w:pStyle w:val="Paragraphedeliste"/>
+        <w:t>• Foie : uniquement lorsque le contexte métabolique ou systémique est retenu par l’anamnèse et les tests.</w:t>
+      </w:r>
+    </w:p>
+    <w:p>
+      <w:pPr>
+        <w:pStyle w:val="ListParagraph"/>
         <w:spacing w:after="30"/>
         <w:ind w:left="255" w:hanging="142"/>
       </w:pPr>
       <w:r>
-        <w:t xml:space="preserve">• </w:t>
-      </w:r>
-      <w:r>
-        <w:t>Urètre prostatique et col vésical selon les repères de la cartographie pelvienne.</w:t>
-      </w:r>
-    </w:p>
-    <w:p>
-      <w:pPr>
-        <w:pStyle w:val="Paragraphedeliste"/>
+        <w:t>• Intestin et côlon : en présence de constipation, de troubles digestifs ou de contraintes pelviennes associées.</w:t>
+      </w:r>
+    </w:p>
+    <w:p>
+      <w:pPr>
+        <w:pStyle w:val="ListParagraph"/>
         <w:spacing w:after="30"/>
         <w:ind w:left="255" w:hanging="142"/>
       </w:pPr>
       <w:r>
-        <w:t xml:space="preserve">• </w:t>
-      </w:r>
-      <w:r>
-        <w:t>Vessie, notamment lorsque les symptômes mictionnels sont associés.</w:t>
-      </w:r>
-    </w:p>
-    <w:p>
-      <w:pPr>
-        <w:pStyle w:val="Paragraphedeliste"/>
+        <w:t>• Vessie : en présence de symptômes mictionnels, notamment dans l’hypertrophie bénigne de la prostate ou les syndromes pelviens.</w:t>
+      </w:r>
+    </w:p>
+    <w:p>
+      <w:pPr>
+        <w:pStyle w:val="ListParagraph"/>
         <w:spacing w:after="30"/>
         <w:ind w:left="255" w:hanging="142"/>
       </w:pPr>
       <w:r>
-        <w:t xml:space="preserve">• </w:t>
-      </w:r>
-      <w:r>
-        <w:t>Plancher pelvien, symphyse pubienne et structures de soutien de la loge prostatique selon les tests.</w:t>
-      </w:r>
-    </w:p>
-    <w:p>
-      <w:pPr>
-        <w:pStyle w:val="Paragraphedeliste"/>
-        <w:spacing w:after="30"/>
-        <w:ind w:left="255" w:hanging="142"/>
-      </w:pPr>
-      <w:r>
-        <w:t xml:space="preserve">• </w:t>
-      </w:r>
-      <w:r>
-        <w:t>Rectum et rapports postérieurs lorsqu’ils participent au tableau loco-régional.</w:t>
-      </w:r>
-    </w:p>
-    <w:p>
-      <w:pPr>
-        <w:spacing w:after="80"/>
-      </w:pPr>
-      <w:r>
-        <w:rPr>
-          <w:i/>
-          <w:color w:val="5E666A"/>
-        </w:rPr>
-        <w:t>Cf. chapitre 17 — Cavité pelvienne, Niveau 3 : Régulation viscérale loco-régionale ; cf. chapitre 18 — Vessie.</w:t>
+        <w:t>• Diaphragme et cavité abdominale : lorsque la dynamique globale du tronc et des pressions est cliniquement pertinente.</w:t>
+      </w:r>
+    </w:p>
+    <w:p>
+      <w:pPr>
+        <w:pStyle w:val="Heading2"/>
+      </w:pPr>
+      <w:r>
+        <w:t>11.4. Principe de sécurité</w:t>
       </w:r>
     </w:p>
     <w:p>
       <w:pPr>
         <w:pStyle w:val="EncadreROP"/>
-        <w:shd w:fill="F3EEE4"/>
+        <w:shd w:val="clear" w:color="auto" w:fill="F8E9E5"/>
         <w:spacing w:before="80" w:after="100"/>
         <w:ind w:left="142" w:right="142"/>
       </w:pPr>
       <w:r>
-        <w:rPr>
-          <w:b/>
-        </w:rPr>
-        <w:t xml:space="preserve">INTÉRÊT EN ROP — </w:t>
-      </w:r>
-      <w:r>
-        <w:t>Le Niveau 3 replace la prostate dans son environnement pelvien. Une zone réflexe sensible constitue un repère clinique et non la preuve d’une hypertrophie, d’une congestion ou d’une lésion prostatique.</w:t>
-      </w:r>
-    </w:p>
-    <w:p>
-      <w:pPr>
-        <w:pStyle w:val="Titre3"/>
-        <w:keepNext/>
-      </w:pPr>
-      <w:r>
-        <w:t>11.2.4. Niveau 4 — Intégration viscéro-somatique et viscéro-émotionnelle</w:t>
-      </w:r>
-    </w:p>
-    <w:p>
-      <w:r>
-        <w:rPr>
-          <w:i w:val="0"/>
-        </w:rPr>
-        <w:t>Cette rubrique remplace l’ancienne « balance cerveau limbique-prostate ». Elle associe les convergences somatiques, le plancher pelvien et l’axe cerveau-sphère génitale masculine.</w:t>
-      </w:r>
-    </w:p>
-    <w:p>
-      <w:r>
-        <w:rPr>
-          <w:i w:val="0"/>
-        </w:rPr>
-        <w:t>Versant viscéro-somatique :</w:t>
-      </w:r>
-    </w:p>
-    <w:p>
-      <w:pPr>
-        <w:pStyle w:val="Paragraphedeliste"/>
-        <w:spacing w:after="30"/>
-        <w:ind w:left="255" w:hanging="142"/>
-      </w:pPr>
-      <w:r>
-        <w:t xml:space="preserve">• </w:t>
-      </w:r>
-      <w:r>
-        <w:t>Nerf pudendal S2-S4 et territoires périnéaux.</w:t>
-      </w:r>
-    </w:p>
-    <w:p>
-      <w:pPr>
-        <w:pStyle w:val="Paragraphedeliste"/>
-        <w:spacing w:after="30"/>
-        <w:ind w:left="255" w:hanging="142"/>
-      </w:pPr>
-      <w:r>
-        <w:t xml:space="preserve">• </w:t>
-      </w:r>
-      <w:r>
-        <w:t>Plancher pelvien et sphincter urétral externe.</w:t>
-      </w:r>
-    </w:p>
-    <w:p>
-      <w:pPr>
-        <w:pStyle w:val="Paragraphedeliste"/>
-        <w:spacing w:after="30"/>
-        <w:ind w:left="255" w:hanging="142"/>
-      </w:pPr>
-      <w:r>
-        <w:t xml:space="preserve">• </w:t>
-      </w:r>
-      <w:r>
-        <w:t>Sacrum et coccyx.</w:t>
-      </w:r>
-    </w:p>
-    <w:p>
-      <w:pPr>
-        <w:pStyle w:val="Paragraphedeliste"/>
-        <w:spacing w:after="30"/>
-        <w:ind w:left="255" w:hanging="142"/>
-      </w:pPr>
-      <w:r>
-        <w:t xml:space="preserve">• </w:t>
-      </w:r>
-      <w:r>
-        <w:t>Symphyse pubienne.</w:t>
-      </w:r>
-    </w:p>
-    <w:p>
-      <w:pPr>
-        <w:pStyle w:val="Paragraphedeliste"/>
-        <w:spacing w:after="30"/>
-        <w:ind w:left="255" w:hanging="142"/>
-      </w:pPr>
-      <w:r>
-        <w:t xml:space="preserve">• </w:t>
-      </w:r>
-      <w:r>
-        <w:t>Territoires lombo-sacrés et pelviens douloureux associés.</w:t>
-      </w:r>
-    </w:p>
-    <w:p>
-      <w:r>
-        <w:rPr>
-          <w:i w:val="0"/>
-        </w:rPr>
-        <w:t>Versant viscéro-émotionnel — Axe cerveau-sphère génitale masculine :</w:t>
-      </w:r>
-    </w:p>
-    <w:p>
-      <w:r>
-        <w:rPr>
-          <w:i w:val="0"/>
-        </w:rPr>
-        <w:t>Les symptômes urinaires ou sexuels peuvent être modulés par le stress, l’anticipation, l’anxiété, la douleur, le contexte relationnel et le vécu du vieillissement. Dans le modèle clinique ROP, l’écoute-induction peut conserver son principe — un repère prostatique et un repère central — mais elle est présentée comme une technique d’intégration fonctionnelle, et non comme une action directe sur un « cerveau limbique ».</w:t>
-      </w:r>
-    </w:p>
-    <w:p>
-      <w:pPr>
-        <w:spacing w:after="80"/>
-      </w:pPr>
-      <w:r>
-        <w:rPr>
-          <w:i/>
-          <w:color w:val="5E666A"/>
-        </w:rPr>
-        <w:t>Cf. chapitre 3 — Système nerveux central pour les réseaux centraux et cortico-limbiques ; cf. section 10 « Relations viscéro-émotionnelles » du présent chapitre.</w:t>
-      </w:r>
-    </w:p>
-    <w:p>
-      <w:pPr>
-        <w:pStyle w:val="EncadreROP"/>
-        <w:shd w:fill="F3EEE4"/>
-        <w:spacing w:before="80" w:after="100"/>
-        <w:ind w:left="142" w:right="142"/>
-      </w:pPr>
-      <w:r>
-        <w:rPr>
-          <w:b/>
-        </w:rPr>
-        <w:t xml:space="preserve">INTÉRÊT EN ROP — </w:t>
-      </w:r>
-      <w:r>
-        <w:t>Le Niveau 4 relie le symptôme prostatique ou sexuel aux convergences somatiques et au contexte de perception et d’adaptation, sans définir de profil psychologique propre à la prostate.</w:t>
-      </w:r>
-    </w:p>
-    <w:p>
-      <w:pPr>
-        <w:pStyle w:val="Titre2"/>
-        <w:keepNext/>
-      </w:pPr>
-      <w:r>
-        <w:t>11.3. Soutiens associés selon les tests</w:t>
-      </w:r>
-    </w:p>
-    <w:p>
-      <w:r>
-        <w:rPr>
-          <w:i w:val="0"/>
-        </w:rPr>
-        <w:t>Le foie et le rein gauche figuraient auparavant dans le « syndrome général d’adaptation ». Ils peuvent être conservés comme soutiens associés, mais ne doivent pas être considérés comme des étapes obligatoires du traitement des organes génitaux masculins.</w:t>
-      </w:r>
-    </w:p>
-    <w:p>
-      <w:pPr>
-        <w:pStyle w:val="Paragraphedeliste"/>
-        <w:spacing w:after="30"/>
-        <w:ind w:left="255" w:hanging="142"/>
-      </w:pPr>
-      <w:r>
-        <w:t xml:space="preserve">• </w:t>
-      </w:r>
-      <w:r>
-        <w:t>Rein gauche et axe veineux gonadique gauche : lorsque le contexte vasculaire ou une varicocèle justifie cette lecture régionale (figures 16.13 et 16.14).</w:t>
-      </w:r>
-    </w:p>
-    <w:p>
-      <w:pPr>
-        <w:pStyle w:val="Paragraphedeliste"/>
-        <w:spacing w:after="30"/>
-        <w:ind w:left="255" w:hanging="142"/>
-      </w:pPr>
-      <w:r>
-        <w:t xml:space="preserve">• </w:t>
-      </w:r>
-      <w:r>
-        <w:t>Foie : uniquement lorsque le contexte métabolique ou systémique est retenu par l’anamnèse et les tests (figures 11.10 et 11.11).</w:t>
-      </w:r>
-    </w:p>
-    <w:p>
-      <w:pPr>
-        <w:pStyle w:val="Paragraphedeliste"/>
-        <w:spacing w:after="30"/>
-        <w:ind w:left="255" w:hanging="142"/>
-      </w:pPr>
-      <w:r>
-        <w:t xml:space="preserve">• </w:t>
-      </w:r>
-      <w:r>
-        <w:t>Intestin et côlon : en présence de constipation, de troubles digestifs ou de contraintes pelviennes associées.</w:t>
-      </w:r>
-    </w:p>
-    <w:p>
-      <w:pPr>
-        <w:pStyle w:val="Paragraphedeliste"/>
-        <w:spacing w:after="30"/>
-        <w:ind w:left="255" w:hanging="142"/>
-      </w:pPr>
-      <w:r>
-        <w:t xml:space="preserve">• </w:t>
-      </w:r>
-      <w:r>
-        <w:t>Vessie : en présence de symptômes mictionnels, notamment dans l’hypertrophie bénigne de la prostate ou les syndromes pelviens.</w:t>
-      </w:r>
-    </w:p>
-    <w:p>
-      <w:pPr>
-        <w:pStyle w:val="Paragraphedeliste"/>
-        <w:spacing w:after="30"/>
-        <w:ind w:left="255" w:hanging="142"/>
-      </w:pPr>
-      <w:r>
-        <w:t xml:space="preserve">• </w:t>
-      </w:r>
-      <w:r>
-        <w:t>Diaphragme et cavité abdominale : lorsque la dynamique globale du tronc et des pressions est cliniquement pertinente.</w:t>
-      </w:r>
-    </w:p>
-    <w:p>
-      <w:pPr>
-        <w:pStyle w:val="EncadreROP"/>
-        <w:shd w:fill="F3EEE4"/>
-        <w:spacing w:before="80" w:after="100"/>
-        <w:ind w:left="142" w:right="142"/>
-      </w:pPr>
-      <w:r>
-        <w:rPr>
-          <w:b/>
-        </w:rPr>
-        <w:t xml:space="preserve">INTÉRÊT EN ROP — </w:t>
-      </w:r>
-      <w:r>
-        <w:t>Ces soutiens complètent le protocole lorsqu’ils sont pertinents ; ils ne remplacent pas la lecture hiérarchisée des quatre niveaux propres aux testicules, aux voies spermatiques et à la prostate.</w:t>
-      </w:r>
-    </w:p>
-    <w:p>
-      <w:pPr>
-        <w:pStyle w:val="Titre2"/>
-        <w:keepNext/>
-      </w:pPr>
-      <w:r>
-        <w:t>11.4. Principe de sécurité</w:t>
-      </w:r>
-    </w:p>
-    <w:p>
-      <w:pPr>
-        <w:pStyle w:val="EncadreROP"/>
-        <w:shd w:fill="F8E9E5"/>
-        <w:spacing w:before="80" w:after="100"/>
-        <w:ind w:left="142" w:right="142"/>
-      </w:pPr>
-      <w:r>
-        <w:rPr>
-          <w:b/>
-        </w:rPr>
-        <w:t xml:space="preserve">PRÉCAUTION — </w:t>
-      </w:r>
-      <w:r>
-        <w:t>Une zone réflexe sensible ou une modification palpatoire n’est pas un test diagnostique de torsion testiculaire, cancer, prostatite, hypertrophie bénigne de la prostate, infection, rétention urinaire ou autre pathologie uro-génitale. Toute douleur testiculaire aiguë, masse ou augmentation de volume, fièvre, hématurie, rétention urinaire, altération de l’état général ou symptôme inhabituel impose une évaluation médicale adaptée.</w:t>
+        <w:t>PRÉCAUTION — Une zone réflexe sensible ou une modification palpatoire n’est pas un test diagnostique de torsion testiculaire, cancer, prostatite, hypertrophie bénigne de la prostate, infection, rétention urinaire ou autre pathologie uro-génitale. Toute douleur testiculaire aiguë, masse ou augmentation de volume, fièvre, hématurie, rétention urinaire, altération de l’état général ou symptôme inhabituel impose une évaluation médicale adaptée.</w:t>
       </w:r>
     </w:p>
     <w:sectPr>
@@ -3605,8 +3354,8 @@
 </file>
 
 <file path=word/numbering.xml><?xml version="1.0" encoding="utf-8"?>
-<w:numbering xmlns:ve="http://schemas.openxmlformats.org/markup-compatibility/2006" xmlns:o="urn:schemas-microsoft-com:office:office" xmlns:r="http://schemas.openxmlformats.org/officeDocument/2006/relationships" xmlns:m="http://schemas.openxmlformats.org/officeDocument/2006/math" xmlns:v="urn:schemas-microsoft-com:vml" xmlns:wp="http://schemas.openxmlformats.org/drawingml/2006/wordprocessingDrawing" xmlns:w10="urn:schemas-microsoft-com:office:word" xmlns:w="http://schemas.openxmlformats.org/wordprocessingml/2006/main" xmlns:wne="http://schemas.microsoft.com/office/word/2006/wordml">
-  <w:abstractNum w:abstractNumId="0">
+<w:numbering xmlns:wpc="http://schemas.microsoft.com/office/word/2010/wordprocessingCanvas" xmlns:cx="http://schemas.microsoft.com/office/drawing/2014/chartex" xmlns:cx1="http://schemas.microsoft.com/office/drawing/2015/9/8/chartex" xmlns:cx2="http://schemas.microsoft.com/office/drawing/2015/10/21/chartex" xmlns:cx3="http://schemas.microsoft.com/office/drawing/2016/5/9/chartex" xmlns:cx4="http://schemas.microsoft.com/office/drawing/2016/5/10/chartex" xmlns:cx5="http://schemas.microsoft.com/office/drawing/2016/5/11/chartex" xmlns:cx6="http://schemas.microsoft.com/office/drawing/2016/5/12/chartex" xmlns:cx7="http://schemas.microsoft.com/office/drawing/2016/5/13/chartex" xmlns:cx8="http://schemas.microsoft.com/office/drawing/2016/5/14/chartex" xmlns:mc="http://schemas.openxmlformats.org/markup-compatibility/2006" xmlns:aink="http://schemas.microsoft.com/office/drawing/2016/ink" xmlns:am3d="http://schemas.microsoft.com/office/drawing/2017/model3d" xmlns:o="urn:schemas-microsoft-com:office:office" xmlns:oel="http://schemas.microsoft.com/office/2019/extlst" xmlns:r="http://schemas.openxmlformats.org/officeDocument/2006/relationships" xmlns:m="http://schemas.openxmlformats.org/officeDocument/2006/math" xmlns:v="urn:schemas-microsoft-com:vml" xmlns:wp14="http://schemas.microsoft.com/office/word/2010/wordprocessingDrawing" xmlns:wp="http://schemas.openxmlformats.org/drawingml/2006/wordprocessingDrawing" xmlns:w10="urn:schemas-microsoft-com:office:word" xmlns:w="http://schemas.openxmlformats.org/wordprocessingml/2006/main" xmlns:w14="http://schemas.microsoft.com/office/word/2010/wordml" xmlns:w15="http://schemas.microsoft.com/office/word/2012/wordml" xmlns:w16cex="http://schemas.microsoft.com/office/word/2018/wordml/cex" xmlns:w16cid="http://schemas.microsoft.com/office/word/2016/wordml/cid" xmlns:w16="http://schemas.microsoft.com/office/word/2018/wordml" xmlns:w16du="http://schemas.microsoft.com/office/word/2023/wordml/word16du" xmlns:w16sdtdh="http://schemas.microsoft.com/office/word/2020/wordml/sdtdatahash" xmlns:w16sdtfl="http://schemas.microsoft.com/office/word/2024/wordml/sdtformatlock" xmlns:w16se="http://schemas.microsoft.com/office/word/2015/wordml/symex" xmlns:wpg="http://schemas.microsoft.com/office/word/2010/wordprocessingGroup" xmlns:wpi="http://schemas.microsoft.com/office/word/2010/wordprocessingInk" xmlns:wne="http://schemas.microsoft.com/office/word/2006/wordml" xmlns:wps="http://schemas.microsoft.com/office/word/2010/wordprocessingShape" mc:Ignorable="w14 w15 w16se w16cid w16 w16cex w16sdtdh w16sdtfl w16du wp14">
+  <w:abstractNum w:abstractNumId="0" w15:restartNumberingAfterBreak="0">
     <w:nsid w:val="043759F7"/>
     <w:multiLevelType w:val="hybridMultilevel"/>
     <w:tmpl w:val="265871D4"/>
@@ -3719,7 +3468,7 @@
       </w:rPr>
     </w:lvl>
   </w:abstractNum>
-  <w:abstractNum w:abstractNumId="1">
+  <w:abstractNum w:abstractNumId="1" w15:restartNumberingAfterBreak="0">
     <w:nsid w:val="04D93555"/>
     <w:multiLevelType w:val="hybridMultilevel"/>
     <w:tmpl w:val="62667EA6"/>
@@ -3832,7 +3581,7 @@
       </w:rPr>
     </w:lvl>
   </w:abstractNum>
-  <w:abstractNum w:abstractNumId="2">
+  <w:abstractNum w:abstractNumId="2" w15:restartNumberingAfterBreak="0">
     <w:nsid w:val="050E0747"/>
     <w:multiLevelType w:val="hybridMultilevel"/>
     <w:tmpl w:val="4158448C"/>
@@ -3924,7 +3673,7 @@
       </w:pPr>
     </w:lvl>
   </w:abstractNum>
-  <w:abstractNum w:abstractNumId="3">
+  <w:abstractNum w:abstractNumId="3" w15:restartNumberingAfterBreak="0">
     <w:nsid w:val="07307D79"/>
     <w:multiLevelType w:val="hybridMultilevel"/>
     <w:tmpl w:val="F88A5ECA"/>
@@ -4037,7 +3786,7 @@
       </w:rPr>
     </w:lvl>
   </w:abstractNum>
-  <w:abstractNum w:abstractNumId="4">
+  <w:abstractNum w:abstractNumId="4" w15:restartNumberingAfterBreak="0">
     <w:nsid w:val="09292514"/>
     <w:multiLevelType w:val="hybridMultilevel"/>
     <w:tmpl w:val="0BDC611E"/>
@@ -4150,7 +3899,7 @@
       </w:rPr>
     </w:lvl>
   </w:abstractNum>
-  <w:abstractNum w:abstractNumId="5">
+  <w:abstractNum w:abstractNumId="5" w15:restartNumberingAfterBreak="0">
     <w:nsid w:val="0CF42DBB"/>
     <w:multiLevelType w:val="hybridMultilevel"/>
     <w:tmpl w:val="9BCC46DA"/>
@@ -4262,7 +4011,7 @@
       </w:rPr>
     </w:lvl>
   </w:abstractNum>
-  <w:abstractNum w:abstractNumId="6">
+  <w:abstractNum w:abstractNumId="6" w15:restartNumberingAfterBreak="0">
     <w:nsid w:val="0E923095"/>
     <w:multiLevelType w:val="hybridMultilevel"/>
     <w:tmpl w:val="DE60A1D8"/>
@@ -4375,7 +4124,7 @@
       </w:rPr>
     </w:lvl>
   </w:abstractNum>
-  <w:abstractNum w:abstractNumId="7">
+  <w:abstractNum w:abstractNumId="7" w15:restartNumberingAfterBreak="0">
     <w:nsid w:val="0EA74D08"/>
     <w:multiLevelType w:val="hybridMultilevel"/>
     <w:tmpl w:val="2B6672AA"/>
@@ -4488,7 +4237,7 @@
       </w:rPr>
     </w:lvl>
   </w:abstractNum>
-  <w:abstractNum w:abstractNumId="8">
+  <w:abstractNum w:abstractNumId="8" w15:restartNumberingAfterBreak="0">
     <w:nsid w:val="15C42E50"/>
     <w:multiLevelType w:val="hybridMultilevel"/>
     <w:tmpl w:val="9A927EA4"/>
@@ -4578,7 +4327,7 @@
       </w:pPr>
     </w:lvl>
   </w:abstractNum>
-  <w:abstractNum w:abstractNumId="9">
+  <w:abstractNum w:abstractNumId="9" w15:restartNumberingAfterBreak="0">
     <w:nsid w:val="15D543EB"/>
     <w:multiLevelType w:val="hybridMultilevel"/>
     <w:tmpl w:val="B3C4FC16"/>
@@ -4691,7 +4440,7 @@
       </w:rPr>
     </w:lvl>
   </w:abstractNum>
-  <w:abstractNum w:abstractNumId="10">
+  <w:abstractNum w:abstractNumId="10" w15:restartNumberingAfterBreak="0">
     <w:nsid w:val="162A0411"/>
     <w:multiLevelType w:val="hybridMultilevel"/>
     <w:tmpl w:val="A5D2EBE6"/>
@@ -4805,7 +4554,7 @@
       </w:rPr>
     </w:lvl>
   </w:abstractNum>
-  <w:abstractNum w:abstractNumId="11">
+  <w:abstractNum w:abstractNumId="11" w15:restartNumberingAfterBreak="0">
     <w:nsid w:val="1D8237B4"/>
     <w:multiLevelType w:val="hybridMultilevel"/>
     <w:tmpl w:val="6F3E1928"/>
@@ -4918,7 +4667,7 @@
       </w:rPr>
     </w:lvl>
   </w:abstractNum>
-  <w:abstractNum w:abstractNumId="12">
+  <w:abstractNum w:abstractNumId="12" w15:restartNumberingAfterBreak="0">
     <w:nsid w:val="1E915FA0"/>
     <w:multiLevelType w:val="hybridMultilevel"/>
     <w:tmpl w:val="B29A6046"/>
@@ -5031,7 +4780,7 @@
       </w:rPr>
     </w:lvl>
   </w:abstractNum>
-  <w:abstractNum w:abstractNumId="13">
+  <w:abstractNum w:abstractNumId="13" w15:restartNumberingAfterBreak="0">
     <w:nsid w:val="20E81AD4"/>
     <w:multiLevelType w:val="hybridMultilevel"/>
     <w:tmpl w:val="F33CDECE"/>
@@ -5144,7 +4893,7 @@
       </w:rPr>
     </w:lvl>
   </w:abstractNum>
-  <w:abstractNum w:abstractNumId="14">
+  <w:abstractNum w:abstractNumId="14" w15:restartNumberingAfterBreak="0">
     <w:nsid w:val="23B52046"/>
     <w:multiLevelType w:val="hybridMultilevel"/>
     <w:tmpl w:val="CEFAE73A"/>
@@ -5257,7 +5006,7 @@
       </w:rPr>
     </w:lvl>
   </w:abstractNum>
-  <w:abstractNum w:abstractNumId="15">
+  <w:abstractNum w:abstractNumId="15" w15:restartNumberingAfterBreak="0">
     <w:nsid w:val="26781012"/>
     <w:multiLevelType w:val="hybridMultilevel"/>
     <w:tmpl w:val="63901312"/>
@@ -5370,7 +5119,7 @@
       </w:rPr>
     </w:lvl>
   </w:abstractNum>
-  <w:abstractNum w:abstractNumId="16">
+  <w:abstractNum w:abstractNumId="16" w15:restartNumberingAfterBreak="0">
     <w:nsid w:val="2DFF3A5C"/>
     <w:multiLevelType w:val="hybridMultilevel"/>
     <w:tmpl w:val="D15EA2A8"/>
@@ -5493,7 +5242,7 @@
       </w:pPr>
     </w:lvl>
   </w:abstractNum>
-  <w:abstractNum w:abstractNumId="17">
+  <w:abstractNum w:abstractNumId="17" w15:restartNumberingAfterBreak="0">
     <w:nsid w:val="340572D5"/>
     <w:multiLevelType w:val="hybridMultilevel"/>
     <w:tmpl w:val="5FA6ED66"/>
@@ -5606,7 +5355,7 @@
       </w:rPr>
     </w:lvl>
   </w:abstractNum>
-  <w:abstractNum w:abstractNumId="18">
+  <w:abstractNum w:abstractNumId="18" w15:restartNumberingAfterBreak="0">
     <w:nsid w:val="356472B5"/>
     <w:multiLevelType w:val="hybridMultilevel"/>
     <w:tmpl w:val="9BC21046"/>
@@ -5719,7 +5468,7 @@
       </w:rPr>
     </w:lvl>
   </w:abstractNum>
-  <w:abstractNum w:abstractNumId="19">
+  <w:abstractNum w:abstractNumId="19" w15:restartNumberingAfterBreak="0">
     <w:nsid w:val="37910317"/>
     <w:multiLevelType w:val="hybridMultilevel"/>
     <w:tmpl w:val="7B10B448"/>
@@ -5810,7 +5559,7 @@
       </w:pPr>
     </w:lvl>
   </w:abstractNum>
-  <w:abstractNum w:abstractNumId="20">
+  <w:abstractNum w:abstractNumId="20" w15:restartNumberingAfterBreak="0">
     <w:nsid w:val="39616F28"/>
     <w:multiLevelType w:val="hybridMultilevel"/>
     <w:tmpl w:val="5E9E5A0C"/>
@@ -5896,7 +5645,7 @@
       </w:pPr>
     </w:lvl>
   </w:abstractNum>
-  <w:abstractNum w:abstractNumId="21">
+  <w:abstractNum w:abstractNumId="21" w15:restartNumberingAfterBreak="0">
     <w:nsid w:val="39E37CE5"/>
     <w:multiLevelType w:val="hybridMultilevel"/>
     <w:tmpl w:val="D4287B1C"/>
@@ -5986,7 +5735,7 @@
       </w:pPr>
     </w:lvl>
   </w:abstractNum>
-  <w:abstractNum w:abstractNumId="22">
+  <w:abstractNum w:abstractNumId="22" w15:restartNumberingAfterBreak="0">
     <w:nsid w:val="3D63525E"/>
     <w:multiLevelType w:val="hybridMultilevel"/>
     <w:tmpl w:val="41F6F01A"/>
@@ -6098,7 +5847,7 @@
       </w:rPr>
     </w:lvl>
   </w:abstractNum>
-  <w:abstractNum w:abstractNumId="23">
+  <w:abstractNum w:abstractNumId="23" w15:restartNumberingAfterBreak="0">
     <w:nsid w:val="466B43E7"/>
     <w:multiLevelType w:val="hybridMultilevel"/>
     <w:tmpl w:val="EFF6335E"/>
@@ -6211,7 +5960,7 @@
       </w:rPr>
     </w:lvl>
   </w:abstractNum>
-  <w:abstractNum w:abstractNumId="24">
+  <w:abstractNum w:abstractNumId="24" w15:restartNumberingAfterBreak="0">
     <w:nsid w:val="4E5E30FB"/>
     <w:multiLevelType w:val="hybridMultilevel"/>
     <w:tmpl w:val="6D249C48"/>
@@ -6323,7 +6072,7 @@
       </w:rPr>
     </w:lvl>
   </w:abstractNum>
-  <w:abstractNum w:abstractNumId="25">
+  <w:abstractNum w:abstractNumId="25" w15:restartNumberingAfterBreak="0">
     <w:nsid w:val="511B4C10"/>
     <w:multiLevelType w:val="hybridMultilevel"/>
     <w:tmpl w:val="F9AA8952"/>
@@ -6436,7 +6185,7 @@
       </w:rPr>
     </w:lvl>
   </w:abstractNum>
-  <w:abstractNum w:abstractNumId="26">
+  <w:abstractNum w:abstractNumId="26" w15:restartNumberingAfterBreak="0">
     <w:nsid w:val="52B53C3B"/>
     <w:multiLevelType w:val="hybridMultilevel"/>
     <w:tmpl w:val="5A7CB690"/>
@@ -6549,7 +6298,7 @@
       </w:rPr>
     </w:lvl>
   </w:abstractNum>
-  <w:abstractNum w:abstractNumId="27">
+  <w:abstractNum w:abstractNumId="27" w15:restartNumberingAfterBreak="0">
     <w:nsid w:val="60CE7AF4"/>
     <w:multiLevelType w:val="hybridMultilevel"/>
     <w:tmpl w:val="ED32558C"/>
@@ -6663,7 +6412,7 @@
       </w:rPr>
     </w:lvl>
   </w:abstractNum>
-  <w:abstractNum w:abstractNumId="28">
+  <w:abstractNum w:abstractNumId="28" w15:restartNumberingAfterBreak="0">
     <w:nsid w:val="6185775C"/>
     <w:multiLevelType w:val="hybridMultilevel"/>
     <w:tmpl w:val="E166B826"/>
@@ -6776,7 +6525,7 @@
       </w:rPr>
     </w:lvl>
   </w:abstractNum>
-  <w:abstractNum w:abstractNumId="29">
+  <w:abstractNum w:abstractNumId="29" w15:restartNumberingAfterBreak="0">
     <w:nsid w:val="62A10837"/>
     <w:multiLevelType w:val="hybridMultilevel"/>
     <w:tmpl w:val="FC06309A"/>
@@ -6889,7 +6638,7 @@
       </w:rPr>
     </w:lvl>
   </w:abstractNum>
-  <w:abstractNum w:abstractNumId="30">
+  <w:abstractNum w:abstractNumId="30" w15:restartNumberingAfterBreak="0">
     <w:nsid w:val="642E7E08"/>
     <w:multiLevelType w:val="hybridMultilevel"/>
     <w:tmpl w:val="13063258"/>
@@ -6978,7 +6727,7 @@
       </w:pPr>
     </w:lvl>
   </w:abstractNum>
-  <w:abstractNum w:abstractNumId="31">
+  <w:abstractNum w:abstractNumId="31" w15:restartNumberingAfterBreak="0">
     <w:nsid w:val="65FD7626"/>
     <w:multiLevelType w:val="hybridMultilevel"/>
     <w:tmpl w:val="A9C6B3B6"/>
@@ -7091,7 +6840,7 @@
       </w:rPr>
     </w:lvl>
   </w:abstractNum>
-  <w:abstractNum w:abstractNumId="32">
+  <w:abstractNum w:abstractNumId="32" w15:restartNumberingAfterBreak="0">
     <w:nsid w:val="689C7C68"/>
     <w:multiLevelType w:val="hybridMultilevel"/>
     <w:tmpl w:val="C772FBC6"/>
@@ -7204,7 +6953,7 @@
       </w:rPr>
     </w:lvl>
   </w:abstractNum>
-  <w:abstractNum w:abstractNumId="33">
+  <w:abstractNum w:abstractNumId="33" w15:restartNumberingAfterBreak="0">
     <w:nsid w:val="6B0A2B2C"/>
     <w:multiLevelType w:val="hybridMultilevel"/>
     <w:tmpl w:val="AB6493D0"/>
@@ -7316,7 +7065,7 @@
       </w:rPr>
     </w:lvl>
   </w:abstractNum>
-  <w:abstractNum w:abstractNumId="34">
+  <w:abstractNum w:abstractNumId="34" w15:restartNumberingAfterBreak="0">
     <w:nsid w:val="6B4458A6"/>
     <w:multiLevelType w:val="hybridMultilevel"/>
     <w:tmpl w:val="DDAEE82C"/>
@@ -7430,7 +7179,7 @@
       </w:rPr>
     </w:lvl>
   </w:abstractNum>
-  <w:abstractNum w:abstractNumId="35">
+  <w:abstractNum w:abstractNumId="35" w15:restartNumberingAfterBreak="0">
     <w:nsid w:val="6C747B79"/>
     <w:multiLevelType w:val="hybridMultilevel"/>
     <w:tmpl w:val="6F8CC5E0"/>
@@ -7543,7 +7292,7 @@
       </w:rPr>
     </w:lvl>
   </w:abstractNum>
-  <w:abstractNum w:abstractNumId="36">
+  <w:abstractNum w:abstractNumId="36" w15:restartNumberingAfterBreak="0">
     <w:nsid w:val="703E5978"/>
     <w:multiLevelType w:val="hybridMultilevel"/>
     <w:tmpl w:val="9B8E202A"/>
@@ -7656,7 +7405,7 @@
       </w:rPr>
     </w:lvl>
   </w:abstractNum>
-  <w:abstractNum w:abstractNumId="37">
+  <w:abstractNum w:abstractNumId="37" w15:restartNumberingAfterBreak="0">
     <w:nsid w:val="70B94BD4"/>
     <w:multiLevelType w:val="hybridMultilevel"/>
     <w:tmpl w:val="88AA516C"/>
@@ -7769,7 +7518,7 @@
       </w:rPr>
     </w:lvl>
   </w:abstractNum>
-  <w:abstractNum w:abstractNumId="38">
+  <w:abstractNum w:abstractNumId="38" w15:restartNumberingAfterBreak="0">
     <w:nsid w:val="72A90C2F"/>
     <w:multiLevelType w:val="hybridMultilevel"/>
     <w:tmpl w:val="53E045E0"/>
@@ -7882,7 +7631,7 @@
       </w:rPr>
     </w:lvl>
   </w:abstractNum>
-  <w:abstractNum w:abstractNumId="39">
+  <w:abstractNum w:abstractNumId="39" w15:restartNumberingAfterBreak="0">
     <w:nsid w:val="751B58FC"/>
     <w:multiLevelType w:val="hybridMultilevel"/>
     <w:tmpl w:val="5B8C73B0"/>
@@ -7995,7 +7744,7 @@
       </w:rPr>
     </w:lvl>
   </w:abstractNum>
-  <w:abstractNum w:abstractNumId="40">
+  <w:abstractNum w:abstractNumId="40" w15:restartNumberingAfterBreak="0">
     <w:nsid w:val="75F33FAA"/>
     <w:multiLevelType w:val="hybridMultilevel"/>
     <w:tmpl w:val="6884EAB0"/>
@@ -8108,7 +7857,7 @@
       </w:rPr>
     </w:lvl>
   </w:abstractNum>
-  <w:abstractNum w:abstractNumId="41">
+  <w:abstractNum w:abstractNumId="41" w15:restartNumberingAfterBreak="0">
     <w:nsid w:val="764C1A93"/>
     <w:multiLevelType w:val="hybridMultilevel"/>
     <w:tmpl w:val="5FEA30DE"/>
@@ -8221,7 +7970,7 @@
       </w:rPr>
     </w:lvl>
   </w:abstractNum>
-  <w:abstractNum w:abstractNumId="42">
+  <w:abstractNum w:abstractNumId="42" w15:restartNumberingAfterBreak="0">
     <w:nsid w:val="79766BC6"/>
     <w:multiLevelType w:val="hybridMultilevel"/>
     <w:tmpl w:val="235855AC"/>
@@ -8334,7 +8083,7 @@
       </w:rPr>
     </w:lvl>
   </w:abstractNum>
-  <w:abstractNum w:abstractNumId="43">
+  <w:abstractNum w:abstractNumId="43" w15:restartNumberingAfterBreak="0">
     <w:nsid w:val="7AF433C1"/>
     <w:multiLevelType w:val="hybridMultilevel"/>
     <w:tmpl w:val="5C801536"/>
@@ -8447,136 +8196,136 @@
       </w:rPr>
     </w:lvl>
   </w:abstractNum>
-  <w:num w:numId="1">
+  <w:num w:numId="1" w16cid:durableId="793911474">
     <w:abstractNumId w:val="1"/>
   </w:num>
-  <w:num w:numId="2">
+  <w:num w:numId="2" w16cid:durableId="703099701">
     <w:abstractNumId w:val="41"/>
   </w:num>
-  <w:num w:numId="3">
+  <w:num w:numId="3" w16cid:durableId="2029061293">
     <w:abstractNumId w:val="19"/>
   </w:num>
-  <w:num w:numId="4">
+  <w:num w:numId="4" w16cid:durableId="208424736">
     <w:abstractNumId w:val="25"/>
   </w:num>
-  <w:num w:numId="5">
+  <w:num w:numId="5" w16cid:durableId="1740250683">
     <w:abstractNumId w:val="37"/>
   </w:num>
-  <w:num w:numId="6">
+  <w:num w:numId="6" w16cid:durableId="1591038769">
     <w:abstractNumId w:val="23"/>
   </w:num>
-  <w:num w:numId="7">
+  <w:num w:numId="7" w16cid:durableId="1313293521">
     <w:abstractNumId w:val="6"/>
   </w:num>
-  <w:num w:numId="8">
+  <w:num w:numId="8" w16cid:durableId="1865433789">
     <w:abstractNumId w:val="35"/>
   </w:num>
-  <w:num w:numId="9">
+  <w:num w:numId="9" w16cid:durableId="853808046">
     <w:abstractNumId w:val="39"/>
   </w:num>
-  <w:num w:numId="10">
+  <w:num w:numId="10" w16cid:durableId="1612666726">
     <w:abstractNumId w:val="40"/>
   </w:num>
-  <w:num w:numId="11">
+  <w:num w:numId="11" w16cid:durableId="1117407561">
     <w:abstractNumId w:val="3"/>
   </w:num>
-  <w:num w:numId="12">
+  <w:num w:numId="12" w16cid:durableId="1486311551">
     <w:abstractNumId w:val="13"/>
   </w:num>
-  <w:num w:numId="13">
+  <w:num w:numId="13" w16cid:durableId="1120416840">
     <w:abstractNumId w:val="17"/>
   </w:num>
-  <w:num w:numId="14">
+  <w:num w:numId="14" w16cid:durableId="1706178984">
     <w:abstractNumId w:val="31"/>
   </w:num>
-  <w:num w:numId="15">
+  <w:num w:numId="15" w16cid:durableId="994144653">
     <w:abstractNumId w:val="29"/>
   </w:num>
-  <w:num w:numId="16">
+  <w:num w:numId="16" w16cid:durableId="415440537">
     <w:abstractNumId w:val="33"/>
   </w:num>
-  <w:num w:numId="17">
+  <w:num w:numId="17" w16cid:durableId="799616660">
     <w:abstractNumId w:val="14"/>
   </w:num>
-  <w:num w:numId="18">
+  <w:num w:numId="18" w16cid:durableId="1955863184">
     <w:abstractNumId w:val="9"/>
   </w:num>
-  <w:num w:numId="19">
+  <w:num w:numId="19" w16cid:durableId="922378679">
     <w:abstractNumId w:val="28"/>
   </w:num>
-  <w:num w:numId="20">
+  <w:num w:numId="20" w16cid:durableId="1741825908">
     <w:abstractNumId w:val="36"/>
   </w:num>
-  <w:num w:numId="21">
+  <w:num w:numId="21" w16cid:durableId="2139183515">
     <w:abstractNumId w:val="4"/>
   </w:num>
-  <w:num w:numId="22">
+  <w:num w:numId="22" w16cid:durableId="202133954">
     <w:abstractNumId w:val="24"/>
   </w:num>
-  <w:num w:numId="23">
+  <w:num w:numId="23" w16cid:durableId="1063484048">
     <w:abstractNumId w:val="18"/>
   </w:num>
-  <w:num w:numId="24">
+  <w:num w:numId="24" w16cid:durableId="1409306646">
     <w:abstractNumId w:val="22"/>
   </w:num>
-  <w:num w:numId="25">
+  <w:num w:numId="25" w16cid:durableId="2070954226">
     <w:abstractNumId w:val="7"/>
   </w:num>
-  <w:num w:numId="26">
+  <w:num w:numId="26" w16cid:durableId="1710564677">
     <w:abstractNumId w:val="15"/>
   </w:num>
-  <w:num w:numId="27">
+  <w:num w:numId="27" w16cid:durableId="1614093833">
     <w:abstractNumId w:val="43"/>
   </w:num>
-  <w:num w:numId="28">
+  <w:num w:numId="28" w16cid:durableId="932709863">
     <w:abstractNumId w:val="5"/>
   </w:num>
-  <w:num w:numId="29">
+  <w:num w:numId="29" w16cid:durableId="905149369">
     <w:abstractNumId w:val="12"/>
   </w:num>
-  <w:num w:numId="30">
+  <w:num w:numId="30" w16cid:durableId="1648168745">
     <w:abstractNumId w:val="11"/>
   </w:num>
-  <w:num w:numId="31">
+  <w:num w:numId="31" w16cid:durableId="1610971682">
     <w:abstractNumId w:val="10"/>
   </w:num>
-  <w:num w:numId="32">
+  <w:num w:numId="32" w16cid:durableId="701243142">
     <w:abstractNumId w:val="26"/>
   </w:num>
-  <w:num w:numId="33">
+  <w:num w:numId="33" w16cid:durableId="309985717">
     <w:abstractNumId w:val="34"/>
   </w:num>
-  <w:num w:numId="34">
+  <w:num w:numId="34" w16cid:durableId="1407342141">
     <w:abstractNumId w:val="27"/>
   </w:num>
-  <w:num w:numId="35">
+  <w:num w:numId="35" w16cid:durableId="1731616117">
     <w:abstractNumId w:val="20"/>
   </w:num>
-  <w:num w:numId="36">
+  <w:num w:numId="36" w16cid:durableId="1997605192">
     <w:abstractNumId w:val="42"/>
   </w:num>
-  <w:num w:numId="37">
+  <w:num w:numId="37" w16cid:durableId="780077344">
     <w:abstractNumId w:val="0"/>
   </w:num>
-  <w:num w:numId="38">
+  <w:num w:numId="38" w16cid:durableId="1362247745">
     <w:abstractNumId w:val="38"/>
   </w:num>
-  <w:num w:numId="39">
+  <w:num w:numId="39" w16cid:durableId="1624187479">
     <w:abstractNumId w:val="32"/>
   </w:num>
-  <w:num w:numId="40">
+  <w:num w:numId="40" w16cid:durableId="936211373">
     <w:abstractNumId w:val="16"/>
   </w:num>
-  <w:num w:numId="41">
+  <w:num w:numId="41" w16cid:durableId="417484729">
     <w:abstractNumId w:val="2"/>
   </w:num>
-  <w:num w:numId="42">
+  <w:num w:numId="42" w16cid:durableId="2022538750">
     <w:abstractNumId w:val="8"/>
   </w:num>
-  <w:num w:numId="43">
+  <w:num w:numId="43" w16cid:durableId="641664225">
     <w:abstractNumId w:val="21"/>
   </w:num>
-  <w:num w:numId="44">
+  <w:num w:numId="44" w16cid:durableId="38745369">
     <w:abstractNumId w:val="30"/>
   </w:num>
   <w:numIdMacAtCleanup w:val="39"/>
@@ -8584,7 +8333,7 @@
 </file>
 
 <file path=word/styles.xml><?xml version="1.0" encoding="utf-8"?>
-<w:styles xmlns:r="http://schemas.openxmlformats.org/officeDocument/2006/relationships" xmlns:w="http://schemas.openxmlformats.org/wordprocessingml/2006/main">
+<w:styles xmlns:mc="http://schemas.openxmlformats.org/markup-compatibility/2006" xmlns:r="http://schemas.openxmlformats.org/officeDocument/2006/relationships" xmlns:w="http://schemas.openxmlformats.org/wordprocessingml/2006/main" xmlns:w14="http://schemas.microsoft.com/office/word/2010/wordml" xmlns:w15="http://schemas.microsoft.com/office/word/2012/wordml" xmlns:w16cex="http://schemas.microsoft.com/office/word/2018/wordml/cex" xmlns:w16cid="http://schemas.microsoft.com/office/word/2016/wordml/cid" xmlns:w16="http://schemas.microsoft.com/office/word/2018/wordml" xmlns:w16du="http://schemas.microsoft.com/office/word/2023/wordml/word16du" xmlns:w16sdtdh="http://schemas.microsoft.com/office/word/2020/wordml/sdtdatahash" xmlns:w16sdtfl="http://schemas.microsoft.com/office/word/2024/wordml/sdtformatlock" xmlns:w16se="http://schemas.microsoft.com/office/word/2015/wordml/symex" mc:Ignorable="w14 w15 w16se w16cid w16 w16cex w16sdtdh w16sdtfl w16du">
   <w:docDefaults>
     <w:rPrDefault>
       <w:rPr>
@@ -8600,155 +8349,394 @@
       </w:pPr>
     </w:pPrDefault>
   </w:docDefaults>
-  <w:latentStyles w:defLockedState="0" w:defUIPriority="99" w:defSemiHidden="1" w:defUnhideWhenUsed="1" w:defQFormat="0" w:count="267">
-    <w:lsdException w:name="Normal" w:semiHidden="0" w:uiPriority="0" w:unhideWhenUsed="0" w:qFormat="1"/>
-    <w:lsdException w:name="heading 1" w:semiHidden="0" w:uiPriority="9" w:unhideWhenUsed="0" w:qFormat="1"/>
-    <w:lsdException w:name="heading 2" w:uiPriority="9" w:qFormat="1"/>
-    <w:lsdException w:name="heading 3" w:uiPriority="9" w:qFormat="1"/>
-    <w:lsdException w:name="heading 4" w:uiPriority="9" w:qFormat="1"/>
-    <w:lsdException w:name="heading 5" w:uiPriority="9" w:qFormat="1"/>
-    <w:lsdException w:name="heading 6" w:uiPriority="9" w:qFormat="1"/>
-    <w:lsdException w:name="heading 7" w:uiPriority="9" w:qFormat="1"/>
-    <w:lsdException w:name="heading 8" w:uiPriority="9" w:qFormat="1"/>
-    <w:lsdException w:name="heading 9" w:uiPriority="9" w:qFormat="1"/>
-    <w:lsdException w:name="toc 1" w:uiPriority="39"/>
-    <w:lsdException w:name="toc 2" w:uiPriority="39"/>
-    <w:lsdException w:name="toc 3" w:uiPriority="39"/>
-    <w:lsdException w:name="toc 4" w:uiPriority="39"/>
-    <w:lsdException w:name="toc 5" w:uiPriority="39"/>
-    <w:lsdException w:name="toc 6" w:uiPriority="39"/>
-    <w:lsdException w:name="toc 7" w:uiPriority="39"/>
-    <w:lsdException w:name="toc 8" w:uiPriority="39"/>
-    <w:lsdException w:name="toc 9" w:uiPriority="39"/>
-    <w:lsdException w:name="caption" w:uiPriority="35" w:qFormat="1"/>
-    <w:lsdException w:name="Title" w:semiHidden="0" w:uiPriority="10" w:unhideWhenUsed="0" w:qFormat="1"/>
-    <w:lsdException w:name="Default Paragraph Font" w:uiPriority="1"/>
-    <w:lsdException w:name="Subtitle" w:semiHidden="0" w:uiPriority="11" w:unhideWhenUsed="0" w:qFormat="1"/>
-    <w:lsdException w:name="Strong" w:semiHidden="0" w:uiPriority="22" w:unhideWhenUsed="0" w:qFormat="1"/>
-    <w:lsdException w:name="Emphasis" w:semiHidden="0" w:uiPriority="20" w:unhideWhenUsed="0" w:qFormat="1"/>
-    <w:lsdException w:name="Table Grid" w:semiHidden="0" w:uiPriority="59" w:unhideWhenUsed="0"/>
-    <w:lsdException w:name="Placeholder Text" w:unhideWhenUsed="0"/>
-    <w:lsdException w:name="No Spacing" w:semiHidden="0" w:uiPriority="1" w:unhideWhenUsed="0" w:qFormat="1"/>
-    <w:lsdException w:name="Light Shading" w:semiHidden="0" w:uiPriority="60" w:unhideWhenUsed="0"/>
-    <w:lsdException w:name="Light List" w:semiHidden="0" w:uiPriority="61" w:unhideWhenUsed="0"/>
-    <w:lsdException w:name="Light Grid" w:semiHidden="0" w:uiPriority="62" w:unhideWhenUsed="0"/>
-    <w:lsdException w:name="Medium Shading 1" w:semiHidden="0" w:uiPriority="63" w:unhideWhenUsed="0"/>
-    <w:lsdException w:name="Medium Shading 2" w:semiHidden="0" w:uiPriority="64" w:unhideWhenUsed="0"/>
-    <w:lsdException w:name="Medium List 1" w:semiHidden="0" w:uiPriority="65" w:unhideWhenUsed="0"/>
-    <w:lsdException w:name="Medium List 2" w:semiHidden="0" w:uiPriority="66" w:unhideWhenUsed="0"/>
-    <w:lsdException w:name="Medium Grid 1" w:semiHidden="0" w:uiPriority="67" w:unhideWhenUsed="0"/>
-    <w:lsdException w:name="Medium Grid 2" w:semiHidden="0" w:uiPriority="68" w:unhideWhenUsed="0"/>
-    <w:lsdException w:name="Medium Grid 3" w:semiHidden="0" w:uiPriority="69" w:unhideWhenUsed="0"/>
-    <w:lsdException w:name="Dark List" w:semiHidden="0" w:uiPriority="70" w:unhideWhenUsed="0"/>
-    <w:lsdException w:name="Colorful Shading" w:semiHidden="0" w:uiPriority="71" w:unhideWhenUsed="0"/>
-    <w:lsdException w:name="Colorful List" w:semiHidden="0" w:uiPriority="72" w:unhideWhenUsed="0"/>
-    <w:lsdException w:name="Colorful Grid" w:semiHidden="0" w:uiPriority="73" w:unhideWhenUsed="0"/>
-    <w:lsdException w:name="Light Shading Accent 1" w:semiHidden="0" w:uiPriority="60" w:unhideWhenUsed="0"/>
-    <w:lsdException w:name="Light List Accent 1" w:semiHidden="0" w:uiPriority="61" w:unhideWhenUsed="0"/>
-    <w:lsdException w:name="Light Grid Accent 1" w:semiHidden="0" w:uiPriority="62" w:unhideWhenUsed="0"/>
-    <w:lsdException w:name="Medium Shading 1 Accent 1" w:semiHidden="0" w:uiPriority="63" w:unhideWhenUsed="0"/>
-    <w:lsdException w:name="Medium Shading 2 Accent 1" w:semiHidden="0" w:uiPriority="64" w:unhideWhenUsed="0"/>
-    <w:lsdException w:name="Medium List 1 Accent 1" w:semiHidden="0" w:uiPriority="65" w:unhideWhenUsed="0"/>
-    <w:lsdException w:name="Revision" w:unhideWhenUsed="0"/>
-    <w:lsdException w:name="List Paragraph" w:semiHidden="0" w:uiPriority="34" w:unhideWhenUsed="0" w:qFormat="1"/>
-    <w:lsdException w:name="Quote" w:semiHidden="0" w:uiPriority="29" w:unhideWhenUsed="0" w:qFormat="1"/>
-    <w:lsdException w:name="Intense Quote" w:semiHidden="0" w:uiPriority="30" w:unhideWhenUsed="0" w:qFormat="1"/>
-    <w:lsdException w:name="Medium List 2 Accent 1" w:semiHidden="0" w:uiPriority="66" w:unhideWhenUsed="0"/>
-    <w:lsdException w:name="Medium Grid 1 Accent 1" w:semiHidden="0" w:uiPriority="67" w:unhideWhenUsed="0"/>
-    <w:lsdException w:name="Medium Grid 2 Accent 1" w:semiHidden="0" w:uiPriority="68" w:unhideWhenUsed="0"/>
-    <w:lsdException w:name="Medium Grid 3 Accent 1" w:semiHidden="0" w:uiPriority="69" w:unhideWhenUsed="0"/>
-    <w:lsdException w:name="Dark List Accent 1" w:semiHidden="0" w:uiPriority="70" w:unhideWhenUsed="0"/>
-    <w:lsdException w:name="Colorful Shading Accent 1" w:semiHidden="0" w:uiPriority="71" w:unhideWhenUsed="0"/>
-    <w:lsdException w:name="Colorful List Accent 1" w:semiHidden="0" w:uiPriority="72" w:unhideWhenUsed="0"/>
-    <w:lsdException w:name="Colorful Grid Accent 1" w:semiHidden="0" w:uiPriority="73" w:unhideWhenUsed="0"/>
-    <w:lsdException w:name="Light Shading Accent 2" w:semiHidden="0" w:uiPriority="60" w:unhideWhenUsed="0"/>
-    <w:lsdException w:name="Light List Accent 2" w:semiHidden="0" w:uiPriority="61" w:unhideWhenUsed="0"/>
-    <w:lsdException w:name="Light Grid Accent 2" w:semiHidden="0" w:uiPriority="62" w:unhideWhenUsed="0"/>
-    <w:lsdException w:name="Medium Shading 1 Accent 2" w:semiHidden="0" w:uiPriority="63" w:unhideWhenUsed="0"/>
-    <w:lsdException w:name="Medium Shading 2 Accent 2" w:semiHidden="0" w:uiPriority="64" w:unhideWhenUsed="0"/>
-    <w:lsdException w:name="Medium List 1 Accent 2" w:semiHidden="0" w:uiPriority="65" w:unhideWhenUsed="0"/>
-    <w:lsdException w:name="Medium List 2 Accent 2" w:semiHidden="0" w:uiPriority="66" w:unhideWhenUsed="0"/>
-    <w:lsdException w:name="Medium Grid 1 Accent 2" w:semiHidden="0" w:uiPriority="67" w:unhideWhenUsed="0"/>
-    <w:lsdException w:name="Medium Grid 2 Accent 2" w:semiHidden="0" w:uiPriority="68" w:unhideWhenUsed="0"/>
-    <w:lsdException w:name="Medium Grid 3 Accent 2" w:semiHidden="0" w:uiPriority="69" w:unhideWhenUsed="0"/>
-    <w:lsdException w:name="Dark List Accent 2" w:semiHidden="0" w:uiPriority="70" w:unhideWhenUsed="0"/>
-    <w:lsdException w:name="Colorful Shading Accent 2" w:semiHidden="0" w:uiPriority="71" w:unhideWhenUsed="0"/>
-    <w:lsdException w:name="Colorful List Accent 2" w:semiHidden="0" w:uiPriority="72" w:unhideWhenUsed="0"/>
-    <w:lsdException w:name="Colorful Grid Accent 2" w:semiHidden="0" w:uiPriority="73" w:unhideWhenUsed="0"/>
-    <w:lsdException w:name="Light Shading Accent 3" w:semiHidden="0" w:uiPriority="60" w:unhideWhenUsed="0"/>
-    <w:lsdException w:name="Light List Accent 3" w:semiHidden="0" w:uiPriority="61" w:unhideWhenUsed="0"/>
-    <w:lsdException w:name="Light Grid Accent 3" w:semiHidden="0" w:uiPriority="62" w:unhideWhenUsed="0"/>
-    <w:lsdException w:name="Medium Shading 1 Accent 3" w:semiHidden="0" w:uiPriority="63" w:unhideWhenUsed="0"/>
-    <w:lsdException w:name="Medium Shading 2 Accent 3" w:semiHidden="0" w:uiPriority="64" w:unhideWhenUsed="0"/>
-    <w:lsdException w:name="Medium List 1 Accent 3" w:semiHidden="0" w:uiPriority="65" w:unhideWhenUsed="0"/>
-    <w:lsdException w:name="Medium List 2 Accent 3" w:semiHidden="0" w:uiPriority="66" w:unhideWhenUsed="0"/>
-    <w:lsdException w:name="Medium Grid 1 Accent 3" w:semiHidden="0" w:uiPriority="67" w:unhideWhenUsed="0"/>
-    <w:lsdException w:name="Medium Grid 2 Accent 3" w:semiHidden="0" w:uiPriority="68" w:unhideWhenUsed="0"/>
-    <w:lsdException w:name="Medium Grid 3 Accent 3" w:semiHidden="0" w:uiPriority="69" w:unhideWhenUsed="0"/>
-    <w:lsdException w:name="Dark List Accent 3" w:semiHidden="0" w:uiPriority="70" w:unhideWhenUsed="0"/>
-    <w:lsdException w:name="Colorful Shading Accent 3" w:semiHidden="0" w:uiPriority="71" w:unhideWhenUsed="0"/>
-    <w:lsdException w:name="Colorful List Accent 3" w:semiHidden="0" w:uiPriority="72" w:unhideWhenUsed="0"/>
-    <w:lsdException w:name="Colorful Grid Accent 3" w:semiHidden="0" w:uiPriority="73" w:unhideWhenUsed="0"/>
-    <w:lsdException w:name="Light Shading Accent 4" w:semiHidden="0" w:uiPriority="60" w:unhideWhenUsed="0"/>
-    <w:lsdException w:name="Light List Accent 4" w:semiHidden="0" w:uiPriority="61" w:unhideWhenUsed="0"/>
-    <w:lsdException w:name="Light Grid Accent 4" w:semiHidden="0" w:uiPriority="62" w:unhideWhenUsed="0"/>
-    <w:lsdException w:name="Medium Shading 1 Accent 4" w:semiHidden="0" w:uiPriority="63" w:unhideWhenUsed="0"/>
-    <w:lsdException w:name="Medium Shading 2 Accent 4" w:semiHidden="0" w:uiPriority="64" w:unhideWhenUsed="0"/>
-    <w:lsdException w:name="Medium List 1 Accent 4" w:semiHidden="0" w:uiPriority="65" w:unhideWhenUsed="0"/>
-    <w:lsdException w:name="Medium List 2 Accent 4" w:semiHidden="0" w:uiPriority="66" w:unhideWhenUsed="0"/>
-    <w:lsdException w:name="Medium Grid 1 Accent 4" w:semiHidden="0" w:uiPriority="67" w:unhideWhenUsed="0"/>
-    <w:lsdException w:name="Medium Grid 2 Accent 4" w:semiHidden="0" w:uiPriority="68" w:unhideWhenUsed="0"/>
-    <w:lsdException w:name="Medium Grid 3 Accent 4" w:semiHidden="0" w:uiPriority="69" w:unhideWhenUsed="0"/>
-    <w:lsdException w:name="Dark List Accent 4" w:semiHidden="0" w:uiPriority="70" w:unhideWhenUsed="0"/>
-    <w:lsdException w:name="Colorful Shading Accent 4" w:semiHidden="0" w:uiPriority="71" w:unhideWhenUsed="0"/>
-    <w:lsdException w:name="Colorful List Accent 4" w:semiHidden="0" w:uiPriority="72" w:unhideWhenUsed="0"/>
-    <w:lsdException w:name="Colorful Grid Accent 4" w:semiHidden="0" w:uiPriority="73" w:unhideWhenUsed="0"/>
-    <w:lsdException w:name="Light Shading Accent 5" w:semiHidden="0" w:uiPriority="60" w:unhideWhenUsed="0"/>
-    <w:lsdException w:name="Light List Accent 5" w:semiHidden="0" w:uiPriority="61" w:unhideWhenUsed="0"/>
-    <w:lsdException w:name="Light Grid Accent 5" w:semiHidden="0" w:uiPriority="62" w:unhideWhenUsed="0"/>
-    <w:lsdException w:name="Medium Shading 1 Accent 5" w:semiHidden="0" w:uiPriority="63" w:unhideWhenUsed="0"/>
-    <w:lsdException w:name="Medium Shading 2 Accent 5" w:semiHidden="0" w:uiPriority="64" w:unhideWhenUsed="0"/>
-    <w:lsdException w:name="Medium List 1 Accent 5" w:semiHidden="0" w:uiPriority="65" w:unhideWhenUsed="0"/>
-    <w:lsdException w:name="Medium List 2 Accent 5" w:semiHidden="0" w:uiPriority="66" w:unhideWhenUsed="0"/>
-    <w:lsdException w:name="Medium Grid 1 Accent 5" w:semiHidden="0" w:uiPriority="67" w:unhideWhenUsed="0"/>
-    <w:lsdException w:name="Medium Grid 2 Accent 5" w:semiHidden="0" w:uiPriority="68" w:unhideWhenUsed="0"/>
-    <w:lsdException w:name="Medium Grid 3 Accent 5" w:semiHidden="0" w:uiPriority="69" w:unhideWhenUsed="0"/>
-    <w:lsdException w:name="Dark List Accent 5" w:semiHidden="0" w:uiPriority="70" w:unhideWhenUsed="0"/>
-    <w:lsdException w:name="Colorful Shading Accent 5" w:semiHidden="0" w:uiPriority="71" w:unhideWhenUsed="0"/>
-    <w:lsdException w:name="Colorful List Accent 5" w:semiHidden="0" w:uiPriority="72" w:unhideWhenUsed="0"/>
-    <w:lsdException w:name="Colorful Grid Accent 5" w:semiHidden="0" w:uiPriority="73" w:unhideWhenUsed="0"/>
-    <w:lsdException w:name="Light Shading Accent 6" w:semiHidden="0" w:uiPriority="60" w:unhideWhenUsed="0"/>
-    <w:lsdException w:name="Light List Accent 6" w:semiHidden="0" w:uiPriority="61" w:unhideWhenUsed="0"/>
-    <w:lsdException w:name="Light Grid Accent 6" w:semiHidden="0" w:uiPriority="62" w:unhideWhenUsed="0"/>
-    <w:lsdException w:name="Medium Shading 1 Accent 6" w:semiHidden="0" w:uiPriority="63" w:unhideWhenUsed="0"/>
-    <w:lsdException w:name="Medium Shading 2 Accent 6" w:semiHidden="0" w:uiPriority="64" w:unhideWhenUsed="0"/>
-    <w:lsdException w:name="Medium List 1 Accent 6" w:semiHidden="0" w:uiPriority="65" w:unhideWhenUsed="0"/>
-    <w:lsdException w:name="Medium List 2 Accent 6" w:semiHidden="0" w:uiPriority="66" w:unhideWhenUsed="0"/>
-    <w:lsdException w:name="Medium Grid 1 Accent 6" w:semiHidden="0" w:uiPriority="67" w:unhideWhenUsed="0"/>
-    <w:lsdException w:name="Medium Grid 2 Accent 6" w:semiHidden="0" w:uiPriority="68" w:unhideWhenUsed="0"/>
-    <w:lsdException w:name="Medium Grid 3 Accent 6" w:semiHidden="0" w:uiPriority="69" w:unhideWhenUsed="0"/>
-    <w:lsdException w:name="Dark List Accent 6" w:semiHidden="0" w:uiPriority="70" w:unhideWhenUsed="0"/>
-    <w:lsdException w:name="Colorful Shading Accent 6" w:semiHidden="0" w:uiPriority="71" w:unhideWhenUsed="0"/>
-    <w:lsdException w:name="Colorful List Accent 6" w:semiHidden="0" w:uiPriority="72" w:unhideWhenUsed="0"/>
-    <w:lsdException w:name="Colorful Grid Accent 6" w:semiHidden="0" w:uiPriority="73" w:unhideWhenUsed="0"/>
-    <w:lsdException w:name="Subtle Emphasis" w:semiHidden="0" w:uiPriority="19" w:unhideWhenUsed="0" w:qFormat="1"/>
-    <w:lsdException w:name="Intense Emphasis" w:semiHidden="0" w:uiPriority="21" w:unhideWhenUsed="0" w:qFormat="1"/>
-    <w:lsdException w:name="Subtle Reference" w:semiHidden="0" w:uiPriority="31" w:unhideWhenUsed="0" w:qFormat="1"/>
-    <w:lsdException w:name="Intense Reference" w:semiHidden="0" w:uiPriority="32" w:unhideWhenUsed="0" w:qFormat="1"/>
-    <w:lsdException w:name="Book Title" w:semiHidden="0" w:uiPriority="33" w:unhideWhenUsed="0" w:qFormat="1"/>
-    <w:lsdException w:name="Bibliography" w:uiPriority="37"/>
-    <w:lsdException w:name="TOC Heading" w:uiPriority="39" w:qFormat="1"/>
+  <w:latentStyles w:defLockedState="0" w:defUIPriority="99" w:defSemiHidden="0" w:defUnhideWhenUsed="0" w:defQFormat="0" w:count="376">
+    <w:lsdException w:name="Normal" w:uiPriority="0" w:qFormat="1"/>
+    <w:lsdException w:name="heading 1" w:uiPriority="9" w:qFormat="1"/>
+    <w:lsdException w:name="heading 2" w:semiHidden="1" w:uiPriority="9" w:unhideWhenUsed="1" w:qFormat="1"/>
+    <w:lsdException w:name="heading 3" w:semiHidden="1" w:uiPriority="9" w:unhideWhenUsed="1" w:qFormat="1"/>
+    <w:lsdException w:name="heading 4" w:semiHidden="1" w:uiPriority="9" w:unhideWhenUsed="1" w:qFormat="1"/>
+    <w:lsdException w:name="heading 5" w:semiHidden="1" w:uiPriority="9" w:unhideWhenUsed="1" w:qFormat="1"/>
+    <w:lsdException w:name="heading 6" w:semiHidden="1" w:uiPriority="9" w:unhideWhenUsed="1" w:qFormat="1"/>
+    <w:lsdException w:name="heading 7" w:semiHidden="1" w:uiPriority="9" w:unhideWhenUsed="1" w:qFormat="1"/>
+    <w:lsdException w:name="heading 8" w:semiHidden="1" w:uiPriority="9" w:unhideWhenUsed="1" w:qFormat="1"/>
+    <w:lsdException w:name="heading 9" w:semiHidden="1" w:uiPriority="9" w:unhideWhenUsed="1" w:qFormat="1"/>
+    <w:lsdException w:name="index 1" w:semiHidden="1" w:unhideWhenUsed="1"/>
+    <w:lsdException w:name="index 2" w:semiHidden="1" w:unhideWhenUsed="1"/>
+    <w:lsdException w:name="index 3" w:semiHidden="1" w:unhideWhenUsed="1"/>
+    <w:lsdException w:name="index 4" w:semiHidden="1" w:unhideWhenUsed="1"/>
+    <w:lsdException w:name="index 5" w:semiHidden="1" w:unhideWhenUsed="1"/>
+    <w:lsdException w:name="index 6" w:semiHidden="1" w:unhideWhenUsed="1"/>
+    <w:lsdException w:name="index 7" w:semiHidden="1" w:unhideWhenUsed="1"/>
+    <w:lsdException w:name="index 8" w:semiHidden="1" w:unhideWhenUsed="1"/>
+    <w:lsdException w:name="index 9" w:semiHidden="1" w:unhideWhenUsed="1"/>
+    <w:lsdException w:name="toc 1" w:semiHidden="1" w:uiPriority="39" w:unhideWhenUsed="1"/>
+    <w:lsdException w:name="toc 2" w:semiHidden="1" w:uiPriority="39" w:unhideWhenUsed="1"/>
+    <w:lsdException w:name="toc 3" w:semiHidden="1" w:uiPriority="39" w:unhideWhenUsed="1"/>
+    <w:lsdException w:name="toc 4" w:semiHidden="1" w:uiPriority="39" w:unhideWhenUsed="1"/>
+    <w:lsdException w:name="toc 5" w:semiHidden="1" w:uiPriority="39" w:unhideWhenUsed="1"/>
+    <w:lsdException w:name="toc 6" w:semiHidden="1" w:uiPriority="39" w:unhideWhenUsed="1"/>
+    <w:lsdException w:name="toc 7" w:semiHidden="1" w:uiPriority="39" w:unhideWhenUsed="1"/>
+    <w:lsdException w:name="toc 8" w:semiHidden="1" w:uiPriority="39" w:unhideWhenUsed="1"/>
+    <w:lsdException w:name="toc 9" w:semiHidden="1" w:uiPriority="39" w:unhideWhenUsed="1"/>
+    <w:lsdException w:name="Normal Indent" w:semiHidden="1" w:unhideWhenUsed="1"/>
+    <w:lsdException w:name="footnote text" w:semiHidden="1" w:unhideWhenUsed="1"/>
+    <w:lsdException w:name="annotation text" w:semiHidden="1" w:unhideWhenUsed="1"/>
+    <w:lsdException w:name="header" w:semiHidden="1" w:unhideWhenUsed="1"/>
+    <w:lsdException w:name="footer" w:semiHidden="1" w:unhideWhenUsed="1"/>
+    <w:lsdException w:name="index heading" w:semiHidden="1" w:unhideWhenUsed="1"/>
+    <w:lsdException w:name="caption" w:semiHidden="1" w:uiPriority="35" w:unhideWhenUsed="1" w:qFormat="1"/>
+    <w:lsdException w:name="table of figures" w:semiHidden="1" w:unhideWhenUsed="1"/>
+    <w:lsdException w:name="envelope address" w:semiHidden="1" w:unhideWhenUsed="1"/>
+    <w:lsdException w:name="envelope return" w:semiHidden="1" w:unhideWhenUsed="1"/>
+    <w:lsdException w:name="footnote reference" w:semiHidden="1" w:unhideWhenUsed="1"/>
+    <w:lsdException w:name="annotation reference" w:semiHidden="1" w:unhideWhenUsed="1"/>
+    <w:lsdException w:name="line number" w:semiHidden="1" w:unhideWhenUsed="1"/>
+    <w:lsdException w:name="page number" w:semiHidden="1" w:unhideWhenUsed="1"/>
+    <w:lsdException w:name="endnote reference" w:semiHidden="1" w:unhideWhenUsed="1"/>
+    <w:lsdException w:name="endnote text" w:semiHidden="1" w:unhideWhenUsed="1"/>
+    <w:lsdException w:name="table of authorities" w:semiHidden="1" w:unhideWhenUsed="1"/>
+    <w:lsdException w:name="macro" w:semiHidden="1" w:unhideWhenUsed="1"/>
+    <w:lsdException w:name="toa heading" w:semiHidden="1" w:unhideWhenUsed="1"/>
+    <w:lsdException w:name="List" w:semiHidden="1" w:unhideWhenUsed="1"/>
+    <w:lsdException w:name="List Bullet" w:semiHidden="1" w:unhideWhenUsed="1"/>
+    <w:lsdException w:name="List Number" w:semiHidden="1" w:unhideWhenUsed="1"/>
+    <w:lsdException w:name="List 2" w:semiHidden="1" w:unhideWhenUsed="1"/>
+    <w:lsdException w:name="List 3" w:semiHidden="1" w:unhideWhenUsed="1"/>
+    <w:lsdException w:name="List 4" w:semiHidden="1" w:unhideWhenUsed="1"/>
+    <w:lsdException w:name="List 5" w:semiHidden="1" w:unhideWhenUsed="1"/>
+    <w:lsdException w:name="List Bullet 2" w:semiHidden="1" w:unhideWhenUsed="1"/>
+    <w:lsdException w:name="List Bullet 3" w:semiHidden="1" w:unhideWhenUsed="1"/>
+    <w:lsdException w:name="List Bullet 4" w:semiHidden="1" w:unhideWhenUsed="1"/>
+    <w:lsdException w:name="List Bullet 5" w:semiHidden="1" w:unhideWhenUsed="1"/>
+    <w:lsdException w:name="List Number 2" w:semiHidden="1" w:unhideWhenUsed="1"/>
+    <w:lsdException w:name="List Number 3" w:semiHidden="1" w:unhideWhenUsed="1"/>
+    <w:lsdException w:name="List Number 4" w:semiHidden="1" w:unhideWhenUsed="1"/>
+    <w:lsdException w:name="List Number 5" w:semiHidden="1" w:unhideWhenUsed="1"/>
+    <w:lsdException w:name="Title" w:uiPriority="10" w:qFormat="1"/>
+    <w:lsdException w:name="Closing" w:semiHidden="1" w:unhideWhenUsed="1"/>
+    <w:lsdException w:name="Signature" w:semiHidden="1" w:unhideWhenUsed="1"/>
+    <w:lsdException w:name="Default Paragraph Font" w:semiHidden="1" w:uiPriority="1" w:unhideWhenUsed="1"/>
+    <w:lsdException w:name="Body Text" w:semiHidden="1" w:unhideWhenUsed="1"/>
+    <w:lsdException w:name="Body Text Indent" w:semiHidden="1" w:unhideWhenUsed="1"/>
+    <w:lsdException w:name="List Continue" w:semiHidden="1" w:unhideWhenUsed="1"/>
+    <w:lsdException w:name="List Continue 2" w:semiHidden="1" w:unhideWhenUsed="1"/>
+    <w:lsdException w:name="List Continue 3" w:semiHidden="1" w:unhideWhenUsed="1"/>
+    <w:lsdException w:name="List Continue 4" w:semiHidden="1" w:unhideWhenUsed="1"/>
+    <w:lsdException w:name="List Continue 5" w:semiHidden="1" w:unhideWhenUsed="1"/>
+    <w:lsdException w:name="Message Header" w:semiHidden="1" w:unhideWhenUsed="1"/>
+    <w:lsdException w:name="Subtitle" w:uiPriority="11" w:qFormat="1"/>
+    <w:lsdException w:name="Salutation" w:semiHidden="1" w:unhideWhenUsed="1"/>
+    <w:lsdException w:name="Date" w:semiHidden="1" w:unhideWhenUsed="1"/>
+    <w:lsdException w:name="Body Text First Indent" w:semiHidden="1" w:unhideWhenUsed="1"/>
+    <w:lsdException w:name="Body Text First Indent 2" w:semiHidden="1" w:unhideWhenUsed="1"/>
+    <w:lsdException w:name="Note Heading" w:semiHidden="1" w:unhideWhenUsed="1"/>
+    <w:lsdException w:name="Body Text 2" w:semiHidden="1" w:unhideWhenUsed="1"/>
+    <w:lsdException w:name="Body Text 3" w:semiHidden="1" w:unhideWhenUsed="1"/>
+    <w:lsdException w:name="Body Text Indent 2" w:semiHidden="1" w:unhideWhenUsed="1"/>
+    <w:lsdException w:name="Body Text Indent 3" w:semiHidden="1" w:unhideWhenUsed="1"/>
+    <w:lsdException w:name="Block Text" w:semiHidden="1" w:unhideWhenUsed="1"/>
+    <w:lsdException w:name="Hyperlink" w:semiHidden="1" w:unhideWhenUsed="1"/>
+    <w:lsdException w:name="FollowedHyperlink" w:semiHidden="1" w:unhideWhenUsed="1"/>
+    <w:lsdException w:name="Strong" w:uiPriority="22" w:qFormat="1"/>
+    <w:lsdException w:name="Emphasis" w:uiPriority="20" w:qFormat="1"/>
+    <w:lsdException w:name="Document Map" w:semiHidden="1" w:unhideWhenUsed="1"/>
+    <w:lsdException w:name="Plain Text" w:semiHidden="1" w:unhideWhenUsed="1"/>
+    <w:lsdException w:name="E-mail Signature" w:semiHidden="1" w:unhideWhenUsed="1"/>
+    <w:lsdException w:name="HTML Top of Form" w:semiHidden="1" w:unhideWhenUsed="1"/>
+    <w:lsdException w:name="HTML Bottom of Form" w:semiHidden="1" w:unhideWhenUsed="1"/>
+    <w:lsdException w:name="Normal (Web)" w:semiHidden="1" w:unhideWhenUsed="1"/>
+    <w:lsdException w:name="HTML Acronym" w:semiHidden="1" w:unhideWhenUsed="1"/>
+    <w:lsdException w:name="HTML Address" w:semiHidden="1" w:unhideWhenUsed="1"/>
+    <w:lsdException w:name="HTML Cite" w:semiHidden="1" w:unhideWhenUsed="1"/>
+    <w:lsdException w:name="HTML Code" w:semiHidden="1" w:unhideWhenUsed="1"/>
+    <w:lsdException w:name="HTML Definition" w:semiHidden="1" w:unhideWhenUsed="1"/>
+    <w:lsdException w:name="HTML Keyboard" w:semiHidden="1" w:unhideWhenUsed="1"/>
+    <w:lsdException w:name="HTML Preformatted" w:semiHidden="1" w:unhideWhenUsed="1"/>
+    <w:lsdException w:name="HTML Sample" w:semiHidden="1" w:unhideWhenUsed="1"/>
+    <w:lsdException w:name="HTML Typewriter" w:semiHidden="1" w:unhideWhenUsed="1"/>
+    <w:lsdException w:name="HTML Variable" w:semiHidden="1" w:unhideWhenUsed="1"/>
+    <w:lsdException w:name="Normal Table" w:semiHidden="1" w:unhideWhenUsed="1"/>
+    <w:lsdException w:name="annotation subject" w:semiHidden="1" w:unhideWhenUsed="1"/>
+    <w:lsdException w:name="No List" w:semiHidden="1" w:unhideWhenUsed="1"/>
+    <w:lsdException w:name="Outline List 1" w:semiHidden="1" w:unhideWhenUsed="1"/>
+    <w:lsdException w:name="Outline List 2" w:semiHidden="1" w:unhideWhenUsed="1"/>
+    <w:lsdException w:name="Outline List 3" w:semiHidden="1" w:unhideWhenUsed="1"/>
+    <w:lsdException w:name="Table Simple 1" w:semiHidden="1" w:unhideWhenUsed="1"/>
+    <w:lsdException w:name="Table Simple 2" w:semiHidden="1" w:unhideWhenUsed="1"/>
+    <w:lsdException w:name="Table Simple 3" w:semiHidden="1" w:unhideWhenUsed="1"/>
+    <w:lsdException w:name="Table Classic 1" w:semiHidden="1" w:unhideWhenUsed="1"/>
+    <w:lsdException w:name="Table Classic 2" w:semiHidden="1" w:unhideWhenUsed="1"/>
+    <w:lsdException w:name="Table Classic 3" w:semiHidden="1" w:unhideWhenUsed="1"/>
+    <w:lsdException w:name="Table Classic 4" w:semiHidden="1" w:unhideWhenUsed="1"/>
+    <w:lsdException w:name="Table Colorful 1" w:semiHidden="1" w:unhideWhenUsed="1"/>
+    <w:lsdException w:name="Table Colorful 2" w:semiHidden="1" w:unhideWhenUsed="1"/>
+    <w:lsdException w:name="Table Colorful 3" w:semiHidden="1" w:unhideWhenUsed="1"/>
+    <w:lsdException w:name="Table Columns 1" w:semiHidden="1" w:unhideWhenUsed="1"/>
+    <w:lsdException w:name="Table Columns 2" w:semiHidden="1" w:unhideWhenUsed="1"/>
+    <w:lsdException w:name="Table Columns 3" w:semiHidden="1" w:unhideWhenUsed="1"/>
+    <w:lsdException w:name="Table Columns 4" w:semiHidden="1" w:unhideWhenUsed="1"/>
+    <w:lsdException w:name="Table Columns 5" w:semiHidden="1" w:unhideWhenUsed="1"/>
+    <w:lsdException w:name="Table Grid 1" w:semiHidden="1" w:unhideWhenUsed="1"/>
+    <w:lsdException w:name="Table Grid 2" w:semiHidden="1" w:unhideWhenUsed="1"/>
+    <w:lsdException w:name="Table Grid 3" w:semiHidden="1" w:unhideWhenUsed="1"/>
+    <w:lsdException w:name="Table Grid 4" w:semiHidden="1" w:unhideWhenUsed="1"/>
+    <w:lsdException w:name="Table Grid 5" w:semiHidden="1" w:unhideWhenUsed="1"/>
+    <w:lsdException w:name="Table Grid 6" w:semiHidden="1" w:unhideWhenUsed="1"/>
+    <w:lsdException w:name="Table Grid 7" w:semiHidden="1" w:unhideWhenUsed="1"/>
+    <w:lsdException w:name="Table Grid 8" w:semiHidden="1" w:unhideWhenUsed="1"/>
+    <w:lsdException w:name="Table List 1" w:semiHidden="1" w:unhideWhenUsed="1"/>
+    <w:lsdException w:name="Table List 2" w:semiHidden="1" w:unhideWhenUsed="1"/>
+    <w:lsdException w:name="Table List 3" w:semiHidden="1" w:unhideWhenUsed="1"/>
+    <w:lsdException w:name="Table List 4" w:semiHidden="1" w:unhideWhenUsed="1"/>
+    <w:lsdException w:name="Table List 5" w:semiHidden="1" w:unhideWhenUsed="1"/>
+    <w:lsdException w:name="Table List 6" w:semiHidden="1" w:unhideWhenUsed="1"/>
+    <w:lsdException w:name="Table List 7" w:semiHidden="1" w:unhideWhenUsed="1"/>
+    <w:lsdException w:name="Table List 8" w:semiHidden="1" w:unhideWhenUsed="1"/>
+    <w:lsdException w:name="Table 3D effects 1" w:semiHidden="1" w:unhideWhenUsed="1"/>
+    <w:lsdException w:name="Table 3D effects 2" w:semiHidden="1" w:unhideWhenUsed="1"/>
+    <w:lsdException w:name="Table 3D effects 3" w:semiHidden="1" w:unhideWhenUsed="1"/>
+    <w:lsdException w:name="Table Contemporary" w:semiHidden="1" w:unhideWhenUsed="1"/>
+    <w:lsdException w:name="Table Elegant" w:semiHidden="1" w:unhideWhenUsed="1"/>
+    <w:lsdException w:name="Table Professional" w:semiHidden="1" w:unhideWhenUsed="1"/>
+    <w:lsdException w:name="Table Subtle 1" w:semiHidden="1" w:unhideWhenUsed="1"/>
+    <w:lsdException w:name="Table Subtle 2" w:semiHidden="1" w:unhideWhenUsed="1"/>
+    <w:lsdException w:name="Table Web 1" w:semiHidden="1" w:unhideWhenUsed="1"/>
+    <w:lsdException w:name="Table Web 2" w:semiHidden="1" w:unhideWhenUsed="1"/>
+    <w:lsdException w:name="Table Web 3" w:semiHidden="1" w:unhideWhenUsed="1"/>
+    <w:lsdException w:name="Balloon Text" w:semiHidden="1" w:unhideWhenUsed="1"/>
+    <w:lsdException w:name="Table Grid" w:uiPriority="59"/>
+    <w:lsdException w:name="Table Theme" w:semiHidden="1" w:unhideWhenUsed="1"/>
+    <w:lsdException w:name="Placeholder Text" w:semiHidden="1"/>
+    <w:lsdException w:name="No Spacing" w:uiPriority="1" w:qFormat="1"/>
+    <w:lsdException w:name="Light Shading" w:uiPriority="60"/>
+    <w:lsdException w:name="Light List" w:uiPriority="61"/>
+    <w:lsdException w:name="Light Grid" w:uiPriority="62"/>
+    <w:lsdException w:name="Medium Shading 1" w:uiPriority="63"/>
+    <w:lsdException w:name="Medium Shading 2" w:uiPriority="64"/>
+    <w:lsdException w:name="Medium List 1" w:uiPriority="65"/>
+    <w:lsdException w:name="Medium List 2" w:uiPriority="66"/>
+    <w:lsdException w:name="Medium Grid 1" w:uiPriority="67"/>
+    <w:lsdException w:name="Medium Grid 2" w:uiPriority="68"/>
+    <w:lsdException w:name="Medium Grid 3" w:uiPriority="69"/>
+    <w:lsdException w:name="Dark List" w:uiPriority="70"/>
+    <w:lsdException w:name="Colorful Shading" w:uiPriority="71"/>
+    <w:lsdException w:name="Colorful List" w:uiPriority="72"/>
+    <w:lsdException w:name="Colorful Grid" w:uiPriority="73"/>
+    <w:lsdException w:name="Light Shading Accent 1" w:uiPriority="60"/>
+    <w:lsdException w:name="Light List Accent 1" w:uiPriority="61"/>
+    <w:lsdException w:name="Light Grid Accent 1" w:uiPriority="62"/>
+    <w:lsdException w:name="Medium Shading 1 Accent 1" w:uiPriority="63"/>
+    <w:lsdException w:name="Medium Shading 2 Accent 1" w:uiPriority="64"/>
+    <w:lsdException w:name="Medium List 1 Accent 1" w:uiPriority="65"/>
+    <w:lsdException w:name="Revision" w:semiHidden="1"/>
+    <w:lsdException w:name="List Paragraph" w:uiPriority="34" w:qFormat="1"/>
+    <w:lsdException w:name="Quote" w:uiPriority="29" w:qFormat="1"/>
+    <w:lsdException w:name="Intense Quote" w:uiPriority="30" w:qFormat="1"/>
+    <w:lsdException w:name="Medium List 2 Accent 1" w:uiPriority="66"/>
+    <w:lsdException w:name="Medium Grid 1 Accent 1" w:uiPriority="67"/>
+    <w:lsdException w:name="Medium Grid 2 Accent 1" w:uiPriority="68"/>
+    <w:lsdException w:name="Medium Grid 3 Accent 1" w:uiPriority="69"/>
+    <w:lsdException w:name="Dark List Accent 1" w:uiPriority="70"/>
+    <w:lsdException w:name="Colorful Shading Accent 1" w:uiPriority="71"/>
+    <w:lsdException w:name="Colorful List Accent 1" w:uiPriority="72"/>
+    <w:lsdException w:name="Colorful Grid Accent 1" w:uiPriority="73"/>
+    <w:lsdException w:name="Light Shading Accent 2" w:uiPriority="60"/>
+    <w:lsdException w:name="Light List Accent 2" w:uiPriority="61"/>
+    <w:lsdException w:name="Light Grid Accent 2" w:uiPriority="62"/>
+    <w:lsdException w:name="Medium Shading 1 Accent 2" w:uiPriority="63"/>
+    <w:lsdException w:name="Medium Shading 2 Accent 2" w:uiPriority="64"/>
+    <w:lsdException w:name="Medium List 1 Accent 2" w:uiPriority="65"/>
+    <w:lsdException w:name="Medium List 2 Accent 2" w:uiPriority="66"/>
+    <w:lsdException w:name="Medium Grid 1 Accent 2" w:uiPriority="67"/>
+    <w:lsdException w:name="Medium Grid 2 Accent 2" w:uiPriority="68"/>
+    <w:lsdException w:name="Medium Grid 3 Accent 2" w:uiPriority="69"/>
+    <w:lsdException w:name="Dark List Accent 2" w:uiPriority="70"/>
+    <w:lsdException w:name="Colorful Shading Accent 2" w:uiPriority="71"/>
+    <w:lsdException w:name="Colorful List Accent 2" w:uiPriority="72"/>
+    <w:lsdException w:name="Colorful Grid Accent 2" w:uiPriority="73"/>
+    <w:lsdException w:name="Light Shading Accent 3" w:uiPriority="60"/>
+    <w:lsdException w:name="Light List Accent 3" w:uiPriority="61"/>
+    <w:lsdException w:name="Light Grid Accent 3" w:uiPriority="62"/>
+    <w:lsdException w:name="Medium Shading 1 Accent 3" w:uiPriority="63"/>
+    <w:lsdException w:name="Medium Shading 2 Accent 3" w:uiPriority="64"/>
+    <w:lsdException w:name="Medium List 1 Accent 3" w:uiPriority="65"/>
+    <w:lsdException w:name="Medium List 2 Accent 3" w:uiPriority="66"/>
+    <w:lsdException w:name="Medium Grid 1 Accent 3" w:uiPriority="67"/>
+    <w:lsdException w:name="Medium Grid 2 Accent 3" w:uiPriority="68"/>
+    <w:lsdException w:name="Medium Grid 3 Accent 3" w:uiPriority="69"/>
+    <w:lsdException w:name="Dark List Accent 3" w:uiPriority="70"/>
+    <w:lsdException w:name="Colorful Shading Accent 3" w:uiPriority="71"/>
+    <w:lsdException w:name="Colorful List Accent 3" w:uiPriority="72"/>
+    <w:lsdException w:name="Colorful Grid Accent 3" w:uiPriority="73"/>
+    <w:lsdException w:name="Light Shading Accent 4" w:uiPriority="60"/>
+    <w:lsdException w:name="Light List Accent 4" w:uiPriority="61"/>
+    <w:lsdException w:name="Light Grid Accent 4" w:uiPriority="62"/>
+    <w:lsdException w:name="Medium Shading 1 Accent 4" w:uiPriority="63"/>
+    <w:lsdException w:name="Medium Shading 2 Accent 4" w:uiPriority="64"/>
+    <w:lsdException w:name="Medium List 1 Accent 4" w:uiPriority="65"/>
+    <w:lsdException w:name="Medium List 2 Accent 4" w:uiPriority="66"/>
+    <w:lsdException w:name="Medium Grid 1 Accent 4" w:uiPriority="67"/>
+    <w:lsdException w:name="Medium Grid 2 Accent 4" w:uiPriority="68"/>
+    <w:lsdException w:name="Medium Grid 3 Accent 4" w:uiPriority="69"/>
+    <w:lsdException w:name="Dark List Accent 4" w:uiPriority="70"/>
+    <w:lsdException w:name="Colorful Shading Accent 4" w:uiPriority="71"/>
+    <w:lsdException w:name="Colorful List Accent 4" w:uiPriority="72"/>
+    <w:lsdException w:name="Colorful Grid Accent 4" w:uiPriority="73"/>
+    <w:lsdException w:name="Light Shading Accent 5" w:uiPriority="60"/>
+    <w:lsdException w:name="Light List Accent 5" w:uiPriority="61"/>
+    <w:lsdException w:name="Light Grid Accent 5" w:uiPriority="62"/>
+    <w:lsdException w:name="Medium Shading 1 Accent 5" w:uiPriority="63"/>
+    <w:lsdException w:name="Medium Shading 2 Accent 5" w:uiPriority="64"/>
+    <w:lsdException w:name="Medium List 1 Accent 5" w:uiPriority="65"/>
+    <w:lsdException w:name="Medium List 2 Accent 5" w:uiPriority="66"/>
+    <w:lsdException w:name="Medium Grid 1 Accent 5" w:uiPriority="67"/>
+    <w:lsdException w:name="Medium Grid 2 Accent 5" w:uiPriority="68"/>
+    <w:lsdException w:name="Medium Grid 3 Accent 5" w:uiPriority="69"/>
+    <w:lsdException w:name="Dark List Accent 5" w:uiPriority="70"/>
+    <w:lsdException w:name="Colorful Shading Accent 5" w:uiPriority="71"/>
+    <w:lsdException w:name="Colorful List Accent 5" w:uiPriority="72"/>
+    <w:lsdException w:name="Colorful Grid Accent 5" w:uiPriority="73"/>
+    <w:lsdException w:name="Light Shading Accent 6" w:uiPriority="60"/>
+    <w:lsdException w:name="Light List Accent 6" w:uiPriority="61"/>
+    <w:lsdException w:name="Light Grid Accent 6" w:uiPriority="62"/>
+    <w:lsdException w:name="Medium Shading 1 Accent 6" w:uiPriority="63"/>
+    <w:lsdException w:name="Medium Shading 2 Accent 6" w:uiPriority="64"/>
+    <w:lsdException w:name="Medium List 1 Accent 6" w:uiPriority="65"/>
+    <w:lsdException w:name="Medium List 2 Accent 6" w:uiPriority="66"/>
+    <w:lsdException w:name="Medium Grid 1 Accent 6" w:uiPriority="67"/>
+    <w:lsdException w:name="Medium Grid 2 Accent 6" w:uiPriority="68"/>
+    <w:lsdException w:name="Medium Grid 3 Accent 6" w:uiPriority="69"/>
+    <w:lsdException w:name="Dark List Accent 6" w:uiPriority="70"/>
+    <w:lsdException w:name="Colorful Shading Accent 6" w:uiPriority="71"/>
+    <w:lsdException w:name="Colorful List Accent 6" w:uiPriority="72"/>
+    <w:lsdException w:name="Colorful Grid Accent 6" w:uiPriority="73"/>
+    <w:lsdException w:name="Subtle Emphasis" w:uiPriority="19" w:qFormat="1"/>
+    <w:lsdException w:name="Intense Emphasis" w:uiPriority="21" w:qFormat="1"/>
+    <w:lsdException w:name="Subtle Reference" w:uiPriority="31" w:qFormat="1"/>
+    <w:lsdException w:name="Intense Reference" w:uiPriority="32" w:qFormat="1"/>
+    <w:lsdException w:name="Book Title" w:uiPriority="33" w:qFormat="1"/>
+    <w:lsdException w:name="Bibliography" w:semiHidden="1" w:uiPriority="37" w:unhideWhenUsed="1"/>
+    <w:lsdException w:name="TOC Heading" w:semiHidden="1" w:uiPriority="39" w:unhideWhenUsed="1" w:qFormat="1"/>
+    <w:lsdException w:name="Plain Table 1" w:uiPriority="41"/>
+    <w:lsdException w:name="Plain Table 2" w:uiPriority="42"/>
+    <w:lsdException w:name="Plain Table 3" w:uiPriority="43"/>
+    <w:lsdException w:name="Plain Table 4" w:uiPriority="44"/>
+    <w:lsdException w:name="Plain Table 5" w:uiPriority="45"/>
+    <w:lsdException w:name="Grid Table Light" w:uiPriority="40"/>
+    <w:lsdException w:name="Grid Table 1 Light" w:uiPriority="46"/>
+    <w:lsdException w:name="Grid Table 2" w:uiPriority="47"/>
+    <w:lsdException w:name="Grid Table 3" w:uiPriority="48"/>
+    <w:lsdException w:name="Grid Table 4" w:uiPriority="49"/>
+    <w:lsdException w:name="Grid Table 5 Dark" w:uiPriority="50"/>
+    <w:lsdException w:name="Grid Table 6 Colorful" w:uiPriority="51"/>
+    <w:lsdException w:name="Grid Table 7 Colorful" w:uiPriority="52"/>
+    <w:lsdException w:name="Grid Table 1 Light Accent 1" w:uiPriority="46"/>
+    <w:lsdException w:name="Grid Table 2 Accent 1" w:uiPriority="47"/>
+    <w:lsdException w:name="Grid Table 3 Accent 1" w:uiPriority="48"/>
+    <w:lsdException w:name="Grid Table 4 Accent 1" w:uiPriority="49"/>
+    <w:lsdException w:name="Grid Table 5 Dark Accent 1" w:uiPriority="50"/>
+    <w:lsdException w:name="Grid Table 6 Colorful Accent 1" w:uiPriority="51"/>
+    <w:lsdException w:name="Grid Table 7 Colorful Accent 1" w:uiPriority="52"/>
+    <w:lsdException w:name="Grid Table 1 Light Accent 2" w:uiPriority="46"/>
+    <w:lsdException w:name="Grid Table 2 Accent 2" w:uiPriority="47"/>
+    <w:lsdException w:name="Grid Table 3 Accent 2" w:uiPriority="48"/>
+    <w:lsdException w:name="Grid Table 4 Accent 2" w:uiPriority="49"/>
+    <w:lsdException w:name="Grid Table 5 Dark Accent 2" w:uiPriority="50"/>
+    <w:lsdException w:name="Grid Table 6 Colorful Accent 2" w:uiPriority="51"/>
+    <w:lsdException w:name="Grid Table 7 Colorful Accent 2" w:uiPriority="52"/>
+    <w:lsdException w:name="Grid Table 1 Light Accent 3" w:uiPriority="46"/>
+    <w:lsdException w:name="Grid Table 2 Accent 3" w:uiPriority="47"/>
+    <w:lsdException w:name="Grid Table 3 Accent 3" w:uiPriority="48"/>
+    <w:lsdException w:name="Grid Table 4 Accent 3" w:uiPriority="49"/>
+    <w:lsdException w:name="Grid Table 5 Dark Accent 3" w:uiPriority="50"/>
+    <w:lsdException w:name="Grid Table 6 Colorful Accent 3" w:uiPriority="51"/>
+    <w:lsdException w:name="Grid Table 7 Colorful Accent 3" w:uiPriority="52"/>
+    <w:lsdException w:name="Grid Table 1 Light Accent 4" w:uiPriority="46"/>
+    <w:lsdException w:name="Grid Table 2 Accent 4" w:uiPriority="47"/>
+    <w:lsdException w:name="Grid Table 3 Accent 4" w:uiPriority="48"/>
+    <w:lsdException w:name="Grid Table 4 Accent 4" w:uiPriority="49"/>
+    <w:lsdException w:name="Grid Table 5 Dark Accent 4" w:uiPriority="50"/>
+    <w:lsdException w:name="Grid Table 6 Colorful Accent 4" w:uiPriority="51"/>
+    <w:lsdException w:name="Grid Table 7 Colorful Accent 4" w:uiPriority="52"/>
+    <w:lsdException w:name="Grid Table 1 Light Accent 5" w:uiPriority="46"/>
+    <w:lsdException w:name="Grid Table 2 Accent 5" w:uiPriority="47"/>
+    <w:lsdException w:name="Grid Table 3 Accent 5" w:uiPriority="48"/>
+    <w:lsdException w:name="Grid Table 4 Accent 5" w:uiPriority="49"/>
+    <w:lsdException w:name="Grid Table 5 Dark Accent 5" w:uiPriority="50"/>
+    <w:lsdException w:name="Grid Table 6 Colorful Accent 5" w:uiPriority="51"/>
+    <w:lsdException w:name="Grid Table 7 Colorful Accent 5" w:uiPriority="52"/>
+    <w:lsdException w:name="Grid Table 1 Light Accent 6" w:uiPriority="46"/>
+    <w:lsdException w:name="Grid Table 2 Accent 6" w:uiPriority="47"/>
+    <w:lsdException w:name="Grid Table 3 Accent 6" w:uiPriority="48"/>
+    <w:lsdException w:name="Grid Table 4 Accent 6" w:uiPriority="49"/>
+    <w:lsdException w:name="Grid Table 5 Dark Accent 6" w:uiPriority="50"/>
+    <w:lsdException w:name="Grid Table 6 Colorful Accent 6" w:uiPriority="51"/>
+    <w:lsdException w:name="Grid Table 7 Colorful Accent 6" w:uiPriority="52"/>
+    <w:lsdException w:name="List Table 1 Light" w:uiPriority="46"/>
+    <w:lsdException w:name="List Table 2" w:uiPriority="47"/>
+    <w:lsdException w:name="List Table 3" w:uiPriority="48"/>
+    <w:lsdException w:name="List Table 4" w:uiPriority="49"/>
+    <w:lsdException w:name="List Table 5 Dark" w:uiPriority="50"/>
+    <w:lsdException w:name="List Table 6 Colorful" w:uiPriority="51"/>
+    <w:lsdException w:name="List Table 7 Colorful" w:uiPriority="52"/>
+    <w:lsdException w:name="List Table 1 Light Accent 1" w:uiPriority="46"/>
+    <w:lsdException w:name="List Table 2 Accent 1" w:uiPriority="47"/>
+    <w:lsdException w:name="List Table 3 Accent 1" w:uiPriority="48"/>
+    <w:lsdException w:name="List Table 4 Accent 1" w:uiPriority="49"/>
+    <w:lsdException w:name="List Table 5 Dark Accent 1" w:uiPriority="50"/>
+    <w:lsdException w:name="List Table 6 Colorful Accent 1" w:uiPriority="51"/>
+    <w:lsdException w:name="List Table 7 Colorful Accent 1" w:uiPriority="52"/>
+    <w:lsdException w:name="List Table 1 Light Accent 2" w:uiPriority="46"/>
+    <w:lsdException w:name="List Table 2 Accent 2" w:uiPriority="47"/>
+    <w:lsdException w:name="List Table 3 Accent 2" w:uiPriority="48"/>
+    <w:lsdException w:name="List Table 4 Accent 2" w:uiPriority="49"/>
+    <w:lsdException w:name="List Table 5 Dark Accent 2" w:uiPriority="50"/>
+    <w:lsdException w:name="List Table 6 Colorful Accent 2" w:uiPriority="51"/>
+    <w:lsdException w:name="List Table 7 Colorful Accent 2" w:uiPriority="52"/>
+    <w:lsdException w:name="List Table 1 Light Accent 3" w:uiPriority="46"/>
+    <w:lsdException w:name="List Table 2 Accent 3" w:uiPriority="47"/>
+    <w:lsdException w:name="List Table 3 Accent 3" w:uiPriority="48"/>
+    <w:lsdException w:name="List Table 4 Accent 3" w:uiPriority="49"/>
+    <w:lsdException w:name="List Table 5 Dark Accent 3" w:uiPriority="50"/>
+    <w:lsdException w:name="List Table 6 Colorful Accent 3" w:uiPriority="51"/>
+    <w:lsdException w:name="List Table 7 Colorful Accent 3" w:uiPriority="52"/>
+    <w:lsdException w:name="List Table 1 Light Accent 4" w:uiPriority="46"/>
+    <w:lsdException w:name="List Table 2 Accent 4" w:uiPriority="47"/>
+    <w:lsdException w:name="List Table 3 Accent 4" w:uiPriority="48"/>
+    <w:lsdException w:name="List Table 4 Accent 4" w:uiPriority="49"/>
+    <w:lsdException w:name="List Table 5 Dark Accent 4" w:uiPriority="50"/>
+    <w:lsdException w:name="List Table 6 Colorful Accent 4" w:uiPriority="51"/>
+    <w:lsdException w:name="List Table 7 Colorful Accent 4" w:uiPriority="52"/>
+    <w:lsdException w:name="List Table 1 Light Accent 5" w:uiPriority="46"/>
+    <w:lsdException w:name="List Table 2 Accent 5" w:uiPriority="47"/>
+    <w:lsdException w:name="List Table 3 Accent 5" w:uiPriority="48"/>
+    <w:lsdException w:name="List Table 4 Accent 5" w:uiPriority="49"/>
+    <w:lsdException w:name="List Table 5 Dark Accent 5" w:uiPriority="50"/>
+    <w:lsdException w:name="List Table 6 Colorful Accent 5" w:uiPriority="51"/>
+    <w:lsdException w:name="List Table 7 Colorful Accent 5" w:uiPriority="52"/>
+    <w:lsdException w:name="List Table 1 Light Accent 6" w:uiPriority="46"/>
+    <w:lsdException w:name="List Table 2 Accent 6" w:uiPriority="47"/>
+    <w:lsdException w:name="List Table 3 Accent 6" w:uiPriority="48"/>
+    <w:lsdException w:name="List Table 4 Accent 6" w:uiPriority="49"/>
+    <w:lsdException w:name="List Table 5 Dark Accent 6" w:uiPriority="50"/>
+    <w:lsdException w:name="List Table 6 Colorful Accent 6" w:uiPriority="51"/>
+    <w:lsdException w:name="List Table 7 Colorful Accent 6" w:uiPriority="52"/>
+    <w:lsdException w:name="Mention" w:semiHidden="1" w:unhideWhenUsed="1"/>
+    <w:lsdException w:name="Smart Hyperlink" w:semiHidden="1" w:unhideWhenUsed="1"/>
+    <w:lsdException w:name="Hashtag" w:semiHidden="1" w:unhideWhenUsed="1"/>
+    <w:lsdException w:name="Unresolved Mention" w:semiHidden="1" w:unhideWhenUsed="1"/>
+    <w:lsdException w:name="Smart Link" w:semiHidden="1" w:unhideWhenUsed="1"/>
   </w:latentStyles>
   <w:style w:type="paragraph" w:default="1" w:styleId="Normal">
     <w:name w:val="Normal"/>
     <w:qFormat/>
     <w:rsid w:val="00EF279D"/>
   </w:style>
-  <w:style w:type="paragraph" w:styleId="Titre1">
+  <w:style w:type="paragraph" w:styleId="Heading1">
     <w:name w:val="heading 1"/>
     <w:basedOn w:val="Normal"/>
     <w:next w:val="Normal"/>
-    <w:link w:val="Titre1Car"/>
+    <w:link w:val="Heading1Char"/>
     <w:uiPriority w:val="9"/>
     <w:qFormat/>
     <w:rsid w:val="00EF279D"/>
@@ -8767,11 +8755,11 @@
       <w:szCs w:val="28"/>
     </w:rPr>
   </w:style>
-  <w:style w:type="paragraph" w:styleId="Titre2">
+  <w:style w:type="paragraph" w:styleId="Heading2">
     <w:name w:val="heading 2"/>
     <w:basedOn w:val="Normal"/>
     <w:next w:val="Normal"/>
-    <w:link w:val="Titre2Car"/>
+    <w:link w:val="Heading2Char"/>
     <w:uiPriority w:val="9"/>
     <w:unhideWhenUsed/>
     <w:qFormat/>
@@ -8791,11 +8779,11 @@
       <w:szCs w:val="26"/>
     </w:rPr>
   </w:style>
-  <w:style w:type="paragraph" w:styleId="Titre3">
+  <w:style w:type="paragraph" w:styleId="Heading3">
     <w:name w:val="heading 3"/>
     <w:basedOn w:val="Normal"/>
     <w:next w:val="Normal"/>
-    <w:link w:val="Titre3Car"/>
+    <w:link w:val="Heading3Char"/>
     <w:uiPriority w:val="9"/>
     <w:unhideWhenUsed/>
     <w:qFormat/>
@@ -8813,18 +8801,16 @@
       <w:color w:val="4F81BD" w:themeColor="accent1"/>
     </w:rPr>
   </w:style>
-  <w:style w:type="character" w:default="1" w:styleId="Policepardfaut">
+  <w:style w:type="character" w:default="1" w:styleId="DefaultParagraphFont">
     <w:name w:val="Default Paragraph Font"/>
     <w:uiPriority w:val="1"/>
-    <w:semiHidden/>
     <w:unhideWhenUsed/>
   </w:style>
-  <w:style w:type="table" w:default="1" w:styleId="TableauNormal">
+  <w:style w:type="table" w:default="1" w:styleId="TableNormal">
     <w:name w:val="Normal Table"/>
     <w:uiPriority w:val="99"/>
     <w:semiHidden/>
     <w:unhideWhenUsed/>
-    <w:qFormat/>
     <w:tblPr>
       <w:tblInd w:w="0" w:type="dxa"/>
       <w:tblCellMar>
@@ -8835,16 +8821,16 @@
       </w:tblCellMar>
     </w:tblPr>
   </w:style>
-  <w:style w:type="numbering" w:default="1" w:styleId="Aucuneliste">
+  <w:style w:type="numbering" w:default="1" w:styleId="NoList">
     <w:name w:val="No List"/>
     <w:uiPriority w:val="99"/>
     <w:semiHidden/>
     <w:unhideWhenUsed/>
   </w:style>
-  <w:style w:type="character" w:customStyle="1" w:styleId="Titre1Car">
-    <w:name w:val="Titre 1 Car"/>
-    <w:basedOn w:val="Policepardfaut"/>
-    <w:link w:val="Titre1"/>
+  <w:style w:type="character" w:customStyle="1" w:styleId="Heading1Char">
+    <w:name w:val="Heading 1 Char"/>
+    <w:basedOn w:val="DefaultParagraphFont"/>
+    <w:link w:val="Heading1"/>
     <w:uiPriority w:val="9"/>
     <w:rsid w:val="00EF279D"/>
     <w:rPr>
@@ -8856,10 +8842,10 @@
       <w:szCs w:val="28"/>
     </w:rPr>
   </w:style>
-  <w:style w:type="character" w:customStyle="1" w:styleId="Titre2Car">
-    <w:name w:val="Titre 2 Car"/>
-    <w:basedOn w:val="Policepardfaut"/>
-    <w:link w:val="Titre2"/>
+  <w:style w:type="character" w:customStyle="1" w:styleId="Heading2Char">
+    <w:name w:val="Heading 2 Char"/>
+    <w:basedOn w:val="DefaultParagraphFont"/>
+    <w:link w:val="Heading2"/>
     <w:uiPriority w:val="9"/>
     <w:rsid w:val="00EF279D"/>
     <w:rPr>
@@ -8871,11 +8857,11 @@
       <w:szCs w:val="26"/>
     </w:rPr>
   </w:style>
-  <w:style w:type="paragraph" w:styleId="Titre">
+  <w:style w:type="paragraph" w:styleId="Title">
     <w:name w:val="Title"/>
     <w:basedOn w:val="Normal"/>
     <w:next w:val="Normal"/>
-    <w:link w:val="TitreCar"/>
+    <w:link w:val="TitleChar"/>
     <w:uiPriority w:val="10"/>
     <w:qFormat/>
     <w:rsid w:val="00EF279D"/>
@@ -8895,10 +8881,10 @@
       <w:szCs w:val="52"/>
     </w:rPr>
   </w:style>
-  <w:style w:type="character" w:customStyle="1" w:styleId="TitreCar">
-    <w:name w:val="Titre Car"/>
-    <w:basedOn w:val="Policepardfaut"/>
-    <w:link w:val="Titre"/>
+  <w:style w:type="character" w:customStyle="1" w:styleId="TitleChar">
+    <w:name w:val="Title Char"/>
+    <w:basedOn w:val="DefaultParagraphFont"/>
+    <w:link w:val="Title"/>
     <w:uiPriority w:val="10"/>
     <w:rsid w:val="00EF279D"/>
     <w:rPr>
@@ -8910,7 +8896,7 @@
       <w:szCs w:val="52"/>
     </w:rPr>
   </w:style>
-  <w:style w:type="paragraph" w:styleId="Paragraphedeliste">
+  <w:style w:type="paragraph" w:styleId="ListParagraph">
     <w:name w:val="List Paragraph"/>
     <w:basedOn w:val="Normal"/>
     <w:uiPriority w:val="34"/>
@@ -8938,9 +8924,9 @@
       <w:lang w:eastAsia="fr-FR"/>
     </w:rPr>
   </w:style>
-  <w:style w:type="character" w:styleId="Lienhypertexte">
+  <w:style w:type="character" w:styleId="Hyperlink">
     <w:name w:val="Hyperlink"/>
-    <w:basedOn w:val="Policepardfaut"/>
+    <w:basedOn w:val="DefaultParagraphFont"/>
     <w:uiPriority w:val="99"/>
     <w:semiHidden/>
     <w:unhideWhenUsed/>
@@ -8952,18 +8938,18 @@
   </w:style>
   <w:style w:type="character" w:customStyle="1" w:styleId="lang-la">
     <w:name w:val="lang-la"/>
-    <w:basedOn w:val="Policepardfaut"/>
+    <w:basedOn w:val="DefaultParagraphFont"/>
     <w:rsid w:val="00C555F6"/>
   </w:style>
   <w:style w:type="character" w:customStyle="1" w:styleId="cite-bracket">
     <w:name w:val="cite-bracket"/>
-    <w:basedOn w:val="Policepardfaut"/>
+    <w:basedOn w:val="DefaultParagraphFont"/>
     <w:rsid w:val="00F17E16"/>
   </w:style>
-  <w:style w:type="character" w:customStyle="1" w:styleId="Titre3Car">
-    <w:name w:val="Titre 3 Car"/>
-    <w:basedOn w:val="Policepardfaut"/>
-    <w:link w:val="Titre3"/>
+  <w:style w:type="character" w:customStyle="1" w:styleId="Heading3Char">
+    <w:name w:val="Heading 3 Char"/>
+    <w:basedOn w:val="DefaultParagraphFont"/>
+    <w:link w:val="Heading3"/>
     <w:uiPriority w:val="9"/>
     <w:rsid w:val="001463EE"/>
     <w:rPr>
@@ -8973,9 +8959,9 @@
       <w:color w:val="4F81BD" w:themeColor="accent1"/>
     </w:rPr>
   </w:style>
-  <w:style w:type="character" w:styleId="lev">
+  <w:style w:type="character" w:styleId="Strong">
     <w:name w:val="Strong"/>
-    <w:basedOn w:val="Policepardfaut"/>
+    <w:basedOn w:val="DefaultParagraphFont"/>
     <w:uiPriority w:val="22"/>
     <w:qFormat/>
     <w:rsid w:val="00FE6481"/>
@@ -8998,7 +8984,7 @@
       <w:lang w:eastAsia="fr-FR"/>
     </w:rPr>
   </w:style>
-  <w:style w:type="paragraph" w:styleId="Sansinterligne">
+  <w:style w:type="paragraph" w:styleId="NoSpacing">
     <w:name w:val="No Spacing"/>
     <w:uiPriority w:val="1"/>
     <w:qFormat/>

</xml_diff>

<commit_message>
Revise Chapter 20 reflex text
</commit_message>
<xml_diff>
--- a/public/chapter-20/Chapitre_20_Organes_genitaux_masculins_version_complete_zones_reflexes_revisees.docx
+++ b/public/chapter-20/Chapitre_20_Organes_genitaux_masculins_version_complete_zones_reflexes_revisees.docx
@@ -2521,7 +2521,7 @@
     </w:p>
     <w:p>
       <w:r>
-        <w:t>Les localisations décrites ci-dessous appartiennent à la cartographie clinique de la ROP. Elles ne constituent pas une projection anatomique directe des testicules, de la prostate, des vésicules séminales, des voies génitales ou de leurs nerfs sur le pied. Leur sélection dépend de l’anamnèse, des tests, des réactions palpatoires et du tableau fonctionnel.</w:t>
+        <w:t>Les localisations décrites ci-dessous appartiennent à la cartographie clinique de la ROP. Leur sélection dépend de l’anamnèse, des tests, des réactions palpatoires et du tableau fonctionnel.</w:t>
       </w:r>
     </w:p>
     <w:p>
@@ -2534,7 +2534,6 @@
         <w:pStyle w:val="Heading2"/>
       </w:pPr>
       <w:r>
-        <w:lastRenderedPageBreak/>
         <w:t>11.1. Testicules et voies spermatiques</w:t>
       </w:r>
     </w:p>
@@ -2548,7 +2547,7 @@
     </w:p>
     <w:p>
       <w:r>
-        <w:t>La fonction testiculaire s’inscrit dans une régulation neuroendocrine centrale, notamment par l’axe hypothalamo-hypophysaire-gonadique. Dans le protocole ROP, le Niveau 1 peut donc être envisagé lorsque le contexte général, endocrinien, de stress ou d’adaptation le justifie.</w:t>
+        <w:t xml:space="preserve">La fonction testiculaire s’inscrit dans une régulation neuroendocrine centrale, notamment par l’axe hypothalamo-hypophysaire-gonadique. </w:t>
       </w:r>
     </w:p>
     <w:p>
@@ -2568,6 +2567,7 @@
         <w:ind w:left="255" w:hanging="142"/>
       </w:pPr>
       <w:r>
+        <w:lastRenderedPageBreak/>
         <w:t>• Tronc cérébral et centres d’intégration.</w:t>
       </w:r>
     </w:p>
@@ -2615,17 +2615,6 @@
     </w:p>
     <w:p>
       <w:pPr>
-        <w:pStyle w:val="EncadreROP"/>
-        <w:shd w:val="clear" w:color="auto" w:fill="F3EEE4"/>
-        <w:spacing w:before="80" w:after="100"/>
-        <w:ind w:left="142" w:right="142"/>
-      </w:pPr>
-      <w:r>
-        <w:t>INTÉRÊT EN ROP — Le Niveau 1 replace la fonction gonadique dans sa régulation centrale et neuroendocrine. Il ne signifie pas qu’une zone podale modifie directement la sécrétion de testostérone, de LH ou de FSH.</w:t>
-      </w:r>
-    </w:p>
-    <w:p>
-      <w:pPr>
         <w:pStyle w:val="Heading3"/>
       </w:pPr>
       <w:r>
@@ -2785,7 +2774,6 @@
         <w:pStyle w:val="Heading3"/>
       </w:pPr>
       <w:r>
-        <w:lastRenderedPageBreak/>
         <w:t>11.1.4. Niveau 4 — Intégration viscéro-somatique et viscéro-émotionnelle</w:t>
       </w:r>
     </w:p>
@@ -2846,6 +2834,7 @@
         <w:ind w:left="255" w:hanging="142"/>
       </w:pPr>
       <w:r>
+        <w:lastRenderedPageBreak/>
         <w:t>• Bassin, sacrum et chaînes musculaires associées lorsque des douleurs projetées ou des tensions régionales sont présentes.</w:t>
       </w:r>
     </w:p>
@@ -2873,17 +2862,6 @@
     </w:p>
     <w:p>
       <w:pPr>
-        <w:pStyle w:val="EncadreROP"/>
-        <w:shd w:val="clear" w:color="auto" w:fill="F3EEE4"/>
-        <w:spacing w:before="80" w:after="100"/>
-        <w:ind w:left="142" w:right="142"/>
-      </w:pPr>
-      <w:r>
-        <w:t>INTÉRÊT EN ROP — Le Niveau 4 permet d’intégrer le contexte somatique et émotionnel sans attribuer automatiquement un symptôme génital à une origine psychologique.</w:t>
-      </w:r>
-    </w:p>
-    <w:p>
-      <w:pPr>
         <w:pStyle w:val="Heading2"/>
       </w:pPr>
       <w:r>
@@ -2900,7 +2878,7 @@
     </w:p>
     <w:p>
       <w:r>
-        <w:t>La prostate est sensible au contexte hormonal et s’inscrit dans la régulation générale de l’axe hypothalamo-hypophysaire-gonadique. Le Niveau 1 peut être retenu lorsque le tableau associe stress, troubles du sommeil, anxiété, symptômes sexuels ou dysrégulation générale.</w:t>
+        <w:t xml:space="preserve">La prostate est sensible au contexte hormonal et s’inscrit dans la régulation générale de l’axe hypothalamo-hypophysaire-gonadique. </w:t>
       </w:r>
     </w:p>
     <w:p>
@@ -2967,17 +2945,6 @@
     </w:p>
     <w:p>
       <w:pPr>
-        <w:pStyle w:val="EncadreROP"/>
-        <w:shd w:val="clear" w:color="auto" w:fill="F3EEE4"/>
-        <w:spacing w:before="80" w:after="100"/>
-        <w:ind w:left="142" w:right="142"/>
-      </w:pPr>
-      <w:r>
-        <w:t>INTÉRÊT EN ROP — Le Niveau 1 accompagne la régulation générale et le contexte neuroendocrinien ; il ne constitue pas une action directe sur le volume prostatique ou les concentrations hormonales.</w:t>
-      </w:r>
-    </w:p>
-    <w:p>
-      <w:pPr>
         <w:pStyle w:val="Heading3"/>
       </w:pPr>
       <w:r>
@@ -3026,7 +2993,6 @@
         <w:ind w:left="255" w:hanging="142"/>
       </w:pPr>
       <w:r>
-        <w:lastRenderedPageBreak/>
         <w:t>• Plexus hypogastrique inférieur, carrefour autonome majeur de la cavité pelvienne.</w:t>
       </w:r>
     </w:p>
@@ -3054,17 +3020,6 @@
     </w:p>
     <w:p>
       <w:pPr>
-        <w:pStyle w:val="EncadreROP"/>
-        <w:shd w:val="clear" w:color="auto" w:fill="F3EEE4"/>
-        <w:spacing w:before="80" w:after="100"/>
-        <w:ind w:left="142" w:right="142"/>
-      </w:pPr>
-      <w:r>
-        <w:t>INTÉRÊT EN ROP — Le Niveau 2 vise à accompagner l’organisation autonome régionale sans chercher à stimuler isolément le sympathique ou le parasympathique.</w:t>
-      </w:r>
-    </w:p>
-    <w:p>
-      <w:pPr>
         <w:pStyle w:val="Heading3"/>
       </w:pPr>
       <w:r>
@@ -3133,6 +3088,7 @@
         <w:ind w:left="255" w:hanging="142"/>
       </w:pPr>
       <w:r>
+        <w:lastRenderedPageBreak/>
         <w:t>• Rectum et rapports postérieurs lorsqu’ils participent au tableau loco-régional.</w:t>
       </w:r>
     </w:p>
@@ -3150,31 +3106,24 @@
     </w:p>
     <w:p>
       <w:pPr>
-        <w:pStyle w:val="EncadreROP"/>
-        <w:shd w:val="clear" w:color="auto" w:fill="F3EEE4"/>
-        <w:spacing w:before="80" w:after="100"/>
-        <w:ind w:left="142" w:right="142"/>
-      </w:pPr>
-      <w:r>
-        <w:t>INTÉRÊT EN ROP — Le Niveau 3 replace la prostate dans son environnement pelvien. Une zone réflexe sensible constitue un repère clinique et non la preuve d’une hypertrophie, d’une congestion ou d’une lésion prostatique.</w:t>
-      </w:r>
-    </w:p>
-    <w:p>
-      <w:pPr>
         <w:pStyle w:val="Heading3"/>
       </w:pPr>
       <w:r>
         <w:t>11.2.4. Niveau 4 — Intégration viscéro-somatique et viscéro-émotionnelle</w:t>
       </w:r>
     </w:p>
-    <w:p>
-      <w:r>
-        <w:t>Cette rubrique remplace l’ancienne « balance cerveau limbique-prostate ». Elle associe les convergences somatiques, le plancher pelvien et l’axe cerveau-sphère génitale masculine.</w:t>
-      </w:r>
-    </w:p>
-    <w:p>
-      <w:r>
-        <w:t>Versant viscéro-somatique :</w:t>
+    <w:p/>
+    <w:p>
+      <w:r>
+        <w:t xml:space="preserve">Versant </w:t>
+      </w:r>
+      <w:proofErr w:type="spellStart"/>
+      <w:r>
+        <w:t>viscéro</w:t>
+      </w:r>
+      <w:proofErr w:type="spellEnd"/>
+      <w:r>
+        <w:t>-somatique :</w:t>
       </w:r>
     </w:p>
     <w:p>
@@ -3227,14 +3176,40 @@
         <w:t>• Territoires lombo-sacrés et pelviens douloureux associés.</w:t>
       </w:r>
     </w:p>
-    <w:p>
-      <w:r>
-        <w:t>Versant viscéro-émotionnel — Axe cerveau-sphère génitale masculine :</w:t>
-      </w:r>
-    </w:p>
-    <w:p>
-      <w:r>
-        <w:t>Les symptômes urinaires ou sexuels peuvent être modulés par le stress, l’anticipation, l’anxiété, la douleur, le contexte relationnel et le vécu du vieillissement. Dans le modèle clinique ROP, l’écoute-induction peut conserver son principe — un repère prostatique et un repère central — mais elle est présentée comme une technique d’intégration fonctionnelle, et non comme une action directe sur un « cerveau limbique ».</w:t>
+    <w:p/>
+    <w:p>
+      <w:r>
+        <w:t xml:space="preserve">Versant </w:t>
+      </w:r>
+      <w:proofErr w:type="spellStart"/>
+      <w:r>
+        <w:t>viscéro</w:t>
+      </w:r>
+      <w:proofErr w:type="spellEnd"/>
+      <w:r>
+        <w:t>-émotionnel — Axe cerveau-sphère génitale masculine :</w:t>
+      </w:r>
+    </w:p>
+    <w:p>
+      <w:r>
+        <w:t xml:space="preserve">Les symptômes urinaires ou sexuels peuvent être modulés par le stress, l’anticipation, l’anxiété, la douleur, le contexte relationnel et le vécu du vieillissement. </w:t>
+      </w:r>
+    </w:p>
+    <w:p>
+      <w:r>
+        <w:t>Dans le modèle clinique ROP, l’écoute-induction</w:t>
+      </w:r>
+      <w:r>
+        <w:t xml:space="preserve"> : </w:t>
+      </w:r>
+      <w:r>
+        <w:t>un repère prostatique et un repère central</w:t>
+      </w:r>
+      <w:r>
+        <w:t>.</w:t>
+      </w:r>
+      <w:r>
+        <w:t xml:space="preserve"> </w:t>
       </w:r>
     </w:p>
     <w:p>
@@ -3251,18 +3226,6 @@
     </w:p>
     <w:p>
       <w:pPr>
-        <w:pStyle w:val="EncadreROP"/>
-        <w:shd w:val="clear" w:color="auto" w:fill="F3EEE4"/>
-        <w:spacing w:before="80" w:after="100"/>
-        <w:ind w:left="142" w:right="142"/>
-      </w:pPr>
-      <w:r>
-        <w:lastRenderedPageBreak/>
-        <w:t>INTÉRÊT EN ROP — Le Niveau 4 relie le symptôme prostatique ou sexuel aux convergences somatiques et au contexte de perception et d’adaptation, sans définir de profil psychologique propre à la prostate.</w:t>
-      </w:r>
-    </w:p>
-    <w:p>
-      <w:pPr>
         <w:pStyle w:val="Heading2"/>
       </w:pPr>
       <w:r>
@@ -3271,7 +3234,7 @@
     </w:p>
     <w:p>
       <w:r>
-        <w:t>Le foie et le rein gauche figuraient auparavant dans le « syndrome général d’adaptation ». Ils peuvent être conservés comme soutiens associés, mais ne doivent pas être considérés comme des étapes obligatoires du traitement des organes génitaux masculins.</w:t>
+        <w:t>Le foie et le rein gauche peuvent être conservés comme soutiens associés, mais ne doivent pas être considérés comme des étapes obligatoires du traitement des organes génitaux masculins.</w:t>
       </w:r>
     </w:p>
     <w:p>
@@ -8804,6 +8767,7 @@
   <w:style w:type="character" w:default="1" w:styleId="DefaultParagraphFont">
     <w:name w:val="Default Paragraph Font"/>
     <w:uiPriority w:val="1"/>
+    <w:semiHidden/>
     <w:unhideWhenUsed/>
   </w:style>
   <w:style w:type="table" w:default="1" w:styleId="TableNormal">

</xml_diff>